<commit_message>
added passing integration test for get all gameevents of game endpoint
</commit_message>
<xml_diff>
--- a/docs/QView API Documentation.docx
+++ b/docs/QView API Documentation.docx
@@ -14,7 +14,7 @@
       </w:r>
       <w:r>
         <w:rPr/>
-        <w:t>7</w:t>
+        <w:t>8</w:t>
       </w:r>
       <w:r>
         <w:rPr/>
@@ -23377,7 +23377,11 @@
       </w:pPr>
       <w:r>
         <w:rPr/>
-        <w:t>GET GameEvents by ID</w:t>
+        <w:t xml:space="preserve">GET GameEvents </w:t>
+      </w:r>
+      <w:r>
+        <w:rPr/>
+        <w:t>of Game</w:t>
       </w:r>
     </w:p>
     <w:p>
@@ -23399,7 +23403,7 @@
           <w:b/>
           <w:bCs/>
         </w:rPr>
-        <w:t>false</w:t>
+        <w:t>true</w:t>
       </w:r>
     </w:p>
     <w:p>
@@ -23429,7 +23433,15 @@
       </w:pPr>
       <w:r>
         <w:rPr/>
-        <w:t>endpoint: {base_uri}/api/gameevents/{id}</w:t>
+        <w:t>endpoint: {base_uri}/api/</w:t>
+      </w:r>
+      <w:r>
+        <w:rPr/>
+        <w:t>game/{id}/</w:t>
+      </w:r>
+      <w:r>
+        <w:rPr/>
+        <w:t>gameevents</w:t>
       </w:r>
     </w:p>
     <w:p>
@@ -23508,134 +23520,11 @@
       </w:pPr>
       <w:r>
         <w:rPr/>
-        <w:t>ID of the GameEvent to receive</w:t>
-      </w:r>
-    </w:p>
-    <w:p>
-      <w:pPr>
-        <w:pStyle w:val="normal1"/>
-        <w:numPr>
-          <w:ilvl w:val="1"/>
-          <w:numId w:val="1"/>
-        </w:numPr>
-        <w:ind w:hanging="360" w:left="1440"/>
-        <w:rPr/>
-      </w:pPr>
-      <w:r>
-        <w:rPr/>
-        <w:t xml:space="preserve">returns: </w:t>
-      </w:r>
-    </w:p>
-    <w:p>
-      <w:pPr>
-        <w:pStyle w:val="normal1"/>
-        <w:numPr>
-          <w:ilvl w:val="0"/>
-          <w:numId w:val="1"/>
-        </w:numPr>
-        <w:ind w:hanging="360" w:left="720"/>
-        <w:rPr/>
-      </w:pPr>
-      <w:r>
-        <w:rPr/>
-        <w:t>POST/Create GameEvent</w:t>
-      </w:r>
-    </w:p>
-    <w:p>
-      <w:pPr>
-        <w:pStyle w:val="normal1"/>
-        <w:numPr>
-          <w:ilvl w:val="1"/>
-          <w:numId w:val="1"/>
-        </w:numPr>
-        <w:ind w:hanging="360" w:left="1440"/>
-        <w:rPr/>
-      </w:pPr>
-      <w:r>
-        <w:rPr/>
-        <w:t xml:space="preserve">built_including_tests: </w:t>
-      </w:r>
-      <w:r>
-        <w:rPr>
-          <w:b/>
-          <w:bCs/>
-        </w:rPr>
-        <w:t>true</w:t>
-      </w:r>
-    </w:p>
-    <w:p>
-      <w:pPr>
-        <w:pStyle w:val="normal1"/>
-        <w:numPr>
-          <w:ilvl w:val="1"/>
-          <w:numId w:val="1"/>
-        </w:numPr>
-        <w:ind w:hanging="360" w:left="1440"/>
-        <w:rPr/>
-      </w:pPr>
-      <w:r>
-        <w:rPr/>
-        <w:t>HTTP method: ‘POST’</w:t>
-      </w:r>
-    </w:p>
-    <w:p>
-      <w:pPr>
-        <w:pStyle w:val="normal1"/>
-        <w:numPr>
-          <w:ilvl w:val="1"/>
-          <w:numId w:val="1"/>
-        </w:numPr>
-        <w:ind w:hanging="360" w:left="1440"/>
-        <w:rPr/>
-      </w:pPr>
-      <w:r>
-        <w:rPr/>
-        <w:t>endpoint: {base_uri}/api/gameevents</w:t>
-      </w:r>
-    </w:p>
-    <w:p>
-      <w:pPr>
-        <w:pStyle w:val="normal1"/>
-        <w:numPr>
-          <w:ilvl w:val="1"/>
-          <w:numId w:val="1"/>
-        </w:numPr>
-        <w:ind w:hanging="360" w:left="1440"/>
-        <w:rPr/>
-      </w:pPr>
-      <w:r>
-        <w:rPr/>
-        <w:t xml:space="preserve">description: </w:t>
-      </w:r>
-    </w:p>
-    <w:p>
-      <w:pPr>
-        <w:pStyle w:val="normal1"/>
-        <w:numPr>
-          <w:ilvl w:val="1"/>
-          <w:numId w:val="1"/>
-        </w:numPr>
-        <w:ind w:hanging="360" w:left="1440"/>
-        <w:rPr/>
-      </w:pPr>
-      <w:r>
-        <w:rPr/>
-        <w:t xml:space="preserve">body: </w:t>
-      </w:r>
-    </w:p>
-    <w:p>
-      <w:pPr>
-        <w:pStyle w:val="normal1"/>
-        <w:numPr>
-          <w:ilvl w:val="1"/>
-          <w:numId w:val="1"/>
-        </w:numPr>
-        <w:ind w:hanging="360" w:left="1440"/>
-        <w:rPr/>
-      </w:pPr>
-      <w:r>
-        <w:rPr/>
-        <w:t xml:space="preserve">parameters: </w:t>
+        <w:t xml:space="preserve">ID of the Game to receive </w:t>
+      </w:r>
+      <w:r>
+        <w:rPr/>
+        <w:t>GameEvents for</w:t>
       </w:r>
     </w:p>
     <w:p>
@@ -23670,7 +23559,7 @@
       </w:pPr>
       <w:r>
         <w:rPr/>
-        <w:t>the created GameEvent</w:t>
+        <w:t>an array of GameEvents</w:t>
       </w:r>
     </w:p>
     <w:p>
@@ -23685,7 +23574,7 @@
       </w:pPr>
       <w:r>
         <w:rPr/>
-        <w:t>PUT/Update GameEvent</w:t>
+        <w:t>POST/Create GameEvent</w:t>
       </w:r>
     </w:p>
     <w:p>
@@ -23707,37 +23596,37 @@
           <w:b/>
           <w:bCs/>
         </w:rPr>
-        <w:t>false</w:t>
-      </w:r>
-    </w:p>
-    <w:p>
-      <w:pPr>
-        <w:pStyle w:val="normal1"/>
-        <w:numPr>
-          <w:ilvl w:val="1"/>
-          <w:numId w:val="1"/>
-        </w:numPr>
-        <w:ind w:hanging="360" w:left="1440"/>
-        <w:rPr/>
-      </w:pPr>
-      <w:r>
-        <w:rPr/>
-        <w:t>HTTP method: ‘PUT’</w:t>
-      </w:r>
-    </w:p>
-    <w:p>
-      <w:pPr>
-        <w:pStyle w:val="normal1"/>
-        <w:numPr>
-          <w:ilvl w:val="1"/>
-          <w:numId w:val="1"/>
-        </w:numPr>
-        <w:ind w:hanging="360" w:left="1440"/>
-        <w:rPr/>
-      </w:pPr>
-      <w:r>
-        <w:rPr/>
-        <w:t>endpoint: {base_uri}/api/gameevents/{id}</w:t>
+        <w:t>true</w:t>
+      </w:r>
+    </w:p>
+    <w:p>
+      <w:pPr>
+        <w:pStyle w:val="normal1"/>
+        <w:numPr>
+          <w:ilvl w:val="1"/>
+          <w:numId w:val="1"/>
+        </w:numPr>
+        <w:ind w:hanging="360" w:left="1440"/>
+        <w:rPr/>
+      </w:pPr>
+      <w:r>
+        <w:rPr/>
+        <w:t>HTTP method: ‘POST’</w:t>
+      </w:r>
+    </w:p>
+    <w:p>
+      <w:pPr>
+        <w:pStyle w:val="normal1"/>
+        <w:numPr>
+          <w:ilvl w:val="1"/>
+          <w:numId w:val="1"/>
+        </w:numPr>
+        <w:ind w:hanging="360" w:left="1440"/>
+        <w:rPr/>
+      </w:pPr>
+      <w:r>
+        <w:rPr/>
+        <w:t>endpoint: {base_uri}/api/gameevents</w:t>
       </w:r>
     </w:p>
     <w:p>
@@ -23768,6 +23657,36 @@
       <w:r>
         <w:rPr/>
         <w:t xml:space="preserve">body: </w:t>
+      </w:r>
+    </w:p>
+    <w:p>
+      <w:pPr>
+        <w:pStyle w:val="normal1"/>
+        <w:numPr>
+          <w:ilvl w:val="1"/>
+          <w:numId w:val="1"/>
+        </w:numPr>
+        <w:ind w:hanging="360" w:left="1440"/>
+        <w:rPr/>
+      </w:pPr>
+      <w:r>
+        <w:rPr/>
+        <w:t xml:space="preserve">parameters: </w:t>
+      </w:r>
+    </w:p>
+    <w:p>
+      <w:pPr>
+        <w:pStyle w:val="normal1"/>
+        <w:numPr>
+          <w:ilvl w:val="1"/>
+          <w:numId w:val="1"/>
+        </w:numPr>
+        <w:ind w:hanging="360" w:left="1440"/>
+        <w:rPr/>
+      </w:pPr>
+      <w:r>
+        <w:rPr/>
+        <w:t xml:space="preserve">returns: </w:t>
       </w:r>
     </w:p>
     <w:p>
@@ -23787,257 +23706,7 @@
       </w:pPr>
       <w:r>
         <w:rPr/>
-        <w:t>only fields that you want to update (other than ID in the URI path) need to be provided</w:t>
-      </w:r>
-    </w:p>
-    <w:p>
-      <w:pPr>
-        <w:pStyle w:val="normal1"/>
-        <w:numPr>
-          <w:ilvl w:val="1"/>
-          <w:numId w:val="1"/>
-        </w:numPr>
-        <w:ind w:hanging="360" w:left="1440"/>
-        <w:rPr/>
-      </w:pPr>
-      <w:r>
-        <w:rPr/>
-        <w:t>parameters:</w:t>
-      </w:r>
-    </w:p>
-    <w:p>
-      <w:pPr>
-        <w:pStyle w:val="normal1"/>
-        <w:numPr>
-          <w:ilvl w:val="2"/>
-          <w:numId w:val="1"/>
-        </w:numPr>
-        <w:ind w:hanging="360" w:left="2160"/>
-        <w:rPr/>
-      </w:pPr>
-      <w:r>
-        <w:rPr/>
-        <w:t>id</w:t>
-      </w:r>
-    </w:p>
-    <w:p>
-      <w:pPr>
-        <w:pStyle w:val="normal1"/>
-        <w:numPr>
-          <w:ilvl w:val="3"/>
-          <w:numId w:val="1"/>
-        </w:numPr>
-        <w:ind w:hanging="360" w:left="2880"/>
-        <w:rPr>
-          <w:color w:val="FF0000"/>
-        </w:rPr>
-      </w:pPr>
-      <w:r>
-        <w:rPr>
-          <w:color w:val="FF0000"/>
-        </w:rPr>
-        <w:t>Required</w:t>
-      </w:r>
-    </w:p>
-    <w:p>
-      <w:pPr>
-        <w:pStyle w:val="normal1"/>
-        <w:widowControl/>
-        <w:numPr>
-          <w:ilvl w:val="3"/>
-          <w:numId w:val="1"/>
-        </w:numPr>
-        <w:suppressAutoHyphens w:val="true"/>
-        <w:bidi w:val="0"/>
-        <w:spacing w:lineRule="auto" w:line="276" w:before="0" w:after="0"/>
-        <w:ind w:hanging="360" w:left="2880" w:right="0"/>
-        <w:jc w:val="left"/>
-        <w:rPr>
-          <w:color w:val="000000"/>
-        </w:rPr>
-      </w:pPr>
-      <w:r>
-        <w:rPr>
-          <w:color w:val="000000"/>
-        </w:rPr>
-        <w:t>ID of the GameEvent to be updated</w:t>
-      </w:r>
-    </w:p>
-    <w:p>
-      <w:pPr>
-        <w:pStyle w:val="normal1"/>
-        <w:numPr>
-          <w:ilvl w:val="1"/>
-          <w:numId w:val="1"/>
-        </w:numPr>
-        <w:ind w:hanging="360" w:left="1440"/>
-        <w:rPr>
-          <w:color w:val="000000"/>
-        </w:rPr>
-      </w:pPr>
-      <w:r>
-        <w:rPr/>
-        <w:t xml:space="preserve">returns: </w:t>
-      </w:r>
-    </w:p>
-    <w:p>
-      <w:pPr>
-        <w:pStyle w:val="normal1"/>
-        <w:widowControl/>
-        <w:numPr>
-          <w:ilvl w:val="2"/>
-          <w:numId w:val="1"/>
-        </w:numPr>
-        <w:suppressAutoHyphens w:val="true"/>
-        <w:bidi w:val="0"/>
-        <w:spacing w:lineRule="auto" w:line="276" w:before="0" w:after="0"/>
-        <w:ind w:hanging="360" w:left="2160" w:right="0"/>
-        <w:jc w:val="left"/>
-        <w:rPr>
-          <w:color w:val="000000"/>
-        </w:rPr>
-      </w:pPr>
-      <w:r>
-        <w:rPr>
-          <w:color w:val="000000"/>
-        </w:rPr>
-        <w:t>the updated GameEvent</w:t>
-      </w:r>
-    </w:p>
-    <w:p>
-      <w:pPr>
-        <w:pStyle w:val="normal1"/>
-        <w:numPr>
-          <w:ilvl w:val="0"/>
-          <w:numId w:val="1"/>
-        </w:numPr>
-        <w:ind w:hanging="360" w:left="720"/>
-        <w:rPr/>
-      </w:pPr>
-      <w:r>
-        <w:rPr/>
-        <w:t>DELETE GameEvent (by ID)</w:t>
-      </w:r>
-    </w:p>
-    <w:p>
-      <w:pPr>
-        <w:pStyle w:val="normal1"/>
-        <w:numPr>
-          <w:ilvl w:val="1"/>
-          <w:numId w:val="1"/>
-        </w:numPr>
-        <w:ind w:hanging="360" w:left="1440"/>
-        <w:rPr/>
-      </w:pPr>
-      <w:r>
-        <w:rPr/>
-        <w:t xml:space="preserve">built_including_tests: </w:t>
-      </w:r>
-      <w:r>
-        <w:rPr>
-          <w:b/>
-          <w:bCs/>
-        </w:rPr>
-        <w:t>false</w:t>
-      </w:r>
-    </w:p>
-    <w:p>
-      <w:pPr>
-        <w:pStyle w:val="normal1"/>
-        <w:numPr>
-          <w:ilvl w:val="1"/>
-          <w:numId w:val="1"/>
-        </w:numPr>
-        <w:ind w:hanging="360" w:left="1440"/>
-        <w:rPr/>
-      </w:pPr>
-      <w:r>
-        <w:rPr/>
-        <w:t>HTTP method: ‘DELETE’</w:t>
-      </w:r>
-    </w:p>
-    <w:p>
-      <w:pPr>
-        <w:pStyle w:val="normal1"/>
-        <w:numPr>
-          <w:ilvl w:val="1"/>
-          <w:numId w:val="1"/>
-        </w:numPr>
-        <w:ind w:hanging="360" w:left="1440"/>
-        <w:rPr/>
-      </w:pPr>
-      <w:r>
-        <w:rPr/>
-        <w:t>endpoint: {base_uri}/api/gameevents/{id}</w:t>
-      </w:r>
-    </w:p>
-    <w:p>
-      <w:pPr>
-        <w:pStyle w:val="normal1"/>
-        <w:numPr>
-          <w:ilvl w:val="1"/>
-          <w:numId w:val="1"/>
-        </w:numPr>
-        <w:ind w:hanging="360" w:left="1440"/>
-        <w:rPr/>
-      </w:pPr>
-      <w:r>
-        <w:rPr/>
-        <w:t xml:space="preserve">description: </w:t>
-      </w:r>
-    </w:p>
-    <w:p>
-      <w:pPr>
-        <w:pStyle w:val="normal1"/>
-        <w:numPr>
-          <w:ilvl w:val="1"/>
-          <w:numId w:val="1"/>
-        </w:numPr>
-        <w:ind w:hanging="360" w:left="1440"/>
-        <w:rPr/>
-      </w:pPr>
-      <w:r>
-        <w:rPr/>
-        <w:t xml:space="preserve">parameters: </w:t>
-      </w:r>
-    </w:p>
-    <w:p>
-      <w:pPr>
-        <w:pStyle w:val="normal1"/>
-        <w:numPr>
-          <w:ilvl w:val="1"/>
-          <w:numId w:val="1"/>
-        </w:numPr>
-        <w:ind w:hanging="360" w:left="1440"/>
-        <w:rPr/>
-      </w:pPr>
-      <w:r>
-        <w:rPr/>
-        <w:t xml:space="preserve">returns: </w:t>
-      </w:r>
-    </w:p>
-    <w:p>
-      <w:pPr>
-        <w:pStyle w:val="normal1"/>
-        <w:widowControl/>
-        <w:numPr>
-          <w:ilvl w:val="2"/>
-          <w:numId w:val="1"/>
-        </w:numPr>
-        <w:suppressAutoHyphens w:val="true"/>
-        <w:bidi w:val="0"/>
-        <w:spacing w:lineRule="auto" w:line="276" w:before="0" w:after="0"/>
-        <w:ind w:hanging="360" w:left="2160" w:right="0"/>
-        <w:jc w:val="left"/>
-        <w:rPr/>
-      </w:pPr>
-      <w:r>
-        <w:rPr>
-          <w:b w:val="false"/>
-          <w:bCs w:val="false"/>
-          <w:color w:val="000000"/>
-        </w:rPr>
-        <w:t>a 200 OK response only</w:t>
+        <w:t>the created GameEvent</w:t>
       </w:r>
     </w:p>
     <w:p>
@@ -37502,9 +37171,9 @@
       <w:lvlJc w:val="left"/>
       <w:pPr>
         <w:tabs>
-          <w:tab w:val="num" w:pos="3240"/>
+          <w:tab w:val="num" w:pos="3960"/>
         </w:tabs>
-        <w:ind w:left="3960" w:hanging="360"/>
+        <w:ind w:left="4680" w:hanging="360"/>
       </w:pPr>
       <w:rPr>
         <w:rFonts w:ascii="Wingdings" w:hAnsi="Wingdings" w:cs="Wingdings" w:hint="default"/>
@@ -37518,9 +37187,9 @@
       <w:lvlJc w:val="left"/>
       <w:pPr>
         <w:tabs>
-          <w:tab w:val="num" w:pos="3240"/>
+          <w:tab w:val="num" w:pos="3960"/>
         </w:tabs>
-        <w:ind w:left="4680" w:hanging="360"/>
+        <w:ind w:left="5400" w:hanging="360"/>
       </w:pPr>
       <w:rPr>
         <w:rFonts w:ascii="Wingdings 2" w:hAnsi="Wingdings 2" w:cs="Wingdings 2" w:hint="default"/>
@@ -37534,9 +37203,9 @@
       <w:lvlJc w:val="left"/>
       <w:pPr>
         <w:tabs>
-          <w:tab w:val="num" w:pos="3240"/>
+          <w:tab w:val="num" w:pos="3960"/>
         </w:tabs>
-        <w:ind w:left="5400" w:hanging="360"/>
+        <w:ind w:left="6120" w:hanging="360"/>
       </w:pPr>
       <w:rPr>
         <w:rFonts w:ascii="OpenSymbol" w:hAnsi="OpenSymbol" w:cs="OpenSymbol" w:hint="default"/>
@@ -37550,9 +37219,9 @@
       <w:lvlJc w:val="left"/>
       <w:pPr>
         <w:tabs>
-          <w:tab w:val="num" w:pos="3240"/>
+          <w:tab w:val="num" w:pos="3960"/>
         </w:tabs>
-        <w:ind w:left="6120" w:hanging="360"/>
+        <w:ind w:left="6840" w:hanging="360"/>
       </w:pPr>
       <w:rPr>
         <w:rFonts w:ascii="Wingdings" w:hAnsi="Wingdings" w:cs="Wingdings" w:hint="default"/>
@@ -37566,9 +37235,9 @@
       <w:lvlJc w:val="left"/>
       <w:pPr>
         <w:tabs>
-          <w:tab w:val="num" w:pos="3240"/>
+          <w:tab w:val="num" w:pos="3960"/>
         </w:tabs>
-        <w:ind w:left="6840" w:hanging="360"/>
+        <w:ind w:left="7560" w:hanging="360"/>
       </w:pPr>
       <w:rPr>
         <w:rFonts w:ascii="Wingdings 2" w:hAnsi="Wingdings 2" w:cs="Wingdings 2" w:hint="default"/>
@@ -37582,9 +37251,9 @@
       <w:lvlJc w:val="left"/>
       <w:pPr>
         <w:tabs>
-          <w:tab w:val="num" w:pos="3240"/>
+          <w:tab w:val="num" w:pos="3960"/>
         </w:tabs>
-        <w:ind w:left="7560" w:hanging="360"/>
+        <w:ind w:left="8280" w:hanging="360"/>
       </w:pPr>
       <w:rPr>
         <w:rFonts w:ascii="OpenSymbol" w:hAnsi="OpenSymbol" w:cs="OpenSymbol" w:hint="default"/>
@@ -37598,9 +37267,9 @@
       <w:lvlJc w:val="left"/>
       <w:pPr>
         <w:tabs>
-          <w:tab w:val="num" w:pos="3240"/>
+          <w:tab w:val="num" w:pos="3960"/>
         </w:tabs>
-        <w:ind w:left="8280" w:hanging="360"/>
+        <w:ind w:left="9000" w:hanging="360"/>
       </w:pPr>
       <w:rPr>
         <w:rFonts w:ascii="Wingdings" w:hAnsi="Wingdings" w:cs="Wingdings" w:hint="default"/>
@@ -37614,9 +37283,9 @@
       <w:lvlJc w:val="left"/>
       <w:pPr>
         <w:tabs>
-          <w:tab w:val="num" w:pos="3240"/>
+          <w:tab w:val="num" w:pos="3960"/>
         </w:tabs>
-        <w:ind w:left="9000" w:hanging="360"/>
+        <w:ind w:left="9720" w:hanging="360"/>
       </w:pPr>
       <w:rPr>
         <w:rFonts w:ascii="Wingdings 2" w:hAnsi="Wingdings 2" w:cs="Wingdings 2" w:hint="default"/>
@@ -37630,9 +37299,9 @@
       <w:lvlJc w:val="left"/>
       <w:pPr>
         <w:tabs>
-          <w:tab w:val="num" w:pos="3240"/>
+          <w:tab w:val="num" w:pos="3960"/>
         </w:tabs>
-        <w:ind w:left="9720" w:hanging="360"/>
+        <w:ind w:left="10440" w:hanging="360"/>
       </w:pPr>
       <w:rPr>
         <w:rFonts w:ascii="OpenSymbol" w:hAnsi="OpenSymbol" w:cs="OpenSymbol" w:hint="default"/>

</xml_diff>

<commit_message>
fixing data received by data table UIs to be Tournament-scoped instead of returning all of each domain entity type; added an endpoint with passing integration test
</commit_message>
<xml_diff>
--- a/docs/QView API Documentation.docx
+++ b/docs/QView API Documentation.docx
@@ -14,11 +14,27 @@
       </w:r>
       <w:r>
         <w:rPr/>
-        <w:t>8</w:t>
-      </w:r>
-      <w:r>
-        <w:rPr/>
-        <w:t>_2026.02.18)</w:t>
+        <w:t>9</w:t>
+      </w:r>
+      <w:r>
+        <w:rPr/>
+        <w:t>_2026.0</w:t>
+      </w:r>
+      <w:r>
+        <w:rPr/>
+        <w:t>3</w:t>
+      </w:r>
+      <w:r>
+        <w:rPr/>
+        <w:t>.1</w:t>
+      </w:r>
+      <w:r>
+        <w:rPr/>
+        <w:t>9</w:t>
+      </w:r>
+      <w:r>
+        <w:rPr/>
+        <w:t>)</w:t>
       </w:r>
     </w:p>
     <w:p>
@@ -23377,11 +23393,7 @@
       </w:pPr>
       <w:r>
         <w:rPr/>
-        <w:t xml:space="preserve">GET GameEvents </w:t>
-      </w:r>
-      <w:r>
-        <w:rPr/>
-        <w:t>of Game</w:t>
+        <w:t>GET GameEvents of Game</w:t>
       </w:r>
     </w:p>
     <w:p>
@@ -23433,15 +23445,7 @@
       </w:pPr>
       <w:r>
         <w:rPr/>
-        <w:t>endpoint: {base_uri}/api/</w:t>
-      </w:r>
-      <w:r>
-        <w:rPr/>
-        <w:t>game/{id}/</w:t>
-      </w:r>
-      <w:r>
-        <w:rPr/>
-        <w:t>gameevents</w:t>
+        <w:t>endpoint: {base_uri}/api/game/{id}/gameevents</w:t>
       </w:r>
     </w:p>
     <w:p>
@@ -23520,11 +23524,7 @@
       </w:pPr>
       <w:r>
         <w:rPr/>
-        <w:t xml:space="preserve">ID of the Game to receive </w:t>
-      </w:r>
-      <w:r>
-        <w:rPr/>
-        <w:t>GameEvents for</w:t>
+        <w:t>ID of the Game to receive GameEvents for</w:t>
       </w:r>
     </w:p>
     <w:p>
@@ -31854,6 +31854,328 @@
       <w:r>
         <w:rPr/>
         <w:t>ID of the Division</w:t>
+      </w:r>
+    </w:p>
+    <w:p>
+      <w:pPr>
+        <w:pStyle w:val="normal1"/>
+        <w:numPr>
+          <w:ilvl w:val="2"/>
+          <w:numId w:val="1"/>
+        </w:numPr>
+        <w:ind w:hanging="360" w:left="2160"/>
+        <w:rPr/>
+      </w:pPr>
+      <w:r>
+        <w:rPr/>
+        <w:t>page={page_num}</w:t>
+      </w:r>
+    </w:p>
+    <w:p>
+      <w:pPr>
+        <w:pStyle w:val="normal1"/>
+        <w:numPr>
+          <w:ilvl w:val="3"/>
+          <w:numId w:val="1"/>
+        </w:numPr>
+        <w:ind w:hanging="360" w:left="2880"/>
+        <w:rPr>
+          <w:color w:val="FF0000"/>
+        </w:rPr>
+      </w:pPr>
+      <w:r>
+        <w:rPr>
+          <w:color w:val="FF0000"/>
+        </w:rPr>
+        <w:t>Required</w:t>
+      </w:r>
+    </w:p>
+    <w:p>
+      <w:pPr>
+        <w:pStyle w:val="normal1"/>
+        <w:numPr>
+          <w:ilvl w:val="3"/>
+          <w:numId w:val="1"/>
+        </w:numPr>
+        <w:ind w:hanging="360" w:left="2880"/>
+        <w:rPr/>
+      </w:pPr>
+      <w:r>
+        <w:rPr/>
+        <w:t>Defines which page to return</w:t>
+      </w:r>
+    </w:p>
+    <w:p>
+      <w:pPr>
+        <w:pStyle w:val="normal1"/>
+        <w:numPr>
+          <w:ilvl w:val="3"/>
+          <w:numId w:val="1"/>
+        </w:numPr>
+        <w:ind w:hanging="360" w:left="2880"/>
+        <w:rPr/>
+      </w:pPr>
+      <w:r>
+        <w:rPr/>
+        <w:t>First page = 0 (zero)</w:t>
+      </w:r>
+    </w:p>
+    <w:p>
+      <w:pPr>
+        <w:pStyle w:val="normal1"/>
+        <w:numPr>
+          <w:ilvl w:val="2"/>
+          <w:numId w:val="1"/>
+        </w:numPr>
+        <w:ind w:hanging="360" w:left="2160"/>
+        <w:rPr/>
+      </w:pPr>
+      <w:r>
+        <w:rPr/>
+        <w:t>page_size={num_of_rows}</w:t>
+      </w:r>
+    </w:p>
+    <w:p>
+      <w:pPr>
+        <w:pStyle w:val="normal1"/>
+        <w:numPr>
+          <w:ilvl w:val="3"/>
+          <w:numId w:val="1"/>
+        </w:numPr>
+        <w:ind w:hanging="360" w:left="2880"/>
+        <w:rPr>
+          <w:color w:val="FF0000"/>
+        </w:rPr>
+      </w:pPr>
+      <w:r>
+        <w:rPr>
+          <w:color w:val="FF0000"/>
+        </w:rPr>
+        <w:t>Required</w:t>
+      </w:r>
+    </w:p>
+    <w:p>
+      <w:pPr>
+        <w:pStyle w:val="normal1"/>
+        <w:widowControl/>
+        <w:numPr>
+          <w:ilvl w:val="3"/>
+          <w:numId w:val="1"/>
+        </w:numPr>
+        <w:suppressAutoHyphens w:val="true"/>
+        <w:bidi w:val="0"/>
+        <w:spacing w:lineRule="auto" w:line="276" w:before="0" w:after="0"/>
+        <w:ind w:hanging="360" w:left="2880" w:right="0"/>
+        <w:jc w:val="left"/>
+        <w:rPr/>
+      </w:pPr>
+      <w:r>
+        <w:rPr/>
+        <w:t>Defines how many rows to return for the selected page</w:t>
+      </w:r>
+    </w:p>
+    <w:p>
+      <w:pPr>
+        <w:pStyle w:val="normal1"/>
+        <w:numPr>
+          <w:ilvl w:val="1"/>
+          <w:numId w:val="1"/>
+        </w:numPr>
+        <w:ind w:hanging="360" w:left="1440"/>
+        <w:rPr/>
+      </w:pPr>
+      <w:r>
+        <w:rPr/>
+        <w:t>returns:</w:t>
+      </w:r>
+    </w:p>
+    <w:p>
+      <w:pPr>
+        <w:pStyle w:val="normal1"/>
+        <w:widowControl/>
+        <w:numPr>
+          <w:ilvl w:val="2"/>
+          <w:numId w:val="1"/>
+        </w:numPr>
+        <w:suppressAutoHyphens w:val="true"/>
+        <w:bidi w:val="0"/>
+        <w:spacing w:lineRule="auto" w:line="276" w:before="0" w:after="0"/>
+        <w:ind w:hanging="360" w:left="2160" w:right="0"/>
+        <w:jc w:val="left"/>
+        <w:rPr>
+          <w:b/>
+          <w:bCs/>
+        </w:rPr>
+      </w:pPr>
+      <w:r>
+        <w:rPr>
+          <w:b w:val="false"/>
+          <w:bCs w:val="false"/>
+          <w:color w:val="000000"/>
+        </w:rPr>
+        <w:t>an array of Teams</w:t>
+      </w:r>
+    </w:p>
+    <w:p>
+      <w:pPr>
+        <w:pStyle w:val="normal1"/>
+        <w:numPr>
+          <w:ilvl w:val="0"/>
+          <w:numId w:val="1"/>
+        </w:numPr>
+        <w:ind w:hanging="360" w:left="720"/>
+        <w:rPr/>
+      </w:pPr>
+      <w:r>
+        <w:rPr/>
+        <w:t xml:space="preserve">GET Teams of </w:t>
+      </w:r>
+      <w:r>
+        <w:rPr/>
+        <w:t>Tournament</w:t>
+      </w:r>
+    </w:p>
+    <w:p>
+      <w:pPr>
+        <w:pStyle w:val="normal1"/>
+        <w:numPr>
+          <w:ilvl w:val="1"/>
+          <w:numId w:val="1"/>
+        </w:numPr>
+        <w:ind w:hanging="360" w:left="1440"/>
+        <w:rPr/>
+      </w:pPr>
+      <w:r>
+        <w:rPr/>
+        <w:t xml:space="preserve">built_including_tests: </w:t>
+      </w:r>
+      <w:r>
+        <w:rPr>
+          <w:b/>
+          <w:bCs/>
+        </w:rPr>
+        <w:t>true</w:t>
+      </w:r>
+    </w:p>
+    <w:p>
+      <w:pPr>
+        <w:pStyle w:val="normal1"/>
+        <w:numPr>
+          <w:ilvl w:val="1"/>
+          <w:numId w:val="1"/>
+        </w:numPr>
+        <w:ind w:hanging="360" w:left="1440"/>
+        <w:rPr/>
+      </w:pPr>
+      <w:r>
+        <w:rPr/>
+        <w:t>HTTP method: ‘GET’</w:t>
+      </w:r>
+    </w:p>
+    <w:p>
+      <w:pPr>
+        <w:pStyle w:val="normal1"/>
+        <w:numPr>
+          <w:ilvl w:val="1"/>
+          <w:numId w:val="1"/>
+        </w:numPr>
+        <w:ind w:hanging="360" w:left="1440"/>
+        <w:rPr/>
+      </w:pPr>
+      <w:r>
+        <w:rPr/>
+        <w:t>endpoint: {base_uri}/api/</w:t>
+      </w:r>
+      <w:r>
+        <w:rPr/>
+        <w:t>tournaments</w:t>
+      </w:r>
+      <w:r>
+        <w:rPr/>
+        <w:t>/{id}/teams?page={page_num}&amp;page_size={num_of_rows}</w:t>
+      </w:r>
+    </w:p>
+    <w:p>
+      <w:pPr>
+        <w:pStyle w:val="normal1"/>
+        <w:numPr>
+          <w:ilvl w:val="1"/>
+          <w:numId w:val="1"/>
+        </w:numPr>
+        <w:ind w:hanging="360" w:left="1440"/>
+        <w:rPr/>
+      </w:pPr>
+      <w:r>
+        <w:rPr/>
+        <w:t xml:space="preserve">description: </w:t>
+      </w:r>
+    </w:p>
+    <w:p>
+      <w:pPr>
+        <w:pStyle w:val="normal1"/>
+        <w:numPr>
+          <w:ilvl w:val="1"/>
+          <w:numId w:val="1"/>
+        </w:numPr>
+        <w:ind w:hanging="360" w:left="1440"/>
+        <w:rPr/>
+      </w:pPr>
+      <w:r>
+        <w:rPr/>
+        <w:t>parameters:</w:t>
+      </w:r>
+    </w:p>
+    <w:p>
+      <w:pPr>
+        <w:pStyle w:val="normal1"/>
+        <w:numPr>
+          <w:ilvl w:val="2"/>
+          <w:numId w:val="1"/>
+        </w:numPr>
+        <w:ind w:hanging="360" w:left="2160"/>
+        <w:rPr/>
+      </w:pPr>
+      <w:r>
+        <w:rPr/>
+        <w:t>id</w:t>
+      </w:r>
+    </w:p>
+    <w:p>
+      <w:pPr>
+        <w:pStyle w:val="normal1"/>
+        <w:numPr>
+          <w:ilvl w:val="3"/>
+          <w:numId w:val="1"/>
+        </w:numPr>
+        <w:ind w:hanging="360" w:left="2880"/>
+        <w:rPr>
+          <w:color w:val="FF0000"/>
+        </w:rPr>
+      </w:pPr>
+      <w:r>
+        <w:rPr>
+          <w:color w:val="FF0000"/>
+        </w:rPr>
+        <w:t>Required</w:t>
+      </w:r>
+    </w:p>
+    <w:p>
+      <w:pPr>
+        <w:pStyle w:val="normal1"/>
+        <w:numPr>
+          <w:ilvl w:val="3"/>
+          <w:numId w:val="1"/>
+        </w:numPr>
+        <w:ind w:hanging="360" w:left="2880"/>
+        <w:rPr/>
+      </w:pPr>
+      <w:r>
+        <w:rPr/>
+        <w:t xml:space="preserve">ID of the </w:t>
+      </w:r>
+      <w:r>
+        <w:rPr/>
+        <w:t>Tournament</w:t>
       </w:r>
     </w:p>
     <w:p>

</xml_diff>

<commit_message>
added pages to the User profile for different roles a User can be in for a Tournament
</commit_message>
<xml_diff>
--- a/docs/QView API Documentation.docx
+++ b/docs/QView API Documentation.docx
@@ -10,23 +10,7 @@
       </w:pPr>
       <w:r>
         <w:rPr/>
-        <w:t>QView API Documentation (v15</w:t>
-      </w:r>
-      <w:r>
-        <w:rPr/>
-        <w:t>2</w:t>
-      </w:r>
-      <w:r>
-        <w:rPr/>
-        <w:t>_2026.03.2</w:t>
-      </w:r>
-      <w:r>
-        <w:rPr/>
-        <w:t>6</w:t>
-      </w:r>
-      <w:r>
-        <w:rPr/>
-        <w:t>)</w:t>
+        <w:t>QView API Documentation (v152_2026.03.26)</w:t>
       </w:r>
     </w:p>
     <w:p>
@@ -12811,47 +12795,54 @@
           <w:numId w:val="1"/>
         </w:numPr>
         <w:ind w:hanging="360" w:left="1440"/>
-        <w:rPr/>
-      </w:pPr>
-      <w:r>
-        <w:rPr/>
-        <w:t xml:space="preserve">returns: </w:t>
-      </w:r>
-    </w:p>
-    <w:p>
-      <w:pPr>
-        <w:pStyle w:val="normal1"/>
-        <w:numPr>
-          <w:ilvl w:val="0"/>
-          <w:numId w:val="1"/>
-        </w:numPr>
-        <w:ind w:hanging="360" w:left="720"/>
-        <w:rPr/>
-      </w:pPr>
-      <w:r>
-        <w:rPr/>
-        <w:t>GET Games where User is ContentJudge</w:t>
-      </w:r>
-    </w:p>
-    <w:p>
-      <w:pPr>
-        <w:pStyle w:val="normal1"/>
-        <w:numPr>
-          <w:ilvl w:val="1"/>
-          <w:numId w:val="1"/>
-        </w:numPr>
-        <w:ind w:hanging="360" w:left="1440"/>
-        <w:rPr/>
-      </w:pPr>
-      <w:r>
-        <w:rPr/>
-        <w:t xml:space="preserve">built_including_tests: </w:t>
-      </w:r>
-      <w:r>
         <w:rPr>
           <w:b/>
           <w:bCs/>
         </w:rPr>
+      </w:pPr>
+      <w:r>
+        <w:rPr/>
+        <w:t xml:space="preserve">returns: </w:t>
+      </w:r>
+    </w:p>
+    <w:p>
+      <w:pPr>
+        <w:pStyle w:val="normal1"/>
+        <w:numPr>
+          <w:ilvl w:val="0"/>
+          <w:numId w:val="1"/>
+        </w:numPr>
+        <w:ind w:hanging="360" w:left="720"/>
+        <w:rPr/>
+      </w:pPr>
+      <w:r>
+        <w:rPr/>
+        <w:t xml:space="preserve">GET Games where User is QuizMaster </w:t>
+      </w:r>
+      <w:r>
+        <w:rPr/>
+        <w:t>(*Enriched)</w:t>
+      </w:r>
+    </w:p>
+    <w:p>
+      <w:pPr>
+        <w:pStyle w:val="normal1"/>
+        <w:numPr>
+          <w:ilvl w:val="1"/>
+          <w:numId w:val="1"/>
+        </w:numPr>
+        <w:ind w:hanging="360" w:left="1440"/>
+        <w:rPr/>
+      </w:pPr>
+      <w:r>
+        <w:rPr/>
+        <w:t xml:space="preserve">built_including_tests: </w:t>
+      </w:r>
+      <w:r>
+        <w:rPr>
+          <w:b/>
+          <w:bCs/>
+        </w:rPr>
         <w:t>true</w:t>
       </w:r>
     </w:p>
@@ -12882,7 +12873,581 @@
       </w:pPr>
       <w:r>
         <w:rPr/>
+        <w:t>endpoint: {base_uri}/api/users/{id}/games-where-quizmaster-enriched?page={page_num}&amp;page_size={num_of_rows}</w:t>
+      </w:r>
+    </w:p>
+    <w:p>
+      <w:pPr>
+        <w:pStyle w:val="normal1"/>
+        <w:numPr>
+          <w:ilvl w:val="1"/>
+          <w:numId w:val="1"/>
+        </w:numPr>
+        <w:ind w:hanging="360" w:left="1440"/>
+        <w:rPr/>
+      </w:pPr>
+      <w:r>
+        <w:rPr/>
+        <w:t xml:space="preserve">description: </w:t>
+      </w:r>
+    </w:p>
+    <w:p>
+      <w:pPr>
+        <w:pStyle w:val="normal1"/>
+        <w:numPr>
+          <w:ilvl w:val="1"/>
+          <w:numId w:val="1"/>
+        </w:numPr>
+        <w:ind w:hanging="360" w:left="1440"/>
+        <w:rPr/>
+      </w:pPr>
+      <w:r>
+        <w:rPr/>
+        <w:t>parameters:</w:t>
+      </w:r>
+    </w:p>
+    <w:p>
+      <w:pPr>
+        <w:pStyle w:val="normal1"/>
+        <w:numPr>
+          <w:ilvl w:val="2"/>
+          <w:numId w:val="1"/>
+        </w:numPr>
+        <w:ind w:hanging="360" w:left="2160"/>
+        <w:rPr/>
+      </w:pPr>
+      <w:r>
+        <w:rPr/>
+        <w:t>id</w:t>
+      </w:r>
+    </w:p>
+    <w:p>
+      <w:pPr>
+        <w:pStyle w:val="normal1"/>
+        <w:numPr>
+          <w:ilvl w:val="3"/>
+          <w:numId w:val="1"/>
+        </w:numPr>
+        <w:ind w:hanging="360" w:left="2880"/>
+        <w:rPr>
+          <w:color w:val="FF0000"/>
+        </w:rPr>
+      </w:pPr>
+      <w:r>
+        <w:rPr>
+          <w:color w:val="FF0000"/>
+        </w:rPr>
+        <w:t>Required</w:t>
+      </w:r>
+    </w:p>
+    <w:p>
+      <w:pPr>
+        <w:pStyle w:val="normal1"/>
+        <w:numPr>
+          <w:ilvl w:val="3"/>
+          <w:numId w:val="1"/>
+        </w:numPr>
+        <w:ind w:hanging="360" w:left="2880"/>
+        <w:rPr/>
+      </w:pPr>
+      <w:r>
+        <w:rPr/>
+        <w:t>ID of the User</w:t>
+      </w:r>
+    </w:p>
+    <w:p>
+      <w:pPr>
+        <w:pStyle w:val="normal1"/>
+        <w:numPr>
+          <w:ilvl w:val="2"/>
+          <w:numId w:val="1"/>
+        </w:numPr>
+        <w:ind w:hanging="360" w:left="2160"/>
+        <w:rPr/>
+      </w:pPr>
+      <w:r>
+        <w:rPr/>
+        <w:t>page={page_num}</w:t>
+      </w:r>
+    </w:p>
+    <w:p>
+      <w:pPr>
+        <w:pStyle w:val="normal1"/>
+        <w:numPr>
+          <w:ilvl w:val="3"/>
+          <w:numId w:val="1"/>
+        </w:numPr>
+        <w:ind w:hanging="360" w:left="2880"/>
+        <w:rPr>
+          <w:color w:val="FF0000"/>
+        </w:rPr>
+      </w:pPr>
+      <w:r>
+        <w:rPr>
+          <w:color w:val="FF0000"/>
+        </w:rPr>
+        <w:t>Required</w:t>
+      </w:r>
+    </w:p>
+    <w:p>
+      <w:pPr>
+        <w:pStyle w:val="normal1"/>
+        <w:numPr>
+          <w:ilvl w:val="3"/>
+          <w:numId w:val="1"/>
+        </w:numPr>
+        <w:ind w:hanging="360" w:left="2880"/>
+        <w:rPr/>
+      </w:pPr>
+      <w:r>
+        <w:rPr/>
+        <w:t>Defines which page to return</w:t>
+      </w:r>
+    </w:p>
+    <w:p>
+      <w:pPr>
+        <w:pStyle w:val="normal1"/>
+        <w:numPr>
+          <w:ilvl w:val="3"/>
+          <w:numId w:val="1"/>
+        </w:numPr>
+        <w:ind w:hanging="360" w:left="2880"/>
+        <w:rPr/>
+      </w:pPr>
+      <w:r>
+        <w:rPr/>
+        <w:t>First page = 0 (zero)</w:t>
+      </w:r>
+    </w:p>
+    <w:p>
+      <w:pPr>
+        <w:pStyle w:val="normal1"/>
+        <w:numPr>
+          <w:ilvl w:val="2"/>
+          <w:numId w:val="1"/>
+        </w:numPr>
+        <w:ind w:hanging="360" w:left="2160"/>
+        <w:rPr/>
+      </w:pPr>
+      <w:r>
+        <w:rPr/>
+        <w:t>page_size={num_of_rows}</w:t>
+      </w:r>
+    </w:p>
+    <w:p>
+      <w:pPr>
+        <w:pStyle w:val="normal1"/>
+        <w:numPr>
+          <w:ilvl w:val="3"/>
+          <w:numId w:val="1"/>
+        </w:numPr>
+        <w:ind w:hanging="360" w:left="2880"/>
+        <w:rPr>
+          <w:color w:val="FF0000"/>
+        </w:rPr>
+      </w:pPr>
+      <w:r>
+        <w:rPr>
+          <w:color w:val="FF0000"/>
+        </w:rPr>
+        <w:t>Required</w:t>
+      </w:r>
+    </w:p>
+    <w:p>
+      <w:pPr>
+        <w:pStyle w:val="normal1"/>
+        <w:widowControl/>
+        <w:numPr>
+          <w:ilvl w:val="3"/>
+          <w:numId w:val="1"/>
+        </w:numPr>
+        <w:suppressAutoHyphens w:val="true"/>
+        <w:bidi w:val="0"/>
+        <w:spacing w:lineRule="auto" w:line="276" w:before="0" w:after="0"/>
+        <w:ind w:hanging="360" w:left="2880" w:right="0"/>
+        <w:jc w:val="left"/>
+        <w:rPr/>
+      </w:pPr>
+      <w:r>
+        <w:rPr/>
+        <w:t>Defines how many rows to return for the selected page</w:t>
+      </w:r>
+    </w:p>
+    <w:p>
+      <w:pPr>
+        <w:pStyle w:val="normal1"/>
+        <w:numPr>
+          <w:ilvl w:val="1"/>
+          <w:numId w:val="1"/>
+        </w:numPr>
+        <w:ind w:hanging="360" w:left="1440"/>
+        <w:rPr/>
+      </w:pPr>
+      <w:r>
+        <w:rPr/>
+        <w:t xml:space="preserve">returns: </w:t>
+      </w:r>
+    </w:p>
+    <w:p>
+      <w:pPr>
+        <w:pStyle w:val="normal1"/>
+        <w:numPr>
+          <w:ilvl w:val="0"/>
+          <w:numId w:val="1"/>
+        </w:numPr>
+        <w:ind w:hanging="360" w:left="720"/>
+        <w:rPr/>
+      </w:pPr>
+      <w:r>
+        <w:rPr/>
+        <w:t>GET Games where User is ContentJudge</w:t>
+      </w:r>
+    </w:p>
+    <w:p>
+      <w:pPr>
+        <w:pStyle w:val="normal1"/>
+        <w:numPr>
+          <w:ilvl w:val="1"/>
+          <w:numId w:val="1"/>
+        </w:numPr>
+        <w:ind w:hanging="360" w:left="1440"/>
+        <w:rPr/>
+      </w:pPr>
+      <w:r>
+        <w:rPr/>
+        <w:t xml:space="preserve">built_including_tests: </w:t>
+      </w:r>
+      <w:r>
+        <w:rPr>
+          <w:b/>
+          <w:bCs/>
+        </w:rPr>
+        <w:t>true</w:t>
+      </w:r>
+    </w:p>
+    <w:p>
+      <w:pPr>
+        <w:pStyle w:val="normal1"/>
+        <w:numPr>
+          <w:ilvl w:val="1"/>
+          <w:numId w:val="1"/>
+        </w:numPr>
+        <w:ind w:hanging="360" w:left="1440"/>
+        <w:rPr/>
+      </w:pPr>
+      <w:r>
+        <w:rPr/>
+        <w:t>HTTP method: ‘GET’</w:t>
+      </w:r>
+    </w:p>
+    <w:p>
+      <w:pPr>
+        <w:pStyle w:val="normal1"/>
+        <w:numPr>
+          <w:ilvl w:val="1"/>
+          <w:numId w:val="1"/>
+        </w:numPr>
+        <w:ind w:hanging="360" w:left="1440"/>
+        <w:rPr/>
+      </w:pPr>
+      <w:r>
+        <w:rPr/>
         <w:t>endpoint: {base_uri}/api/users/{id}/games-where-contentjudge?page={page_num}&amp;page_size={num_of_rows}</w:t>
+      </w:r>
+    </w:p>
+    <w:p>
+      <w:pPr>
+        <w:pStyle w:val="normal1"/>
+        <w:numPr>
+          <w:ilvl w:val="1"/>
+          <w:numId w:val="1"/>
+        </w:numPr>
+        <w:ind w:hanging="360" w:left="1440"/>
+        <w:rPr/>
+      </w:pPr>
+      <w:r>
+        <w:rPr/>
+        <w:t xml:space="preserve">description: </w:t>
+      </w:r>
+    </w:p>
+    <w:p>
+      <w:pPr>
+        <w:pStyle w:val="normal1"/>
+        <w:numPr>
+          <w:ilvl w:val="1"/>
+          <w:numId w:val="1"/>
+        </w:numPr>
+        <w:ind w:hanging="360" w:left="1440"/>
+        <w:rPr/>
+      </w:pPr>
+      <w:r>
+        <w:rPr/>
+        <w:t>parameters:</w:t>
+      </w:r>
+    </w:p>
+    <w:p>
+      <w:pPr>
+        <w:pStyle w:val="normal1"/>
+        <w:numPr>
+          <w:ilvl w:val="2"/>
+          <w:numId w:val="1"/>
+        </w:numPr>
+        <w:ind w:hanging="360" w:left="2160"/>
+        <w:rPr/>
+      </w:pPr>
+      <w:r>
+        <w:rPr/>
+        <w:t>id</w:t>
+      </w:r>
+    </w:p>
+    <w:p>
+      <w:pPr>
+        <w:pStyle w:val="normal1"/>
+        <w:numPr>
+          <w:ilvl w:val="3"/>
+          <w:numId w:val="1"/>
+        </w:numPr>
+        <w:ind w:hanging="360" w:left="2880"/>
+        <w:rPr>
+          <w:color w:val="FF0000"/>
+        </w:rPr>
+      </w:pPr>
+      <w:r>
+        <w:rPr>
+          <w:color w:val="FF0000"/>
+        </w:rPr>
+        <w:t>Required</w:t>
+      </w:r>
+    </w:p>
+    <w:p>
+      <w:pPr>
+        <w:pStyle w:val="normal1"/>
+        <w:numPr>
+          <w:ilvl w:val="3"/>
+          <w:numId w:val="1"/>
+        </w:numPr>
+        <w:ind w:hanging="360" w:left="2880"/>
+        <w:rPr/>
+      </w:pPr>
+      <w:r>
+        <w:rPr/>
+        <w:t>ID of the User</w:t>
+      </w:r>
+    </w:p>
+    <w:p>
+      <w:pPr>
+        <w:pStyle w:val="normal1"/>
+        <w:numPr>
+          <w:ilvl w:val="2"/>
+          <w:numId w:val="1"/>
+        </w:numPr>
+        <w:ind w:hanging="360" w:left="2160"/>
+        <w:rPr/>
+      </w:pPr>
+      <w:r>
+        <w:rPr/>
+        <w:t>page={page_num}</w:t>
+      </w:r>
+    </w:p>
+    <w:p>
+      <w:pPr>
+        <w:pStyle w:val="normal1"/>
+        <w:numPr>
+          <w:ilvl w:val="3"/>
+          <w:numId w:val="1"/>
+        </w:numPr>
+        <w:ind w:hanging="360" w:left="2880"/>
+        <w:rPr>
+          <w:color w:val="FF0000"/>
+        </w:rPr>
+      </w:pPr>
+      <w:r>
+        <w:rPr>
+          <w:color w:val="FF0000"/>
+        </w:rPr>
+        <w:t>Required</w:t>
+      </w:r>
+    </w:p>
+    <w:p>
+      <w:pPr>
+        <w:pStyle w:val="normal1"/>
+        <w:numPr>
+          <w:ilvl w:val="3"/>
+          <w:numId w:val="1"/>
+        </w:numPr>
+        <w:ind w:hanging="360" w:left="2880"/>
+        <w:rPr/>
+      </w:pPr>
+      <w:r>
+        <w:rPr/>
+        <w:t>Defines which page to return</w:t>
+      </w:r>
+    </w:p>
+    <w:p>
+      <w:pPr>
+        <w:pStyle w:val="normal1"/>
+        <w:numPr>
+          <w:ilvl w:val="3"/>
+          <w:numId w:val="1"/>
+        </w:numPr>
+        <w:ind w:hanging="360" w:left="2880"/>
+        <w:rPr/>
+      </w:pPr>
+      <w:r>
+        <w:rPr/>
+        <w:t>First page = 0 (zero)</w:t>
+      </w:r>
+    </w:p>
+    <w:p>
+      <w:pPr>
+        <w:pStyle w:val="normal1"/>
+        <w:numPr>
+          <w:ilvl w:val="2"/>
+          <w:numId w:val="1"/>
+        </w:numPr>
+        <w:ind w:hanging="360" w:left="2160"/>
+        <w:rPr/>
+      </w:pPr>
+      <w:r>
+        <w:rPr/>
+        <w:t>page_size={num_of_rows}</w:t>
+      </w:r>
+    </w:p>
+    <w:p>
+      <w:pPr>
+        <w:pStyle w:val="normal1"/>
+        <w:numPr>
+          <w:ilvl w:val="3"/>
+          <w:numId w:val="1"/>
+        </w:numPr>
+        <w:ind w:hanging="360" w:left="2880"/>
+        <w:rPr>
+          <w:color w:val="FF0000"/>
+        </w:rPr>
+      </w:pPr>
+      <w:r>
+        <w:rPr>
+          <w:color w:val="FF0000"/>
+        </w:rPr>
+        <w:t>Required</w:t>
+      </w:r>
+    </w:p>
+    <w:p>
+      <w:pPr>
+        <w:pStyle w:val="normal1"/>
+        <w:widowControl/>
+        <w:numPr>
+          <w:ilvl w:val="3"/>
+          <w:numId w:val="1"/>
+        </w:numPr>
+        <w:suppressAutoHyphens w:val="true"/>
+        <w:bidi w:val="0"/>
+        <w:spacing w:lineRule="auto" w:line="276" w:before="0" w:after="0"/>
+        <w:ind w:hanging="360" w:left="2880" w:right="0"/>
+        <w:jc w:val="left"/>
+        <w:rPr/>
+      </w:pPr>
+      <w:r>
+        <w:rPr/>
+        <w:t>Defines how many rows to return for the selected page</w:t>
+      </w:r>
+    </w:p>
+    <w:p>
+      <w:pPr>
+        <w:pStyle w:val="normal1"/>
+        <w:widowControl/>
+        <w:numPr>
+          <w:ilvl w:val="1"/>
+          <w:numId w:val="1"/>
+        </w:numPr>
+        <w:suppressAutoHyphens w:val="true"/>
+        <w:bidi w:val="0"/>
+        <w:spacing w:lineRule="auto" w:line="276" w:before="0" w:after="0"/>
+        <w:ind w:hanging="360" w:left="1440" w:right="0"/>
+        <w:jc w:val="left"/>
+        <w:rPr>
+          <w:b w:val="false"/>
+          <w:bCs w:val="false"/>
+        </w:rPr>
+      </w:pPr>
+      <w:r>
+        <w:rPr>
+          <w:b w:val="false"/>
+          <w:bCs w:val="false"/>
+          <w:color w:val="000000"/>
+        </w:rPr>
+        <w:t>returns:</w:t>
+      </w:r>
+    </w:p>
+    <w:p>
+      <w:pPr>
+        <w:pStyle w:val="normal1"/>
+        <w:numPr>
+          <w:ilvl w:val="0"/>
+          <w:numId w:val="1"/>
+        </w:numPr>
+        <w:ind w:hanging="360" w:left="720"/>
+        <w:rPr/>
+      </w:pPr>
+      <w:r>
+        <w:rPr/>
+        <w:t xml:space="preserve">GET Games where User is ContentJudge </w:t>
+      </w:r>
+      <w:r>
+        <w:rPr/>
+        <w:t>(*Enriched)</w:t>
+      </w:r>
+    </w:p>
+    <w:p>
+      <w:pPr>
+        <w:pStyle w:val="normal1"/>
+        <w:numPr>
+          <w:ilvl w:val="1"/>
+          <w:numId w:val="1"/>
+        </w:numPr>
+        <w:ind w:hanging="360" w:left="1440"/>
+        <w:rPr/>
+      </w:pPr>
+      <w:r>
+        <w:rPr/>
+        <w:t xml:space="preserve">built_including_tests: </w:t>
+      </w:r>
+      <w:r>
+        <w:rPr>
+          <w:b/>
+          <w:bCs/>
+        </w:rPr>
+        <w:t>true</w:t>
+      </w:r>
+    </w:p>
+    <w:p>
+      <w:pPr>
+        <w:pStyle w:val="normal1"/>
+        <w:numPr>
+          <w:ilvl w:val="1"/>
+          <w:numId w:val="1"/>
+        </w:numPr>
+        <w:ind w:hanging="360" w:left="1440"/>
+        <w:rPr/>
+      </w:pPr>
+      <w:r>
+        <w:rPr/>
+        <w:t>HTTP method: ‘GET’</w:t>
+      </w:r>
+    </w:p>
+    <w:p>
+      <w:pPr>
+        <w:pStyle w:val="normal1"/>
+        <w:numPr>
+          <w:ilvl w:val="1"/>
+          <w:numId w:val="1"/>
+        </w:numPr>
+        <w:ind w:hanging="360" w:left="1440"/>
+        <w:rPr/>
+      </w:pPr>
+      <w:r>
+        <w:rPr/>
+        <w:t>endpoint: {base_uri}/api/users/{id}/games-where-contentjudge-enriched?page={page_num}&amp;page_size={num_of_rows}</w:t>
       </w:r>
     </w:p>
     <w:p>
@@ -26367,7 +26932,10 @@
         </w:rPr>
       </w:pPr>
       <w:r>
-        <w:rPr/>
+        <w:rPr>
+          <w:b/>
+          <w:bCs/>
+        </w:rPr>
       </w:r>
     </w:p>
     <w:p>
@@ -26385,7 +26953,10 @@
         </w:rPr>
       </w:pPr>
       <w:r>
-        <w:rPr/>
+        <w:rPr>
+          <w:b/>
+          <w:bCs/>
+        </w:rPr>
       </w:r>
     </w:p>
     <w:p>
@@ -27911,7 +28482,11 @@
         </w:rPr>
       </w:pPr>
       <w:r>
-        <w:rPr/>
+        <w:rPr>
+          <w:b/>
+          <w:bCs/>
+          <w:color w:val="000000"/>
+        </w:rPr>
       </w:r>
     </w:p>
     <w:p>
@@ -27930,7 +28505,11 @@
         </w:rPr>
       </w:pPr>
       <w:r>
-        <w:rPr/>
+        <w:rPr>
+          <w:b/>
+          <w:bCs/>
+          <w:color w:val="000000"/>
+        </w:rPr>
       </w:r>
     </w:p>
     <w:p>
@@ -27965,23 +28544,7 @@
       </w:pPr>
       <w:r>
         <w:rPr/>
-        <w:t xml:space="preserve">GET </w:t>
-      </w:r>
-      <w:r>
-        <w:rPr/>
-        <w:t>Role</w:t>
-      </w:r>
-      <w:r>
-        <w:rPr/>
-        <w:t>Permissions</w:t>
-      </w:r>
-      <w:r>
-        <w:rPr/>
-        <w:t xml:space="preserve"> of </w:t>
-      </w:r>
-      <w:r>
-        <w:rPr/>
-        <w:t>Role</w:t>
+        <w:t>GET RolePermissions of Role</w:t>
       </w:r>
     </w:p>
     <w:p>
@@ -28033,19 +28596,7 @@
       </w:pPr>
       <w:r>
         <w:rPr/>
-        <w:t>endpoint: {base_uri}/api/</w:t>
-      </w:r>
-      <w:r>
-        <w:rPr/>
-        <w:t>roles</w:t>
-      </w:r>
-      <w:r>
-        <w:rPr/>
-        <w:t>/{id}/</w:t>
-      </w:r>
-      <w:r>
-        <w:rPr/>
-        <w:t>permissions</w:t>
+        <w:t>endpoint: {base_uri}/api/roles/{id}/permissions</w:t>
       </w:r>
     </w:p>
     <w:p>
@@ -28124,23 +28675,7 @@
       </w:pPr>
       <w:r>
         <w:rPr/>
-        <w:t xml:space="preserve">ID of the </w:t>
-      </w:r>
-      <w:r>
-        <w:rPr/>
-        <w:t>Role</w:t>
-      </w:r>
-      <w:r>
-        <w:rPr/>
-        <w:t xml:space="preserve"> to receive </w:t>
-      </w:r>
-      <w:r>
-        <w:rPr/>
-        <w:t>Role</w:t>
-      </w:r>
-      <w:r>
-        <w:rPr/>
-        <w:t>Permissions about</w:t>
+        <w:t>ID of the Role to receive RolePermissions about</w:t>
       </w:r>
     </w:p>
     <w:p>
@@ -28179,15 +28714,7 @@
           <w:bCs w:val="false"/>
           <w:color w:val="000000"/>
         </w:rPr>
-        <w:t xml:space="preserve">an array of </w:t>
-      </w:r>
-      <w:r>
-        <w:rPr>
-          <w:b w:val="false"/>
-          <w:bCs w:val="false"/>
-          <w:color w:val="000000"/>
-        </w:rPr>
-        <w:t>RolePermissions</w:t>
+        <w:t>an array of RolePermissions</w:t>
       </w:r>
     </w:p>
     <w:p>
@@ -28202,11 +28729,7 @@
       </w:pPr>
       <w:r>
         <w:rPr/>
-        <w:t>POST/Create Role</w:t>
-      </w:r>
-      <w:r>
-        <w:rPr/>
-        <w:t>Permission</w:t>
+        <w:t>POST/Create RolePermission</w:t>
       </w:r>
     </w:p>
     <w:p>
@@ -28357,23 +28880,7 @@
       </w:pPr>
       <w:r>
         <w:rPr/>
-        <w:t>DELETE Role</w:t>
-      </w:r>
-      <w:r>
-        <w:rPr/>
-        <w:t>Permission</w:t>
-      </w:r>
-      <w:r>
-        <w:rPr/>
-        <w:t xml:space="preserve"> (by ID</w:t>
-      </w:r>
-      <w:r>
-        <w:rPr/>
-        <w:t>s</w:t>
-      </w:r>
-      <w:r>
-        <w:rPr/>
-        <w:t>)</w:t>
+        <w:t>DELETE RolePermission (by IDs)</w:t>
       </w:r>
     </w:p>
     <w:p>
@@ -28596,7 +29103,11 @@
         </w:rPr>
       </w:pPr>
       <w:r>
-        <w:rPr/>
+        <w:rPr>
+          <w:b/>
+          <w:bCs/>
+          <w:color w:val="000000"/>
+        </w:rPr>
       </w:r>
     </w:p>
     <w:p>
@@ -28615,7 +29126,11 @@
         </w:rPr>
       </w:pPr>
       <w:r>
-        <w:rPr/>
+        <w:rPr>
+          <w:b/>
+          <w:bCs/>
+          <w:color w:val="000000"/>
+        </w:rPr>
       </w:r>
     </w:p>
     <w:p>
@@ -28634,7 +29149,11 @@
         </w:rPr>
       </w:pPr>
       <w:r>
-        <w:rPr/>
+        <w:rPr>
+          <w:b/>
+          <w:bCs/>
+          <w:color w:val="000000"/>
+        </w:rPr>
       </w:r>
     </w:p>
     <w:p>
@@ -35948,47 +36467,54 @@
           <w:numId w:val="1"/>
         </w:numPr>
         <w:ind w:hanging="360" w:left="1440"/>
-        <w:rPr/>
-      </w:pPr>
-      <w:r>
-        <w:rPr/>
-        <w:t xml:space="preserve">returns: </w:t>
-      </w:r>
-    </w:p>
-    <w:p>
-      <w:pPr>
-        <w:pStyle w:val="normal1"/>
-        <w:numPr>
-          <w:ilvl w:val="0"/>
-          <w:numId w:val="1"/>
-        </w:numPr>
-        <w:ind w:hanging="360" w:left="720"/>
-        <w:rPr/>
-      </w:pPr>
-      <w:r>
-        <w:rPr/>
-        <w:t>GET Teams where User is Quizzer</w:t>
-      </w:r>
-    </w:p>
-    <w:p>
-      <w:pPr>
-        <w:pStyle w:val="normal1"/>
-        <w:numPr>
-          <w:ilvl w:val="1"/>
-          <w:numId w:val="1"/>
-        </w:numPr>
-        <w:ind w:hanging="360" w:left="1440"/>
-        <w:rPr/>
-      </w:pPr>
-      <w:r>
-        <w:rPr/>
-        <w:t xml:space="preserve">built_including_tests: </w:t>
-      </w:r>
-      <w:r>
         <w:rPr>
           <w:b/>
           <w:bCs/>
         </w:rPr>
+      </w:pPr>
+      <w:r>
+        <w:rPr/>
+        <w:t xml:space="preserve">returns: </w:t>
+      </w:r>
+    </w:p>
+    <w:p>
+      <w:pPr>
+        <w:pStyle w:val="normal1"/>
+        <w:numPr>
+          <w:ilvl w:val="0"/>
+          <w:numId w:val="1"/>
+        </w:numPr>
+        <w:ind w:hanging="360" w:left="720"/>
+        <w:rPr/>
+      </w:pPr>
+      <w:r>
+        <w:rPr/>
+        <w:t xml:space="preserve">GET Teams where User is Coach </w:t>
+      </w:r>
+      <w:r>
+        <w:rPr/>
+        <w:t>(Enriched)</w:t>
+      </w:r>
+    </w:p>
+    <w:p>
+      <w:pPr>
+        <w:pStyle w:val="normal1"/>
+        <w:numPr>
+          <w:ilvl w:val="1"/>
+          <w:numId w:val="1"/>
+        </w:numPr>
+        <w:ind w:hanging="360" w:left="1440"/>
+        <w:rPr/>
+      </w:pPr>
+      <w:r>
+        <w:rPr/>
+        <w:t xml:space="preserve">built_including_tests: </w:t>
+      </w:r>
+      <w:r>
+        <w:rPr>
+          <w:b/>
+          <w:bCs/>
+        </w:rPr>
         <w:t>true</w:t>
       </w:r>
     </w:p>
@@ -36019,7 +36545,7 @@
       </w:pPr>
       <w:r>
         <w:rPr/>
-        <w:t>endpoint: {base_uri}/api/users/{id}/teams-where-quizzer?page={page_num}&amp;page_size={num_of_rows}</w:t>
+        <w:t>endpoint: {base_uri}/api/users/{id}/teams-where-coach-enriched?page={page_num}&amp;page_size={num_of_rows}</w:t>
       </w:r>
     </w:p>
     <w:p>
@@ -36204,7 +36730,7 @@
         <w:pStyle w:val="normal1"/>
         <w:widowControl/>
         <w:numPr>
-          <w:ilvl w:val="3"/>
+          <w:ilvl w:val="6"/>
           <w:numId w:val="1"/>
         </w:numPr>
         <w:suppressAutoHyphens w:val="true"/>
@@ -36222,6 +36748,305 @@
     <w:p>
       <w:pPr>
         <w:pStyle w:val="normal1"/>
+        <w:numPr>
+          <w:ilvl w:val="1"/>
+          <w:numId w:val="1"/>
+        </w:numPr>
+        <w:ind w:hanging="360" w:left="1440"/>
+        <w:rPr/>
+      </w:pPr>
+      <w:r>
+        <w:rPr/>
+        <w:t xml:space="preserve">returns: </w:t>
+      </w:r>
+    </w:p>
+    <w:p>
+      <w:pPr>
+        <w:pStyle w:val="normal1"/>
+        <w:widowControl/>
+        <w:numPr>
+          <w:ilvl w:val="2"/>
+          <w:numId w:val="1"/>
+        </w:numPr>
+        <w:suppressAutoHyphens w:val="true"/>
+        <w:bidi w:val="0"/>
+        <w:spacing w:lineRule="auto" w:line="276" w:before="0" w:after="0"/>
+        <w:ind w:hanging="360" w:left="2160" w:right="0"/>
+        <w:jc w:val="left"/>
+        <w:rPr/>
+      </w:pPr>
+      <w:r>
+        <w:rPr/>
+        <w:t>array of TeamWithTournamentInfo</w:t>
+      </w:r>
+    </w:p>
+    <w:p>
+      <w:pPr>
+        <w:pStyle w:val="normal1"/>
+        <w:numPr>
+          <w:ilvl w:val="0"/>
+          <w:numId w:val="1"/>
+        </w:numPr>
+        <w:ind w:hanging="360" w:left="720"/>
+        <w:rPr/>
+      </w:pPr>
+      <w:r>
+        <w:rPr/>
+        <w:t>GET Teams where User is Quizzer</w:t>
+      </w:r>
+    </w:p>
+    <w:p>
+      <w:pPr>
+        <w:pStyle w:val="normal1"/>
+        <w:numPr>
+          <w:ilvl w:val="1"/>
+          <w:numId w:val="1"/>
+        </w:numPr>
+        <w:ind w:hanging="360" w:left="1440"/>
+        <w:rPr/>
+      </w:pPr>
+      <w:r>
+        <w:rPr/>
+        <w:t xml:space="preserve">built_including_tests: </w:t>
+      </w:r>
+      <w:r>
+        <w:rPr>
+          <w:b/>
+          <w:bCs/>
+        </w:rPr>
+        <w:t>true</w:t>
+      </w:r>
+    </w:p>
+    <w:p>
+      <w:pPr>
+        <w:pStyle w:val="normal1"/>
+        <w:numPr>
+          <w:ilvl w:val="1"/>
+          <w:numId w:val="1"/>
+        </w:numPr>
+        <w:ind w:hanging="360" w:left="1440"/>
+        <w:rPr/>
+      </w:pPr>
+      <w:r>
+        <w:rPr/>
+        <w:t>HTTP method: ‘GET’</w:t>
+      </w:r>
+    </w:p>
+    <w:p>
+      <w:pPr>
+        <w:pStyle w:val="normal1"/>
+        <w:numPr>
+          <w:ilvl w:val="1"/>
+          <w:numId w:val="1"/>
+        </w:numPr>
+        <w:ind w:hanging="360" w:left="1440"/>
+        <w:rPr/>
+      </w:pPr>
+      <w:r>
+        <w:rPr/>
+        <w:t>endpoint: {base_uri}/api/users/{id}/teams-where-quizzer?page={page_num}&amp;page_size={num_of_rows}</w:t>
+      </w:r>
+    </w:p>
+    <w:p>
+      <w:pPr>
+        <w:pStyle w:val="normal1"/>
+        <w:numPr>
+          <w:ilvl w:val="1"/>
+          <w:numId w:val="1"/>
+        </w:numPr>
+        <w:ind w:hanging="360" w:left="1440"/>
+        <w:rPr/>
+      </w:pPr>
+      <w:r>
+        <w:rPr/>
+        <w:t xml:space="preserve">description: </w:t>
+      </w:r>
+    </w:p>
+    <w:p>
+      <w:pPr>
+        <w:pStyle w:val="normal1"/>
+        <w:numPr>
+          <w:ilvl w:val="1"/>
+          <w:numId w:val="1"/>
+        </w:numPr>
+        <w:ind w:hanging="360" w:left="1440"/>
+        <w:rPr/>
+      </w:pPr>
+      <w:r>
+        <w:rPr/>
+        <w:t>parameters:</w:t>
+      </w:r>
+    </w:p>
+    <w:p>
+      <w:pPr>
+        <w:pStyle w:val="normal1"/>
+        <w:numPr>
+          <w:ilvl w:val="2"/>
+          <w:numId w:val="1"/>
+        </w:numPr>
+        <w:ind w:hanging="360" w:left="2160"/>
+        <w:rPr/>
+      </w:pPr>
+      <w:r>
+        <w:rPr/>
+        <w:t>id</w:t>
+      </w:r>
+    </w:p>
+    <w:p>
+      <w:pPr>
+        <w:pStyle w:val="normal1"/>
+        <w:numPr>
+          <w:ilvl w:val="3"/>
+          <w:numId w:val="1"/>
+        </w:numPr>
+        <w:ind w:hanging="360" w:left="2880"/>
+        <w:rPr>
+          <w:color w:val="FF0000"/>
+        </w:rPr>
+      </w:pPr>
+      <w:r>
+        <w:rPr>
+          <w:color w:val="FF0000"/>
+        </w:rPr>
+        <w:t>Required</w:t>
+      </w:r>
+    </w:p>
+    <w:p>
+      <w:pPr>
+        <w:pStyle w:val="normal1"/>
+        <w:numPr>
+          <w:ilvl w:val="3"/>
+          <w:numId w:val="1"/>
+        </w:numPr>
+        <w:ind w:hanging="360" w:left="2880"/>
+        <w:rPr/>
+      </w:pPr>
+      <w:r>
+        <w:rPr/>
+        <w:t>ID of the User</w:t>
+      </w:r>
+    </w:p>
+    <w:p>
+      <w:pPr>
+        <w:pStyle w:val="normal1"/>
+        <w:numPr>
+          <w:ilvl w:val="2"/>
+          <w:numId w:val="1"/>
+        </w:numPr>
+        <w:ind w:hanging="360" w:left="2160"/>
+        <w:rPr/>
+      </w:pPr>
+      <w:r>
+        <w:rPr/>
+        <w:t>page={page_num}</w:t>
+      </w:r>
+    </w:p>
+    <w:p>
+      <w:pPr>
+        <w:pStyle w:val="normal1"/>
+        <w:numPr>
+          <w:ilvl w:val="3"/>
+          <w:numId w:val="1"/>
+        </w:numPr>
+        <w:ind w:hanging="360" w:left="2880"/>
+        <w:rPr>
+          <w:color w:val="FF0000"/>
+        </w:rPr>
+      </w:pPr>
+      <w:r>
+        <w:rPr>
+          <w:color w:val="FF0000"/>
+        </w:rPr>
+        <w:t>Required</w:t>
+      </w:r>
+    </w:p>
+    <w:p>
+      <w:pPr>
+        <w:pStyle w:val="normal1"/>
+        <w:numPr>
+          <w:ilvl w:val="3"/>
+          <w:numId w:val="1"/>
+        </w:numPr>
+        <w:ind w:hanging="360" w:left="2880"/>
+        <w:rPr/>
+      </w:pPr>
+      <w:r>
+        <w:rPr/>
+        <w:t>Defines which page to return</w:t>
+      </w:r>
+    </w:p>
+    <w:p>
+      <w:pPr>
+        <w:pStyle w:val="normal1"/>
+        <w:numPr>
+          <w:ilvl w:val="3"/>
+          <w:numId w:val="1"/>
+        </w:numPr>
+        <w:ind w:hanging="360" w:left="2880"/>
+        <w:rPr/>
+      </w:pPr>
+      <w:r>
+        <w:rPr/>
+        <w:t>First page = 0 (zero)</w:t>
+      </w:r>
+    </w:p>
+    <w:p>
+      <w:pPr>
+        <w:pStyle w:val="normal1"/>
+        <w:numPr>
+          <w:ilvl w:val="2"/>
+          <w:numId w:val="1"/>
+        </w:numPr>
+        <w:ind w:hanging="360" w:left="2160"/>
+        <w:rPr/>
+      </w:pPr>
+      <w:r>
+        <w:rPr/>
+        <w:t>page_size={num_of_rows}</w:t>
+      </w:r>
+    </w:p>
+    <w:p>
+      <w:pPr>
+        <w:pStyle w:val="normal1"/>
+        <w:numPr>
+          <w:ilvl w:val="3"/>
+          <w:numId w:val="1"/>
+        </w:numPr>
+        <w:ind w:hanging="360" w:left="2880"/>
+        <w:rPr>
+          <w:color w:val="FF0000"/>
+        </w:rPr>
+      </w:pPr>
+      <w:r>
+        <w:rPr>
+          <w:color w:val="FF0000"/>
+        </w:rPr>
+        <w:t>Required</w:t>
+      </w:r>
+    </w:p>
+    <w:p>
+      <w:pPr>
+        <w:pStyle w:val="normal1"/>
+        <w:widowControl/>
+        <w:numPr>
+          <w:ilvl w:val="3"/>
+          <w:numId w:val="1"/>
+        </w:numPr>
+        <w:suppressAutoHyphens w:val="true"/>
+        <w:bidi w:val="0"/>
+        <w:spacing w:lineRule="auto" w:line="276" w:before="0" w:after="0"/>
+        <w:ind w:hanging="360" w:left="2880" w:right="0"/>
+        <w:jc w:val="left"/>
+        <w:rPr/>
+      </w:pPr>
+      <w:r>
+        <w:rPr/>
+        <w:t>Defines how many rows to return for the selected page</w:t>
+      </w:r>
+    </w:p>
+    <w:p>
+      <w:pPr>
+        <w:pStyle w:val="normal1"/>
         <w:widowControl/>
         <w:numPr>
           <w:ilvl w:val="1"/>
@@ -36241,6 +37066,322 @@
           <w:color w:val="000000"/>
         </w:rPr>
         <w:t xml:space="preserve">returns: </w:t>
+      </w:r>
+    </w:p>
+    <w:p>
+      <w:pPr>
+        <w:pStyle w:val="normal1"/>
+        <w:numPr>
+          <w:ilvl w:val="0"/>
+          <w:numId w:val="1"/>
+        </w:numPr>
+        <w:ind w:hanging="360" w:left="720"/>
+        <w:rPr/>
+      </w:pPr>
+      <w:r>
+        <w:rPr/>
+        <w:t xml:space="preserve">GET Teams where User is Quizzer </w:t>
+      </w:r>
+      <w:r>
+        <w:rPr/>
+        <w:t>(Enriched)</w:t>
+      </w:r>
+    </w:p>
+    <w:p>
+      <w:pPr>
+        <w:pStyle w:val="normal1"/>
+        <w:numPr>
+          <w:ilvl w:val="1"/>
+          <w:numId w:val="1"/>
+        </w:numPr>
+        <w:ind w:hanging="360" w:left="1440"/>
+        <w:rPr/>
+      </w:pPr>
+      <w:r>
+        <w:rPr/>
+        <w:t xml:space="preserve">built_including_tests: </w:t>
+      </w:r>
+      <w:r>
+        <w:rPr>
+          <w:b/>
+          <w:bCs/>
+        </w:rPr>
+        <w:t>true</w:t>
+      </w:r>
+    </w:p>
+    <w:p>
+      <w:pPr>
+        <w:pStyle w:val="normal1"/>
+        <w:numPr>
+          <w:ilvl w:val="1"/>
+          <w:numId w:val="1"/>
+        </w:numPr>
+        <w:ind w:hanging="360" w:left="1440"/>
+        <w:rPr/>
+      </w:pPr>
+      <w:r>
+        <w:rPr/>
+        <w:t>HTTP method: ‘GET’</w:t>
+      </w:r>
+    </w:p>
+    <w:p>
+      <w:pPr>
+        <w:pStyle w:val="normal1"/>
+        <w:numPr>
+          <w:ilvl w:val="1"/>
+          <w:numId w:val="1"/>
+        </w:numPr>
+        <w:ind w:hanging="360" w:left="1440"/>
+        <w:rPr/>
+      </w:pPr>
+      <w:r>
+        <w:rPr/>
+        <w:t>endpoint: {base_uri}/api/users/{id}/teams-where-quizzer-enriched?page={page_num}&amp;page_size={num_of_rows}</w:t>
+      </w:r>
+    </w:p>
+    <w:p>
+      <w:pPr>
+        <w:pStyle w:val="normal1"/>
+        <w:numPr>
+          <w:ilvl w:val="1"/>
+          <w:numId w:val="1"/>
+        </w:numPr>
+        <w:ind w:hanging="360" w:left="1440"/>
+        <w:rPr/>
+      </w:pPr>
+      <w:r>
+        <w:rPr/>
+        <w:t xml:space="preserve">description: </w:t>
+      </w:r>
+    </w:p>
+    <w:p>
+      <w:pPr>
+        <w:pStyle w:val="normal1"/>
+        <w:numPr>
+          <w:ilvl w:val="1"/>
+          <w:numId w:val="1"/>
+        </w:numPr>
+        <w:ind w:hanging="360" w:left="1440"/>
+        <w:rPr/>
+      </w:pPr>
+      <w:r>
+        <w:rPr/>
+        <w:t>parameters:</w:t>
+      </w:r>
+    </w:p>
+    <w:p>
+      <w:pPr>
+        <w:pStyle w:val="normal1"/>
+        <w:numPr>
+          <w:ilvl w:val="2"/>
+          <w:numId w:val="1"/>
+        </w:numPr>
+        <w:ind w:hanging="360" w:left="2160"/>
+        <w:rPr/>
+      </w:pPr>
+      <w:r>
+        <w:rPr/>
+        <w:t>id</w:t>
+      </w:r>
+    </w:p>
+    <w:p>
+      <w:pPr>
+        <w:pStyle w:val="normal1"/>
+        <w:numPr>
+          <w:ilvl w:val="3"/>
+          <w:numId w:val="1"/>
+        </w:numPr>
+        <w:ind w:hanging="360" w:left="2880"/>
+        <w:rPr>
+          <w:color w:val="FF0000"/>
+        </w:rPr>
+      </w:pPr>
+      <w:r>
+        <w:rPr>
+          <w:color w:val="FF0000"/>
+        </w:rPr>
+        <w:t>Required</w:t>
+      </w:r>
+    </w:p>
+    <w:p>
+      <w:pPr>
+        <w:pStyle w:val="normal1"/>
+        <w:numPr>
+          <w:ilvl w:val="3"/>
+          <w:numId w:val="1"/>
+        </w:numPr>
+        <w:ind w:hanging="360" w:left="2880"/>
+        <w:rPr/>
+      </w:pPr>
+      <w:r>
+        <w:rPr/>
+        <w:t>ID of the User</w:t>
+      </w:r>
+    </w:p>
+    <w:p>
+      <w:pPr>
+        <w:pStyle w:val="normal1"/>
+        <w:numPr>
+          <w:ilvl w:val="2"/>
+          <w:numId w:val="1"/>
+        </w:numPr>
+        <w:ind w:hanging="360" w:left="2160"/>
+        <w:rPr/>
+      </w:pPr>
+      <w:r>
+        <w:rPr/>
+        <w:t>page={page_num}</w:t>
+      </w:r>
+    </w:p>
+    <w:p>
+      <w:pPr>
+        <w:pStyle w:val="normal1"/>
+        <w:numPr>
+          <w:ilvl w:val="3"/>
+          <w:numId w:val="1"/>
+        </w:numPr>
+        <w:ind w:hanging="360" w:left="2880"/>
+        <w:rPr>
+          <w:color w:val="FF0000"/>
+        </w:rPr>
+      </w:pPr>
+      <w:r>
+        <w:rPr>
+          <w:color w:val="FF0000"/>
+        </w:rPr>
+        <w:t>Required</w:t>
+      </w:r>
+    </w:p>
+    <w:p>
+      <w:pPr>
+        <w:pStyle w:val="normal1"/>
+        <w:numPr>
+          <w:ilvl w:val="3"/>
+          <w:numId w:val="1"/>
+        </w:numPr>
+        <w:ind w:hanging="360" w:left="2880"/>
+        <w:rPr/>
+      </w:pPr>
+      <w:r>
+        <w:rPr/>
+        <w:t>Defines which page to return</w:t>
+      </w:r>
+    </w:p>
+    <w:p>
+      <w:pPr>
+        <w:pStyle w:val="normal1"/>
+        <w:numPr>
+          <w:ilvl w:val="3"/>
+          <w:numId w:val="1"/>
+        </w:numPr>
+        <w:ind w:hanging="360" w:left="2880"/>
+        <w:rPr/>
+      </w:pPr>
+      <w:r>
+        <w:rPr/>
+        <w:t>First page = 0 (zero)</w:t>
+      </w:r>
+    </w:p>
+    <w:p>
+      <w:pPr>
+        <w:pStyle w:val="normal1"/>
+        <w:numPr>
+          <w:ilvl w:val="2"/>
+          <w:numId w:val="1"/>
+        </w:numPr>
+        <w:ind w:hanging="360" w:left="2160"/>
+        <w:rPr/>
+      </w:pPr>
+      <w:r>
+        <w:rPr/>
+        <w:t>page_size={num_of_rows}</w:t>
+      </w:r>
+    </w:p>
+    <w:p>
+      <w:pPr>
+        <w:pStyle w:val="normal1"/>
+        <w:numPr>
+          <w:ilvl w:val="3"/>
+          <w:numId w:val="1"/>
+        </w:numPr>
+        <w:ind w:hanging="360" w:left="2880"/>
+        <w:rPr>
+          <w:color w:val="FF0000"/>
+        </w:rPr>
+      </w:pPr>
+      <w:r>
+        <w:rPr>
+          <w:color w:val="FF0000"/>
+        </w:rPr>
+        <w:t>Required</w:t>
+      </w:r>
+    </w:p>
+    <w:p>
+      <w:pPr>
+        <w:pStyle w:val="normal1"/>
+        <w:widowControl/>
+        <w:numPr>
+          <w:ilvl w:val="3"/>
+          <w:numId w:val="1"/>
+        </w:numPr>
+        <w:suppressAutoHyphens w:val="true"/>
+        <w:bidi w:val="0"/>
+        <w:spacing w:lineRule="auto" w:line="276" w:before="0" w:after="0"/>
+        <w:ind w:hanging="360" w:left="2880" w:right="0"/>
+        <w:jc w:val="left"/>
+        <w:rPr/>
+      </w:pPr>
+      <w:r>
+        <w:rPr/>
+        <w:t>Defines how many rows to return for the selected page</w:t>
+      </w:r>
+    </w:p>
+    <w:p>
+      <w:pPr>
+        <w:pStyle w:val="normal1"/>
+        <w:widowControl/>
+        <w:numPr>
+          <w:ilvl w:val="1"/>
+          <w:numId w:val="1"/>
+        </w:numPr>
+        <w:suppressAutoHyphens w:val="true"/>
+        <w:bidi w:val="0"/>
+        <w:spacing w:lineRule="auto" w:line="276" w:before="0" w:after="0"/>
+        <w:ind w:hanging="360" w:left="1440" w:right="0"/>
+        <w:jc w:val="left"/>
+        <w:rPr/>
+      </w:pPr>
+      <w:r>
+        <w:rPr>
+          <w:b w:val="false"/>
+          <w:bCs w:val="false"/>
+          <w:color w:val="000000"/>
+        </w:rPr>
+        <w:t xml:space="preserve">returns: </w:t>
+      </w:r>
+    </w:p>
+    <w:p>
+      <w:pPr>
+        <w:pStyle w:val="normal1"/>
+        <w:widowControl/>
+        <w:numPr>
+          <w:ilvl w:val="2"/>
+          <w:numId w:val="1"/>
+        </w:numPr>
+        <w:suppressAutoHyphens w:val="true"/>
+        <w:bidi w:val="0"/>
+        <w:spacing w:lineRule="auto" w:line="276" w:before="0" w:after="0"/>
+        <w:ind w:hanging="360" w:left="2160" w:right="0"/>
+        <w:jc w:val="left"/>
+        <w:rPr/>
+      </w:pPr>
+      <w:r>
+        <w:rPr>
+          <w:b w:val="false"/>
+          <w:bCs w:val="false"/>
+          <w:color w:val="000000"/>
+        </w:rPr>
+        <w:t>array of TeamWithTournamentInfo</w:t>
       </w:r>
     </w:p>
     <w:p>
@@ -39732,6 +40873,311 @@
     <w:p>
       <w:pPr>
         <w:pStyle w:val="normal1"/>
+        <w:widowControl/>
+        <w:numPr>
+          <w:ilvl w:val="0"/>
+          <w:numId w:val="1"/>
+        </w:numPr>
+        <w:suppressAutoHyphens w:val="true"/>
+        <w:bidi w:val="0"/>
+        <w:spacing w:lineRule="auto" w:line="276" w:before="0" w:after="0"/>
+        <w:ind w:hanging="360" w:left="720" w:right="0"/>
+        <w:jc w:val="left"/>
+        <w:rPr/>
+      </w:pPr>
+      <w:r>
+        <w:rPr>
+          <w:b w:val="false"/>
+          <w:bCs w:val="false"/>
+          <w:color w:val="000000"/>
+        </w:rPr>
+        <w:t xml:space="preserve">GET Tournaments where User is Admin </w:t>
+      </w:r>
+      <w:r>
+        <w:rPr>
+          <w:b w:val="false"/>
+          <w:bCs w:val="false"/>
+          <w:color w:val="000000"/>
+        </w:rPr>
+        <w:t>OR [Tournament] Owner</w:t>
+      </w:r>
+    </w:p>
+    <w:p>
+      <w:pPr>
+        <w:pStyle w:val="normal1"/>
+        <w:numPr>
+          <w:ilvl w:val="1"/>
+          <w:numId w:val="1"/>
+        </w:numPr>
+        <w:ind w:hanging="360" w:left="1440"/>
+        <w:rPr/>
+      </w:pPr>
+      <w:r>
+        <w:rPr/>
+        <w:t xml:space="preserve">built_including_tests: </w:t>
+      </w:r>
+      <w:r>
+        <w:rPr>
+          <w:b/>
+          <w:bCs/>
+        </w:rPr>
+        <w:t>true</w:t>
+      </w:r>
+    </w:p>
+    <w:p>
+      <w:pPr>
+        <w:pStyle w:val="normal1"/>
+        <w:numPr>
+          <w:ilvl w:val="1"/>
+          <w:numId w:val="1"/>
+        </w:numPr>
+        <w:ind w:hanging="360" w:left="1440"/>
+        <w:rPr/>
+      </w:pPr>
+      <w:r>
+        <w:rPr/>
+        <w:t>HTTP method: ‘GET’</w:t>
+      </w:r>
+    </w:p>
+    <w:p>
+      <w:pPr>
+        <w:pStyle w:val="normal1"/>
+        <w:numPr>
+          <w:ilvl w:val="1"/>
+          <w:numId w:val="1"/>
+        </w:numPr>
+        <w:ind w:hanging="360" w:left="1440"/>
+        <w:rPr/>
+      </w:pPr>
+      <w:r>
+        <w:rPr/>
+        <w:t>endpoint: {base_uri}/api/users/{id}/tournaments-as-admin-or-owner?page={page_num}&amp;page_size={num_of_rows}</w:t>
+      </w:r>
+    </w:p>
+    <w:p>
+      <w:pPr>
+        <w:pStyle w:val="normal1"/>
+        <w:numPr>
+          <w:ilvl w:val="1"/>
+          <w:numId w:val="1"/>
+        </w:numPr>
+        <w:ind w:hanging="360" w:left="1440"/>
+        <w:rPr/>
+      </w:pPr>
+      <w:r>
+        <w:rPr/>
+        <w:t xml:space="preserve">description: </w:t>
+      </w:r>
+    </w:p>
+    <w:p>
+      <w:pPr>
+        <w:pStyle w:val="normal1"/>
+        <w:numPr>
+          <w:ilvl w:val="1"/>
+          <w:numId w:val="1"/>
+        </w:numPr>
+        <w:ind w:hanging="360" w:left="1440"/>
+        <w:rPr/>
+      </w:pPr>
+      <w:r>
+        <w:rPr/>
+        <w:t>parameters:</w:t>
+      </w:r>
+    </w:p>
+    <w:p>
+      <w:pPr>
+        <w:pStyle w:val="normal1"/>
+        <w:numPr>
+          <w:ilvl w:val="2"/>
+          <w:numId w:val="1"/>
+        </w:numPr>
+        <w:ind w:hanging="360" w:left="2160"/>
+        <w:rPr/>
+      </w:pPr>
+      <w:r>
+        <w:rPr/>
+        <w:t>id</w:t>
+      </w:r>
+    </w:p>
+    <w:p>
+      <w:pPr>
+        <w:pStyle w:val="normal1"/>
+        <w:numPr>
+          <w:ilvl w:val="3"/>
+          <w:numId w:val="1"/>
+        </w:numPr>
+        <w:ind w:hanging="360" w:left="2880"/>
+        <w:rPr>
+          <w:color w:val="FF0000"/>
+        </w:rPr>
+      </w:pPr>
+      <w:r>
+        <w:rPr>
+          <w:color w:val="FF0000"/>
+        </w:rPr>
+        <w:t>Required</w:t>
+      </w:r>
+    </w:p>
+    <w:p>
+      <w:pPr>
+        <w:pStyle w:val="normal1"/>
+        <w:numPr>
+          <w:ilvl w:val="3"/>
+          <w:numId w:val="1"/>
+        </w:numPr>
+        <w:ind w:hanging="360" w:left="2880"/>
+        <w:rPr/>
+      </w:pPr>
+      <w:r>
+        <w:rPr/>
+        <w:t>ID of the User</w:t>
+      </w:r>
+    </w:p>
+    <w:p>
+      <w:pPr>
+        <w:pStyle w:val="normal1"/>
+        <w:numPr>
+          <w:ilvl w:val="2"/>
+          <w:numId w:val="1"/>
+        </w:numPr>
+        <w:ind w:hanging="360" w:left="2160"/>
+        <w:rPr/>
+      </w:pPr>
+      <w:r>
+        <w:rPr/>
+        <w:t>page={page_num}</w:t>
+      </w:r>
+    </w:p>
+    <w:p>
+      <w:pPr>
+        <w:pStyle w:val="normal1"/>
+        <w:numPr>
+          <w:ilvl w:val="3"/>
+          <w:numId w:val="1"/>
+        </w:numPr>
+        <w:ind w:hanging="360" w:left="2880"/>
+        <w:rPr>
+          <w:color w:val="FF0000"/>
+        </w:rPr>
+      </w:pPr>
+      <w:r>
+        <w:rPr>
+          <w:color w:val="FF0000"/>
+        </w:rPr>
+        <w:t>Required</w:t>
+      </w:r>
+    </w:p>
+    <w:p>
+      <w:pPr>
+        <w:pStyle w:val="normal1"/>
+        <w:numPr>
+          <w:ilvl w:val="3"/>
+          <w:numId w:val="1"/>
+        </w:numPr>
+        <w:ind w:hanging="360" w:left="2880"/>
+        <w:rPr/>
+      </w:pPr>
+      <w:r>
+        <w:rPr/>
+        <w:t>Defines which page to return</w:t>
+      </w:r>
+    </w:p>
+    <w:p>
+      <w:pPr>
+        <w:pStyle w:val="normal1"/>
+        <w:numPr>
+          <w:ilvl w:val="3"/>
+          <w:numId w:val="1"/>
+        </w:numPr>
+        <w:ind w:hanging="360" w:left="2880"/>
+        <w:rPr/>
+      </w:pPr>
+      <w:r>
+        <w:rPr/>
+        <w:t>First page = 0 (zero)</w:t>
+      </w:r>
+    </w:p>
+    <w:p>
+      <w:pPr>
+        <w:pStyle w:val="normal1"/>
+        <w:numPr>
+          <w:ilvl w:val="2"/>
+          <w:numId w:val="1"/>
+        </w:numPr>
+        <w:ind w:hanging="360" w:left="2160"/>
+        <w:rPr/>
+      </w:pPr>
+      <w:r>
+        <w:rPr/>
+        <w:t>page_size={num_of_rows}</w:t>
+      </w:r>
+    </w:p>
+    <w:p>
+      <w:pPr>
+        <w:pStyle w:val="normal1"/>
+        <w:numPr>
+          <w:ilvl w:val="3"/>
+          <w:numId w:val="1"/>
+        </w:numPr>
+        <w:ind w:hanging="360" w:left="2880"/>
+        <w:rPr>
+          <w:color w:val="FF0000"/>
+        </w:rPr>
+      </w:pPr>
+      <w:r>
+        <w:rPr>
+          <w:color w:val="FF0000"/>
+        </w:rPr>
+        <w:t>Required</w:t>
+      </w:r>
+    </w:p>
+    <w:p>
+      <w:pPr>
+        <w:pStyle w:val="normal1"/>
+        <w:widowControl/>
+        <w:numPr>
+          <w:ilvl w:val="3"/>
+          <w:numId w:val="1"/>
+        </w:numPr>
+        <w:suppressAutoHyphens w:val="true"/>
+        <w:bidi w:val="0"/>
+        <w:spacing w:lineRule="auto" w:line="276" w:before="0" w:after="0"/>
+        <w:ind w:hanging="360" w:left="2880" w:right="0"/>
+        <w:jc w:val="left"/>
+        <w:rPr/>
+      </w:pPr>
+      <w:r>
+        <w:rPr/>
+        <w:t>Defines how many rows to return for the selected page</w:t>
+      </w:r>
+    </w:p>
+    <w:p>
+      <w:pPr>
+        <w:pStyle w:val="normal1"/>
+        <w:widowControl/>
+        <w:numPr>
+          <w:ilvl w:val="1"/>
+          <w:numId w:val="1"/>
+        </w:numPr>
+        <w:suppressAutoHyphens w:val="true"/>
+        <w:bidi w:val="0"/>
+        <w:spacing w:lineRule="auto" w:line="276" w:before="0" w:after="0"/>
+        <w:ind w:hanging="360" w:left="1440" w:right="0"/>
+        <w:jc w:val="left"/>
+        <w:rPr/>
+      </w:pPr>
+      <w:r>
+        <w:rPr>
+          <w:b w:val="false"/>
+          <w:bCs w:val="false"/>
+          <w:color w:val="000000"/>
+        </w:rPr>
+        <w:t xml:space="preserve">returns: </w:t>
+      </w:r>
+    </w:p>
+    <w:p>
+      <w:pPr>
+        <w:pStyle w:val="normal1"/>
         <w:numPr>
           <w:ilvl w:val="0"/>
           <w:numId w:val="1"/>
@@ -41102,11 +42548,7 @@
       </w:pPr>
       <w:r>
         <w:rPr/>
-        <w:t xml:space="preserve">GET All </w:t>
-      </w:r>
-      <w:r>
-        <w:rPr/>
-        <w:t>UserRoles of User</w:t>
+        <w:t>GET All UserRoles of User</w:t>
       </w:r>
     </w:p>
     <w:p>
@@ -41158,11 +42600,7 @@
       </w:pPr>
       <w:r>
         <w:rPr/>
-        <w:t>endpoint: {base_uri}/api/usersroles/</w:t>
-      </w:r>
-      <w:r>
-        <w:rPr/>
-        <w:t>users/{id}</w:t>
+        <w:t>endpoint: {base_uri}/api/usersroles/users/{id}</w:t>
       </w:r>
     </w:p>
     <w:p>
@@ -41264,11 +42702,7 @@
       </w:pPr>
       <w:r>
         <w:rPr/>
-        <w:t xml:space="preserve">GET All </w:t>
-      </w:r>
-      <w:r>
-        <w:rPr/>
-        <w:t>UserRoles of Role</w:t>
+        <w:t>GET All UserRoles of Role</w:t>
       </w:r>
     </w:p>
     <w:p>
@@ -41320,11 +42754,7 @@
       </w:pPr>
       <w:r>
         <w:rPr/>
-        <w:t>endpoint: {base_uri}/api/usersroles/</w:t>
-      </w:r>
-      <w:r>
-        <w:rPr/>
-        <w:t>roles/{id}</w:t>
+        <w:t>endpoint: {base_uri}/api/usersroles/roles/{id}</w:t>
       </w:r>
     </w:p>
     <w:p>
@@ -41643,15 +43073,7 @@
       </w:pPr>
       <w:r>
         <w:rPr/>
-        <w:t>DELETE UserRole (by ID</w:t>
-      </w:r>
-      <w:r>
-        <w:rPr/>
-        <w:t>s</w:t>
-      </w:r>
-      <w:r>
-        <w:rPr/>
-        <w:t>)</w:t>
+        <w:t>DELETE UserRole (by IDs)</w:t>
       </w:r>
     </w:p>
     <w:p>
@@ -41867,19 +43289,7 @@
       </w:pPr>
       <w:r>
         <w:rPr/>
-        <w:t xml:space="preserve">DELETE </w:t>
-      </w:r>
-      <w:r>
-        <w:rPr/>
-        <w:t xml:space="preserve">All </w:t>
-      </w:r>
-      <w:r>
-        <w:rPr/>
-        <w:t>UserRole</w:t>
-      </w:r>
-      <w:r>
-        <w:rPr/>
-        <w:t>s by User ID</w:t>
+        <w:t>DELETE All UserRoles by User ID</w:t>
       </w:r>
     </w:p>
     <w:p>
@@ -41931,15 +43341,7 @@
       </w:pPr>
       <w:r>
         <w:rPr/>
-        <w:t>endpoint: {base_uri}/api/usersroles/</w:t>
-      </w:r>
-      <w:r>
-        <w:rPr/>
-        <w:t>users/{</w:t>
-      </w:r>
-      <w:r>
-        <w:rPr/>
-        <w:t>id}</w:t>
+        <w:t>endpoint: {base_uri}/api/usersroles/users/{id}</w:t>
       </w:r>
     </w:p>
     <w:p>
@@ -42066,7 +43468,10 @@
         </w:rPr>
       </w:pPr>
       <w:r>
-        <w:rPr/>
+        <w:rPr>
+          <w:b/>
+          <w:bCs/>
+        </w:rPr>
       </w:r>
     </w:p>
     <w:p>
@@ -42084,7 +43489,10 @@
         </w:rPr>
       </w:pPr>
       <w:r>
-        <w:rPr/>
+        <w:rPr>
+          <w:b/>
+          <w:bCs/>
+        </w:rPr>
       </w:r>
     </w:p>
     <w:p>

</xml_diff>

<commit_message>
added endpoints from a few commits ago to API docs; removed 'is_default' column Of equipmentsets table from everywhere; made the toolbar of the GearEditor dialog sticky; fixed the code for tests showing as not passing
</commit_message>
<xml_diff>
--- a/docs/QView API Documentation.docx
+++ b/docs/QView API Documentation.docx
@@ -10,7 +10,23 @@
       </w:pPr>
       <w:r>
         <w:rPr/>
-        <w:t>QView API Documentation (v152_2026.03.26)</w:t>
+        <w:t>QView API Documentation (v15</w:t>
+      </w:r>
+      <w:r>
+        <w:rPr/>
+        <w:t>3</w:t>
+      </w:r>
+      <w:r>
+        <w:rPr/>
+        <w:t>_2026.03.</w:t>
+      </w:r>
+      <w:r>
+        <w:rPr/>
+        <w:t>31</w:t>
+      </w:r>
+      <w:r>
+        <w:rPr/>
+        <w:t>)</w:t>
       </w:r>
     </w:p>
     <w:p>
@@ -6542,197 +6558,236 @@
         </w:numPr>
         <w:ind w:hanging="360" w:left="720"/>
         <w:rPr>
+          <w:highlight w:val="none"/>
+          <w:shd w:fill="auto" w:val="clear"/>
+        </w:rPr>
+      </w:pPr>
+      <w:r>
+        <w:rPr>
+          <w:shd w:fill="auto" w:val="clear"/>
+        </w:rPr>
+        <w:t xml:space="preserve">GET </w:t>
+      </w:r>
+      <w:r>
+        <w:rPr>
+          <w:b w:val="false"/>
+          <w:bCs w:val="false"/>
+          <w:shd w:fill="auto" w:val="clear"/>
+        </w:rPr>
+        <w:t>Equipment</w:t>
+      </w:r>
+      <w:r>
+        <w:rPr>
+          <w:shd w:fill="auto" w:val="clear"/>
+        </w:rPr>
+        <w:t xml:space="preserve"> </w:t>
+      </w:r>
+      <w:r>
+        <w:rPr>
+          <w:shd w:fill="auto" w:val="clear"/>
+        </w:rPr>
+        <w:t>of EquipmentSet</w:t>
+      </w:r>
+    </w:p>
+    <w:p>
+      <w:pPr>
+        <w:pStyle w:val="normal1"/>
+        <w:numPr>
+          <w:ilvl w:val="1"/>
+          <w:numId w:val="1"/>
+        </w:numPr>
+        <w:ind w:hanging="360" w:left="1440"/>
+        <w:rPr>
+          <w:highlight w:val="none"/>
+          <w:shd w:fill="auto" w:val="clear"/>
+        </w:rPr>
+      </w:pPr>
+      <w:r>
+        <w:rPr>
+          <w:shd w:fill="auto" w:val="clear"/>
+        </w:rPr>
+        <w:t xml:space="preserve">built_including_tests: </w:t>
+      </w:r>
+      <w:r>
+        <w:rPr>
           <w:b/>
           <w:bCs/>
-          <w:highlight w:val="none"/>
-          <w:shd w:fill="auto" w:val="clear"/>
-        </w:rPr>
-      </w:pPr>
+          <w:shd w:fill="auto" w:val="clear"/>
+        </w:rPr>
+        <w:t>true</w:t>
+      </w:r>
+    </w:p>
+    <w:p>
+      <w:pPr>
+        <w:pStyle w:val="normal1"/>
+        <w:numPr>
+          <w:ilvl w:val="1"/>
+          <w:numId w:val="1"/>
+        </w:numPr>
+        <w:ind w:hanging="360" w:left="1440"/>
+        <w:rPr>
+          <w:highlight w:val="none"/>
+          <w:shd w:fill="auto" w:val="clear"/>
+        </w:rPr>
+      </w:pPr>
+      <w:r>
+        <w:rPr>
+          <w:shd w:fill="auto" w:val="clear"/>
+        </w:rPr>
+        <w:t>HTTP method: ‘GET’</w:t>
+      </w:r>
+    </w:p>
+    <w:p>
+      <w:pPr>
+        <w:pStyle w:val="normal1"/>
+        <w:numPr>
+          <w:ilvl w:val="1"/>
+          <w:numId w:val="1"/>
+        </w:numPr>
+        <w:ind w:hanging="360" w:left="1440"/>
+        <w:rPr>
+          <w:highlight w:val="none"/>
+          <w:shd w:fill="auto" w:val="clear"/>
+        </w:rPr>
+      </w:pPr>
+      <w:r>
+        <w:rPr>
+          <w:shd w:fill="auto" w:val="clear"/>
+        </w:rPr>
+        <w:t>endpoint: {base_uri}/api/equipment</w:t>
+      </w:r>
+      <w:r>
+        <w:rPr>
+          <w:shd w:fill="auto" w:val="clear"/>
+        </w:rPr>
+        <w:t>set</w:t>
+      </w:r>
+      <w:r>
+        <w:rPr>
+          <w:shd w:fill="auto" w:val="clear"/>
+        </w:rPr>
+        <w:t>/{id}/</w:t>
+      </w:r>
+      <w:r>
+        <w:rPr>
+          <w:shd w:fill="auto" w:val="clear"/>
+        </w:rPr>
+        <w:t>equipment</w:t>
+      </w:r>
+    </w:p>
+    <w:p>
+      <w:pPr>
+        <w:pStyle w:val="normal1"/>
+        <w:numPr>
+          <w:ilvl w:val="1"/>
+          <w:numId w:val="1"/>
+        </w:numPr>
+        <w:ind w:hanging="360" w:left="1440"/>
+        <w:rPr>
+          <w:highlight w:val="none"/>
+          <w:shd w:fill="auto" w:val="clear"/>
+        </w:rPr>
+      </w:pPr>
+      <w:r>
+        <w:rPr>
+          <w:shd w:fill="auto" w:val="clear"/>
+        </w:rPr>
+        <w:t xml:space="preserve">description: </w:t>
+      </w:r>
+    </w:p>
+    <w:p>
+      <w:pPr>
+        <w:pStyle w:val="normal1"/>
+        <w:numPr>
+          <w:ilvl w:val="1"/>
+          <w:numId w:val="1"/>
+        </w:numPr>
+        <w:ind w:hanging="360" w:left="1440"/>
+        <w:rPr>
+          <w:highlight w:val="none"/>
+          <w:shd w:fill="auto" w:val="clear"/>
+        </w:rPr>
+      </w:pPr>
+      <w:r>
+        <w:rPr>
+          <w:shd w:fill="auto" w:val="clear"/>
+        </w:rPr>
+        <w:t xml:space="preserve">parameters: </w:t>
+      </w:r>
+    </w:p>
+    <w:p>
+      <w:pPr>
+        <w:pStyle w:val="normal1"/>
+        <w:numPr>
+          <w:ilvl w:val="2"/>
+          <w:numId w:val="1"/>
+        </w:numPr>
+        <w:ind w:hanging="360" w:left="2160"/>
+        <w:rPr>
+          <w:highlight w:val="none"/>
+          <w:shd w:fill="auto" w:val="clear"/>
+        </w:rPr>
+      </w:pPr>
+      <w:r>
+        <w:rPr>
+          <w:shd w:fill="auto" w:val="clear"/>
+        </w:rPr>
+        <w:t>id</w:t>
+      </w:r>
+    </w:p>
+    <w:p>
+      <w:pPr>
+        <w:pStyle w:val="normal1"/>
+        <w:numPr>
+          <w:ilvl w:val="3"/>
+          <w:numId w:val="1"/>
+        </w:numPr>
+        <w:ind w:hanging="360" w:left="2880"/>
+        <w:rPr>
+          <w:highlight w:val="none"/>
+          <w:shd w:fill="auto" w:val="clear"/>
+        </w:rPr>
+      </w:pPr>
+      <w:r>
+        <w:rPr>
+          <w:color w:val="FF0000"/>
+          <w:shd w:fill="auto" w:val="clear"/>
+        </w:rPr>
+        <w:t>Required</w:t>
+      </w:r>
+    </w:p>
+    <w:p>
+      <w:pPr>
+        <w:pStyle w:val="normal1"/>
+        <w:numPr>
+          <w:ilvl w:val="3"/>
+          <w:numId w:val="1"/>
+        </w:numPr>
+        <w:ind w:hanging="360" w:left="2880"/>
+        <w:rPr>
+          <w:highlight w:val="none"/>
+          <w:shd w:fill="auto" w:val="clear"/>
+        </w:rPr>
+      </w:pPr>
+      <w:r>
+        <w:rPr>
+          <w:shd w:fill="auto" w:val="clear"/>
+        </w:rPr>
+        <w:t xml:space="preserve">ID of the </w:t>
+      </w:r>
       <w:r>
         <w:rPr>
           <w:b w:val="false"/>
           <w:bCs w:val="false"/>
-          <w:color w:val="000000"/>
-          <w:shd w:fill="auto" w:val="clear"/>
-        </w:rPr>
-        <w:t>GET All Equipment of EquipmentOwner</w:t>
-      </w:r>
-    </w:p>
-    <w:p>
-      <w:pPr>
-        <w:pStyle w:val="normal1"/>
-        <w:numPr>
-          <w:ilvl w:val="1"/>
-          <w:numId w:val="1"/>
-        </w:numPr>
-        <w:ind w:hanging="360" w:left="1440"/>
-        <w:rPr>
-          <w:highlight w:val="none"/>
-          <w:shd w:fill="auto" w:val="clear"/>
-        </w:rPr>
-      </w:pPr>
-      <w:r>
-        <w:rPr>
-          <w:shd w:fill="auto" w:val="clear"/>
-        </w:rPr>
-        <w:t xml:space="preserve">built_including_tests: </w:t>
-      </w:r>
-      <w:r>
-        <w:rPr>
-          <w:b/>
-          <w:bCs/>
-          <w:shd w:fill="auto" w:val="clear"/>
-        </w:rPr>
-        <w:t>false</w:t>
-      </w:r>
-    </w:p>
-    <w:p>
-      <w:pPr>
-        <w:pStyle w:val="normal1"/>
-        <w:numPr>
-          <w:ilvl w:val="1"/>
-          <w:numId w:val="1"/>
-        </w:numPr>
-        <w:ind w:hanging="360" w:left="1440"/>
-        <w:rPr>
-          <w:highlight w:val="none"/>
-          <w:shd w:fill="auto" w:val="clear"/>
-        </w:rPr>
-      </w:pPr>
-      <w:r>
-        <w:rPr>
-          <w:shd w:fill="auto" w:val="clear"/>
-        </w:rPr>
-        <w:t>HTTP method: ‘GET’</w:t>
-      </w:r>
-    </w:p>
-    <w:p>
-      <w:pPr>
-        <w:pStyle w:val="normal1"/>
-        <w:numPr>
-          <w:ilvl w:val="1"/>
-          <w:numId w:val="1"/>
-        </w:numPr>
-        <w:ind w:hanging="360" w:left="1440"/>
-        <w:rPr>
-          <w:highlight w:val="none"/>
-          <w:shd w:fill="auto" w:val="clear"/>
-        </w:rPr>
-      </w:pPr>
-      <w:r>
-        <w:rPr>
-          <w:shd w:fill="auto" w:val="clear"/>
-        </w:rPr>
-        <w:t>endpoint: {base_uri}/api/equipmentowner/{id}/equipment</w:t>
-      </w:r>
-    </w:p>
-    <w:p>
-      <w:pPr>
-        <w:pStyle w:val="normal1"/>
-        <w:numPr>
-          <w:ilvl w:val="1"/>
-          <w:numId w:val="1"/>
-        </w:numPr>
-        <w:ind w:hanging="360" w:left="1440"/>
-        <w:rPr>
-          <w:highlight w:val="none"/>
-          <w:shd w:fill="auto" w:val="clear"/>
-        </w:rPr>
-      </w:pPr>
-      <w:r>
-        <w:rPr>
-          <w:shd w:fill="auto" w:val="clear"/>
-        </w:rPr>
-        <w:t xml:space="preserve">description: </w:t>
-      </w:r>
-    </w:p>
-    <w:p>
-      <w:pPr>
-        <w:pStyle w:val="normal1"/>
-        <w:numPr>
-          <w:ilvl w:val="1"/>
-          <w:numId w:val="1"/>
-        </w:numPr>
-        <w:ind w:hanging="360" w:left="1440"/>
-        <w:rPr>
-          <w:highlight w:val="none"/>
-          <w:shd w:fill="auto" w:val="clear"/>
-        </w:rPr>
-      </w:pPr>
-      <w:r>
-        <w:rPr>
-          <w:shd w:fill="auto" w:val="clear"/>
-        </w:rPr>
-        <w:t xml:space="preserve">parameters: </w:t>
-      </w:r>
-    </w:p>
-    <w:p>
-      <w:pPr>
-        <w:pStyle w:val="normal1"/>
-        <w:numPr>
-          <w:ilvl w:val="2"/>
-          <w:numId w:val="1"/>
-        </w:numPr>
-        <w:ind w:hanging="360" w:left="2160"/>
-        <w:rPr>
-          <w:highlight w:val="none"/>
-          <w:shd w:fill="auto" w:val="clear"/>
-        </w:rPr>
-      </w:pPr>
-      <w:r>
-        <w:rPr>
-          <w:shd w:fill="auto" w:val="clear"/>
-        </w:rPr>
-        <w:t>id</w:t>
-      </w:r>
-    </w:p>
-    <w:p>
-      <w:pPr>
-        <w:pStyle w:val="normal1"/>
-        <w:numPr>
-          <w:ilvl w:val="3"/>
-          <w:numId w:val="1"/>
-        </w:numPr>
-        <w:ind w:hanging="360" w:left="2880"/>
-        <w:rPr>
-          <w:highlight w:val="none"/>
-          <w:shd w:fill="auto" w:val="clear"/>
-        </w:rPr>
-      </w:pPr>
-      <w:r>
-        <w:rPr>
-          <w:color w:val="FF0000"/>
-          <w:shd w:fill="auto" w:val="clear"/>
-        </w:rPr>
-        <w:t>Required</w:t>
-      </w:r>
-    </w:p>
-    <w:p>
-      <w:pPr>
-        <w:pStyle w:val="normal1"/>
-        <w:numPr>
-          <w:ilvl w:val="3"/>
-          <w:numId w:val="1"/>
-        </w:numPr>
-        <w:ind w:hanging="360" w:left="2880"/>
-        <w:rPr>
-          <w:highlight w:val="none"/>
-          <w:shd w:fill="auto" w:val="clear"/>
-        </w:rPr>
-      </w:pPr>
-      <w:r>
-        <w:rPr>
-          <w:shd w:fill="auto" w:val="clear"/>
-        </w:rPr>
-        <w:t xml:space="preserve">ID of the </w:t>
-      </w:r>
-      <w:r>
-        <w:rPr>
-          <w:b w:val="false"/>
-          <w:bCs w:val="false"/>
-          <w:shd w:fill="auto" w:val="clear"/>
-        </w:rPr>
-        <w:t>EquipmentOwner</w:t>
+          <w:shd w:fill="auto" w:val="clear"/>
+        </w:rPr>
+        <w:t>Equipment</w:t>
+      </w:r>
+      <w:r>
+        <w:rPr>
+          <w:shd w:fill="auto" w:val="clear"/>
+        </w:rPr>
+        <w:t xml:space="preserve"> to be received</w:t>
       </w:r>
     </w:p>
     <w:p>
@@ -6749,8 +6804,6 @@
         <w:ind w:hanging="360" w:left="1440" w:right="0"/>
         <w:jc w:val="left"/>
         <w:rPr>
-          <w:b/>
-          <w:bCs/>
           <w:highlight w:val="none"/>
           <w:shd w:fill="auto" w:val="clear"/>
         </w:rPr>
@@ -6779,6 +6832,275 @@
         <w:ind w:hanging="360" w:left="2160" w:right="0"/>
         <w:jc w:val="left"/>
         <w:rPr>
+          <w:highlight w:val="none"/>
+          <w:shd w:fill="auto" w:val="clear"/>
+        </w:rPr>
+      </w:pPr>
+      <w:r>
+        <w:rPr>
+          <w:shd w:fill="auto" w:val="clear"/>
+        </w:rPr>
+        <w:t xml:space="preserve">an </w:t>
+      </w:r>
+      <w:r>
+        <w:rPr>
+          <w:shd w:fill="auto" w:val="clear"/>
+        </w:rPr>
+        <w:t xml:space="preserve">array of </w:t>
+      </w:r>
+      <w:r>
+        <w:rPr>
+          <w:shd w:fill="auto" w:val="clear"/>
+        </w:rPr>
+        <w:t>Equipment</w:t>
+      </w:r>
+    </w:p>
+    <w:p>
+      <w:pPr>
+        <w:pStyle w:val="normal1"/>
+        <w:numPr>
+          <w:ilvl w:val="0"/>
+          <w:numId w:val="1"/>
+        </w:numPr>
+        <w:ind w:hanging="360" w:left="720"/>
+        <w:rPr>
+          <w:b/>
+          <w:bCs/>
+          <w:highlight w:val="none"/>
+          <w:shd w:fill="auto" w:val="clear"/>
+        </w:rPr>
+      </w:pPr>
+      <w:r>
+        <w:rPr>
+          <w:b w:val="false"/>
+          <w:bCs w:val="false"/>
+          <w:color w:val="000000"/>
+          <w:shd w:fill="auto" w:val="clear"/>
+        </w:rPr>
+        <w:t>GET All Equipment of EquipmentOwner</w:t>
+      </w:r>
+    </w:p>
+    <w:p>
+      <w:pPr>
+        <w:pStyle w:val="normal1"/>
+        <w:numPr>
+          <w:ilvl w:val="1"/>
+          <w:numId w:val="1"/>
+        </w:numPr>
+        <w:ind w:hanging="360" w:left="1440"/>
+        <w:rPr>
+          <w:highlight w:val="none"/>
+          <w:shd w:fill="auto" w:val="clear"/>
+        </w:rPr>
+      </w:pPr>
+      <w:r>
+        <w:rPr>
+          <w:shd w:fill="auto" w:val="clear"/>
+        </w:rPr>
+        <w:t xml:space="preserve">built_including_tests: </w:t>
+      </w:r>
+      <w:r>
+        <w:rPr>
+          <w:b/>
+          <w:bCs/>
+          <w:shd w:fill="auto" w:val="clear"/>
+        </w:rPr>
+        <w:t>false</w:t>
+      </w:r>
+    </w:p>
+    <w:p>
+      <w:pPr>
+        <w:pStyle w:val="normal1"/>
+        <w:numPr>
+          <w:ilvl w:val="1"/>
+          <w:numId w:val="1"/>
+        </w:numPr>
+        <w:ind w:hanging="360" w:left="1440"/>
+        <w:rPr>
+          <w:highlight w:val="none"/>
+          <w:shd w:fill="auto" w:val="clear"/>
+        </w:rPr>
+      </w:pPr>
+      <w:r>
+        <w:rPr>
+          <w:shd w:fill="auto" w:val="clear"/>
+        </w:rPr>
+        <w:t>HTTP method: ‘GET’</w:t>
+      </w:r>
+    </w:p>
+    <w:p>
+      <w:pPr>
+        <w:pStyle w:val="normal1"/>
+        <w:numPr>
+          <w:ilvl w:val="1"/>
+          <w:numId w:val="1"/>
+        </w:numPr>
+        <w:ind w:hanging="360" w:left="1440"/>
+        <w:rPr>
+          <w:highlight w:val="none"/>
+          <w:shd w:fill="auto" w:val="clear"/>
+        </w:rPr>
+      </w:pPr>
+      <w:r>
+        <w:rPr>
+          <w:shd w:fill="auto" w:val="clear"/>
+        </w:rPr>
+        <w:t>endpoint: {base_uri}/api/equipmentowner/{id}/equipment</w:t>
+      </w:r>
+    </w:p>
+    <w:p>
+      <w:pPr>
+        <w:pStyle w:val="normal1"/>
+        <w:numPr>
+          <w:ilvl w:val="1"/>
+          <w:numId w:val="1"/>
+        </w:numPr>
+        <w:ind w:hanging="360" w:left="1440"/>
+        <w:rPr>
+          <w:highlight w:val="none"/>
+          <w:shd w:fill="auto" w:val="clear"/>
+        </w:rPr>
+      </w:pPr>
+      <w:r>
+        <w:rPr>
+          <w:shd w:fill="auto" w:val="clear"/>
+        </w:rPr>
+        <w:t xml:space="preserve">description: </w:t>
+      </w:r>
+    </w:p>
+    <w:p>
+      <w:pPr>
+        <w:pStyle w:val="normal1"/>
+        <w:numPr>
+          <w:ilvl w:val="1"/>
+          <w:numId w:val="1"/>
+        </w:numPr>
+        <w:ind w:hanging="360" w:left="1440"/>
+        <w:rPr>
+          <w:highlight w:val="none"/>
+          <w:shd w:fill="auto" w:val="clear"/>
+        </w:rPr>
+      </w:pPr>
+      <w:r>
+        <w:rPr>
+          <w:shd w:fill="auto" w:val="clear"/>
+        </w:rPr>
+        <w:t xml:space="preserve">parameters: </w:t>
+      </w:r>
+    </w:p>
+    <w:p>
+      <w:pPr>
+        <w:pStyle w:val="normal1"/>
+        <w:numPr>
+          <w:ilvl w:val="2"/>
+          <w:numId w:val="1"/>
+        </w:numPr>
+        <w:ind w:hanging="360" w:left="2160"/>
+        <w:rPr>
+          <w:highlight w:val="none"/>
+          <w:shd w:fill="auto" w:val="clear"/>
+        </w:rPr>
+      </w:pPr>
+      <w:r>
+        <w:rPr>
+          <w:shd w:fill="auto" w:val="clear"/>
+        </w:rPr>
+        <w:t>id</w:t>
+      </w:r>
+    </w:p>
+    <w:p>
+      <w:pPr>
+        <w:pStyle w:val="normal1"/>
+        <w:numPr>
+          <w:ilvl w:val="3"/>
+          <w:numId w:val="1"/>
+        </w:numPr>
+        <w:ind w:hanging="360" w:left="2880"/>
+        <w:rPr>
+          <w:highlight w:val="none"/>
+          <w:shd w:fill="auto" w:val="clear"/>
+        </w:rPr>
+      </w:pPr>
+      <w:r>
+        <w:rPr>
+          <w:color w:val="FF0000"/>
+          <w:shd w:fill="auto" w:val="clear"/>
+        </w:rPr>
+        <w:t>Required</w:t>
+      </w:r>
+    </w:p>
+    <w:p>
+      <w:pPr>
+        <w:pStyle w:val="normal1"/>
+        <w:numPr>
+          <w:ilvl w:val="3"/>
+          <w:numId w:val="1"/>
+        </w:numPr>
+        <w:ind w:hanging="360" w:left="2880"/>
+        <w:rPr>
+          <w:highlight w:val="none"/>
+          <w:shd w:fill="auto" w:val="clear"/>
+        </w:rPr>
+      </w:pPr>
+      <w:r>
+        <w:rPr>
+          <w:shd w:fill="auto" w:val="clear"/>
+        </w:rPr>
+        <w:t xml:space="preserve">ID of the </w:t>
+      </w:r>
+      <w:r>
+        <w:rPr>
+          <w:b w:val="false"/>
+          <w:bCs w:val="false"/>
+          <w:shd w:fill="auto" w:val="clear"/>
+        </w:rPr>
+        <w:t>EquipmentOwner</w:t>
+      </w:r>
+    </w:p>
+    <w:p>
+      <w:pPr>
+        <w:pStyle w:val="normal1"/>
+        <w:widowControl/>
+        <w:numPr>
+          <w:ilvl w:val="1"/>
+          <w:numId w:val="1"/>
+        </w:numPr>
+        <w:suppressAutoHyphens w:val="true"/>
+        <w:bidi w:val="0"/>
+        <w:spacing w:lineRule="auto" w:line="276" w:before="0" w:after="0"/>
+        <w:ind w:hanging="360" w:left="1440" w:right="0"/>
+        <w:jc w:val="left"/>
+        <w:rPr>
+          <w:b/>
+          <w:bCs/>
+          <w:highlight w:val="none"/>
+          <w:shd w:fill="auto" w:val="clear"/>
+        </w:rPr>
+      </w:pPr>
+      <w:r>
+        <w:rPr>
+          <w:b w:val="false"/>
+          <w:bCs w:val="false"/>
+          <w:color w:val="000000"/>
+          <w:shd w:fill="auto" w:val="clear"/>
+        </w:rPr>
+        <w:t xml:space="preserve">returns: </w:t>
+      </w:r>
+    </w:p>
+    <w:p>
+      <w:pPr>
+        <w:pStyle w:val="normal1"/>
+        <w:widowControl/>
+        <w:numPr>
+          <w:ilvl w:val="2"/>
+          <w:numId w:val="1"/>
+        </w:numPr>
+        <w:suppressAutoHyphens w:val="true"/>
+        <w:bidi w:val="0"/>
+        <w:spacing w:lineRule="auto" w:line="276" w:before="0" w:after="0"/>
+        <w:ind w:hanging="360" w:left="2160" w:right="0"/>
+        <w:jc w:val="left"/>
+        <w:rPr>
           <w:b/>
           <w:bCs/>
           <w:highlight w:val="none"/>
@@ -10039,6 +10361,306 @@
           <w:shd w:fill="auto" w:val="clear"/>
         </w:rPr>
         <w:t xml:space="preserve">returns: </w:t>
+      </w:r>
+    </w:p>
+    <w:p>
+      <w:pPr>
+        <w:pStyle w:val="normal1"/>
+        <w:numPr>
+          <w:ilvl w:val="0"/>
+          <w:numId w:val="1"/>
+        </w:numPr>
+        <w:ind w:hanging="360" w:left="720"/>
+        <w:rPr>
+          <w:highlight w:val="none"/>
+          <w:shd w:fill="auto" w:val="clear"/>
+        </w:rPr>
+      </w:pPr>
+      <w:r>
+        <w:rPr>
+          <w:shd w:fill="auto" w:val="clear"/>
+        </w:rPr>
+        <w:t xml:space="preserve">GET </w:t>
+      </w:r>
+      <w:r>
+        <w:rPr>
+          <w:b w:val="false"/>
+          <w:bCs w:val="false"/>
+          <w:shd w:fill="auto" w:val="clear"/>
+        </w:rPr>
+        <w:t>EquipmentSet</w:t>
+      </w:r>
+      <w:r>
+        <w:rPr>
+          <w:b w:val="false"/>
+          <w:bCs w:val="false"/>
+          <w:shd w:fill="auto" w:val="clear"/>
+        </w:rPr>
+        <w:t>s</w:t>
+      </w:r>
+      <w:r>
+        <w:rPr>
+          <w:shd w:fill="auto" w:val="clear"/>
+        </w:rPr>
+        <w:t xml:space="preserve"> by </w:t>
+      </w:r>
+      <w:r>
+        <w:rPr>
+          <w:shd w:fill="auto" w:val="clear"/>
+        </w:rPr>
+        <w:t xml:space="preserve">User </w:t>
+      </w:r>
+      <w:r>
+        <w:rPr>
+          <w:shd w:fill="auto" w:val="clear"/>
+        </w:rPr>
+        <w:t>ID</w:t>
+      </w:r>
+    </w:p>
+    <w:p>
+      <w:pPr>
+        <w:pStyle w:val="normal1"/>
+        <w:numPr>
+          <w:ilvl w:val="1"/>
+          <w:numId w:val="1"/>
+        </w:numPr>
+        <w:ind w:hanging="360" w:left="1440"/>
+        <w:rPr>
+          <w:highlight w:val="none"/>
+          <w:shd w:fill="auto" w:val="clear"/>
+        </w:rPr>
+      </w:pPr>
+      <w:r>
+        <w:rPr>
+          <w:shd w:fill="auto" w:val="clear"/>
+        </w:rPr>
+        <w:t xml:space="preserve">built_including_tests: </w:t>
+      </w:r>
+      <w:r>
+        <w:rPr>
+          <w:b/>
+          <w:bCs/>
+          <w:shd w:fill="auto" w:val="clear"/>
+        </w:rPr>
+        <w:t>true</w:t>
+      </w:r>
+    </w:p>
+    <w:p>
+      <w:pPr>
+        <w:pStyle w:val="normal1"/>
+        <w:numPr>
+          <w:ilvl w:val="1"/>
+          <w:numId w:val="1"/>
+        </w:numPr>
+        <w:ind w:hanging="360" w:left="1440"/>
+        <w:rPr>
+          <w:highlight w:val="none"/>
+          <w:shd w:fill="auto" w:val="clear"/>
+        </w:rPr>
+      </w:pPr>
+      <w:r>
+        <w:rPr>
+          <w:shd w:fill="auto" w:val="clear"/>
+        </w:rPr>
+        <w:t>HTTP method: ‘GET’</w:t>
+      </w:r>
+    </w:p>
+    <w:p>
+      <w:pPr>
+        <w:pStyle w:val="normal1"/>
+        <w:numPr>
+          <w:ilvl w:val="1"/>
+          <w:numId w:val="1"/>
+        </w:numPr>
+        <w:ind w:hanging="360" w:left="1440"/>
+        <w:rPr>
+          <w:highlight w:val="none"/>
+          <w:shd w:fill="auto" w:val="clear"/>
+        </w:rPr>
+      </w:pPr>
+      <w:r>
+        <w:rPr>
+          <w:shd w:fill="auto" w:val="clear"/>
+        </w:rPr>
+        <w:t>endpoint: {base_uri}/api/</w:t>
+      </w:r>
+      <w:r>
+        <w:rPr>
+          <w:shd w:fill="auto" w:val="clear"/>
+        </w:rPr>
+        <w:t>user</w:t>
+      </w:r>
+      <w:r>
+        <w:rPr>
+          <w:shd w:fill="auto" w:val="clear"/>
+        </w:rPr>
+        <w:t>/{id}/</w:t>
+      </w:r>
+      <w:r>
+        <w:rPr>
+          <w:shd w:fill="auto" w:val="clear"/>
+        </w:rPr>
+        <w:t>equipmentsets</w:t>
+      </w:r>
+    </w:p>
+    <w:p>
+      <w:pPr>
+        <w:pStyle w:val="normal1"/>
+        <w:numPr>
+          <w:ilvl w:val="1"/>
+          <w:numId w:val="1"/>
+        </w:numPr>
+        <w:ind w:hanging="360" w:left="1440"/>
+        <w:rPr>
+          <w:highlight w:val="none"/>
+          <w:shd w:fill="auto" w:val="clear"/>
+        </w:rPr>
+      </w:pPr>
+      <w:r>
+        <w:rPr>
+          <w:shd w:fill="auto" w:val="clear"/>
+        </w:rPr>
+        <w:t xml:space="preserve">description: </w:t>
+      </w:r>
+    </w:p>
+    <w:p>
+      <w:pPr>
+        <w:pStyle w:val="normal1"/>
+        <w:numPr>
+          <w:ilvl w:val="1"/>
+          <w:numId w:val="1"/>
+        </w:numPr>
+        <w:ind w:hanging="360" w:left="1440"/>
+        <w:rPr>
+          <w:highlight w:val="none"/>
+          <w:shd w:fill="auto" w:val="clear"/>
+        </w:rPr>
+      </w:pPr>
+      <w:r>
+        <w:rPr>
+          <w:shd w:fill="auto" w:val="clear"/>
+        </w:rPr>
+        <w:t xml:space="preserve">parameters: </w:t>
+      </w:r>
+    </w:p>
+    <w:p>
+      <w:pPr>
+        <w:pStyle w:val="normal1"/>
+        <w:numPr>
+          <w:ilvl w:val="2"/>
+          <w:numId w:val="1"/>
+        </w:numPr>
+        <w:ind w:hanging="360" w:left="2160"/>
+        <w:rPr>
+          <w:highlight w:val="none"/>
+          <w:shd w:fill="auto" w:val="clear"/>
+        </w:rPr>
+      </w:pPr>
+      <w:r>
+        <w:rPr>
+          <w:shd w:fill="auto" w:val="clear"/>
+        </w:rPr>
+        <w:t>id</w:t>
+      </w:r>
+    </w:p>
+    <w:p>
+      <w:pPr>
+        <w:pStyle w:val="normal1"/>
+        <w:numPr>
+          <w:ilvl w:val="3"/>
+          <w:numId w:val="1"/>
+        </w:numPr>
+        <w:ind w:hanging="360" w:left="2880"/>
+        <w:rPr>
+          <w:highlight w:val="none"/>
+          <w:shd w:fill="auto" w:val="clear"/>
+        </w:rPr>
+      </w:pPr>
+      <w:r>
+        <w:rPr>
+          <w:color w:val="FF0000"/>
+          <w:shd w:fill="auto" w:val="clear"/>
+        </w:rPr>
+        <w:t>Required</w:t>
+      </w:r>
+    </w:p>
+    <w:p>
+      <w:pPr>
+        <w:pStyle w:val="normal1"/>
+        <w:numPr>
+          <w:ilvl w:val="3"/>
+          <w:numId w:val="1"/>
+        </w:numPr>
+        <w:ind w:hanging="360" w:left="2880"/>
+        <w:rPr>
+          <w:highlight w:val="none"/>
+          <w:shd w:fill="auto" w:val="clear"/>
+        </w:rPr>
+      </w:pPr>
+      <w:r>
+        <w:rPr>
+          <w:shd w:fill="auto" w:val="clear"/>
+        </w:rPr>
+        <w:t xml:space="preserve">ID of the </w:t>
+      </w:r>
+      <w:r>
+        <w:rPr>
+          <w:b w:val="false"/>
+          <w:bCs w:val="false"/>
+          <w:shd w:fill="auto" w:val="clear"/>
+        </w:rPr>
+        <w:t>User that has access to the EquipmentSets</w:t>
+      </w:r>
+    </w:p>
+    <w:p>
+      <w:pPr>
+        <w:pStyle w:val="normal1"/>
+        <w:widowControl/>
+        <w:numPr>
+          <w:ilvl w:val="1"/>
+          <w:numId w:val="1"/>
+        </w:numPr>
+        <w:suppressAutoHyphens w:val="true"/>
+        <w:bidi w:val="0"/>
+        <w:spacing w:lineRule="auto" w:line="276" w:before="0" w:after="0"/>
+        <w:ind w:hanging="360" w:left="1440" w:right="0"/>
+        <w:jc w:val="left"/>
+        <w:rPr>
+          <w:highlight w:val="none"/>
+          <w:shd w:fill="auto" w:val="clear"/>
+        </w:rPr>
+      </w:pPr>
+      <w:r>
+        <w:rPr>
+          <w:b w:val="false"/>
+          <w:bCs w:val="false"/>
+          <w:color w:val="000000"/>
+          <w:shd w:fill="auto" w:val="clear"/>
+        </w:rPr>
+        <w:t xml:space="preserve">returns: </w:t>
+      </w:r>
+    </w:p>
+    <w:p>
+      <w:pPr>
+        <w:pStyle w:val="normal1"/>
+        <w:widowControl/>
+        <w:numPr>
+          <w:ilvl w:val="2"/>
+          <w:numId w:val="1"/>
+        </w:numPr>
+        <w:suppressAutoHyphens w:val="true"/>
+        <w:bidi w:val="0"/>
+        <w:spacing w:lineRule="auto" w:line="276" w:before="0" w:after="0"/>
+        <w:ind w:hanging="360" w:left="2160" w:right="0"/>
+        <w:jc w:val="left"/>
+        <w:rPr>
+          <w:highlight w:val="none"/>
+          <w:shd w:fill="auto" w:val="clear"/>
+        </w:rPr>
+      </w:pPr>
+      <w:r>
+        <w:rPr/>
+        <w:t>an array of EquipmentSets</w:t>
       </w:r>
     </w:p>
     <w:p>
@@ -12817,11 +13439,7 @@
       </w:pPr>
       <w:r>
         <w:rPr/>
-        <w:t xml:space="preserve">GET Games where User is QuizMaster </w:t>
-      </w:r>
-      <w:r>
-        <w:rPr/>
-        <w:t>(*Enriched)</w:t>
+        <w:t>GET Games where User is QuizMaster (*Enriched)</w:t>
       </w:r>
     </w:p>
     <w:p>
@@ -13391,11 +14009,7 @@
       </w:pPr>
       <w:r>
         <w:rPr/>
-        <w:t xml:space="preserve">GET Games where User is ContentJudge </w:t>
-      </w:r>
-      <w:r>
-        <w:rPr/>
-        <w:t>(*Enriched)</w:t>
+        <w:t>GET Games where User is ContentJudge (*Enriched)</w:t>
       </w:r>
     </w:p>
     <w:p>
@@ -36489,11 +37103,7 @@
       </w:pPr>
       <w:r>
         <w:rPr/>
-        <w:t xml:space="preserve">GET Teams where User is Coach </w:t>
-      </w:r>
-      <w:r>
-        <w:rPr/>
-        <w:t>(Enriched)</w:t>
+        <w:t>GET Teams where User is Coach (Enriched)</w:t>
       </w:r>
     </w:p>
     <w:p>
@@ -37080,11 +37690,7 @@
       </w:pPr>
       <w:r>
         <w:rPr/>
-        <w:t xml:space="preserve">GET Teams where User is Quizzer </w:t>
-      </w:r>
-      <w:r>
-        <w:rPr/>
-        <w:t>(Enriched)</w:t>
+        <w:t>GET Teams where User is Quizzer (Enriched)</w:t>
       </w:r>
     </w:p>
     <w:p>
@@ -40891,15 +41497,7 @@
           <w:bCs w:val="false"/>
           <w:color w:val="000000"/>
         </w:rPr>
-        <w:t xml:space="preserve">GET Tournaments where User is Admin </w:t>
-      </w:r>
-      <w:r>
-        <w:rPr>
-          <w:b w:val="false"/>
-          <w:bCs w:val="false"/>
-          <w:color w:val="000000"/>
-        </w:rPr>
-        <w:t>OR [Tournament] Owner</w:t>
+        <w:t>GET Tournaments where User is Admin OR [Tournament] Owner</w:t>
       </w:r>
     </w:p>
     <w:p>

</xml_diff>

<commit_message>
updated API docs to include latest API endpoint additions for create tournament applicants
</commit_message>
<xml_diff>
--- a/docs/QView API Documentation.docx
+++ b/docs/QView API Documentation.docx
@@ -14,15 +14,15 @@
       </w:r>
       <w:r>
         <w:rPr/>
-        <w:t>3</w:t>
-      </w:r>
-      <w:r>
-        <w:rPr/>
-        <w:t>_2026.03.</w:t>
-      </w:r>
-      <w:r>
-        <w:rPr/>
-        <w:t>31</w:t>
+        <w:t>4</w:t>
+      </w:r>
+      <w:r>
+        <w:rPr/>
+        <w:t>_2026.0</w:t>
+      </w:r>
+      <w:r>
+        <w:rPr/>
+        <w:t>4.07</w:t>
       </w:r>
       <w:r>
         <w:rPr/>
@@ -4670,7 +4670,7 @@
           <w:bCs/>
           <w:color w:val="000000"/>
         </w:rPr>
-        <w:t>Divisions</w:t>
+        <w:t>Create Tournament Applicants</w:t>
       </w:r>
     </w:p>
     <w:p>
@@ -4685,7 +4685,7 @@
       </w:pPr>
       <w:r>
         <w:rPr/>
-        <w:t>GET All Divisions</w:t>
+        <w:t>GET All Create Tournament Applicants</w:t>
       </w:r>
     </w:p>
     <w:p>
@@ -4737,7 +4737,15 @@
       </w:pPr>
       <w:r>
         <w:rPr/>
-        <w:t>endpoint: {base_uri}/api/divisions?page={page_num}&amp;page_size={num_of_rows}</w:t>
+        <w:t>endpoint: {base_uri}/api/</w:t>
+      </w:r>
+      <w:r>
+        <w:rPr/>
+        <w:t>createtournamentapplicants</w:t>
+      </w:r>
+      <w:r>
+        <w:rPr/>
+        <w:t>?page={page_num}&amp;page_size={num_of_rows}</w:t>
       </w:r>
     </w:p>
     <w:p>
@@ -4910,7 +4918,7 @@
       </w:pPr>
       <w:r>
         <w:rPr/>
-        <w:t>GET Division by ID</w:t>
+        <w:t>GET Create Tournament Applicant by ID</w:t>
       </w:r>
     </w:p>
     <w:p>
@@ -4962,7 +4970,15 @@
       </w:pPr>
       <w:r>
         <w:rPr/>
-        <w:t>endpoint: {base_uri}/api/divisions/{id}</w:t>
+        <w:t>endpoint: {base_uri}/api/</w:t>
+      </w:r>
+      <w:r>
+        <w:rPr/>
+        <w:t>createtournamentapplicants</w:t>
+      </w:r>
+      <w:r>
+        <w:rPr/>
+        <w:t>/{id}</w:t>
       </w:r>
     </w:p>
     <w:p>
@@ -5041,7 +5057,7 @@
       </w:pPr>
       <w:r>
         <w:rPr/>
-        <w:t>ID of the Division to receive</w:t>
+        <w:t>ID of the Create Tournament Applicant to receive</w:t>
       </w:r>
     </w:p>
     <w:p>
@@ -5074,7 +5090,11 @@
       </w:pPr>
       <w:r>
         <w:rPr/>
-        <w:t>GET Divisions of Tournament</w:t>
+        <w:t xml:space="preserve">POST/Create </w:t>
+      </w:r>
+      <w:r>
+        <w:rPr/>
+        <w:t>Create Tournament Applicant</w:t>
       </w:r>
     </w:p>
     <w:p>
@@ -5111,22 +5131,26 @@
       </w:pPr>
       <w:r>
         <w:rPr/>
-        <w:t>HTTP method: ‘GET’</w:t>
-      </w:r>
-    </w:p>
-    <w:p>
-      <w:pPr>
-        <w:pStyle w:val="normal1"/>
-        <w:numPr>
-          <w:ilvl w:val="1"/>
-          <w:numId w:val="1"/>
-        </w:numPr>
-        <w:ind w:hanging="360" w:left="1440"/>
-        <w:rPr/>
-      </w:pPr>
-      <w:r>
-        <w:rPr/>
-        <w:t>endpoint: {base_uri}/api/tournaments/{id}/divisions?page={page_num}&amp;page_size={num_of_rows}</w:t>
+        <w:t>HTTP method: ‘POST’</w:t>
+      </w:r>
+    </w:p>
+    <w:p>
+      <w:pPr>
+        <w:pStyle w:val="normal1"/>
+        <w:numPr>
+          <w:ilvl w:val="1"/>
+          <w:numId w:val="1"/>
+        </w:numPr>
+        <w:ind w:hanging="360" w:left="1440"/>
+        <w:rPr/>
+      </w:pPr>
+      <w:r>
+        <w:rPr/>
+        <w:t>endpoint: {base_uri}/api/</w:t>
+      </w:r>
+      <w:r>
+        <w:rPr/>
+        <w:t>createtournamentapplicants</w:t>
       </w:r>
     </w:p>
     <w:p>
@@ -5156,169 +5180,22 @@
       </w:pPr>
       <w:r>
         <w:rPr/>
-        <w:t>parameters:</w:t>
-      </w:r>
-    </w:p>
-    <w:p>
-      <w:pPr>
-        <w:pStyle w:val="normal1"/>
-        <w:numPr>
-          <w:ilvl w:val="2"/>
-          <w:numId w:val="1"/>
-        </w:numPr>
-        <w:ind w:hanging="360" w:left="2160"/>
-        <w:rPr/>
-      </w:pPr>
-      <w:r>
-        <w:rPr/>
-        <w:t>id</w:t>
-      </w:r>
-    </w:p>
-    <w:p>
-      <w:pPr>
-        <w:pStyle w:val="normal1"/>
-        <w:numPr>
-          <w:ilvl w:val="3"/>
-          <w:numId w:val="1"/>
-        </w:numPr>
-        <w:ind w:hanging="360" w:left="2880"/>
-        <w:rPr>
-          <w:color w:val="FF0000"/>
-        </w:rPr>
-      </w:pPr>
-      <w:r>
-        <w:rPr>
-          <w:color w:val="FF0000"/>
-        </w:rPr>
-        <w:t>Required</w:t>
-      </w:r>
-    </w:p>
-    <w:p>
-      <w:pPr>
-        <w:pStyle w:val="normal1"/>
-        <w:numPr>
-          <w:ilvl w:val="3"/>
-          <w:numId w:val="1"/>
-        </w:numPr>
-        <w:ind w:hanging="360" w:left="2880"/>
-        <w:rPr/>
-      </w:pPr>
-      <w:r>
-        <w:rPr/>
-        <w:t>ID of the Tournament the Divisions belong to</w:t>
-      </w:r>
-    </w:p>
-    <w:p>
-      <w:pPr>
-        <w:pStyle w:val="normal1"/>
-        <w:numPr>
-          <w:ilvl w:val="2"/>
-          <w:numId w:val="1"/>
-        </w:numPr>
-        <w:ind w:hanging="360" w:left="2160"/>
-        <w:rPr/>
-      </w:pPr>
-      <w:r>
-        <w:rPr/>
-        <w:t>page={page_num}</w:t>
-      </w:r>
-    </w:p>
-    <w:p>
-      <w:pPr>
-        <w:pStyle w:val="normal1"/>
-        <w:numPr>
-          <w:ilvl w:val="3"/>
-          <w:numId w:val="1"/>
-        </w:numPr>
-        <w:ind w:hanging="360" w:left="2880"/>
-        <w:rPr>
-          <w:color w:val="FF0000"/>
-        </w:rPr>
-      </w:pPr>
-      <w:r>
-        <w:rPr>
-          <w:color w:val="FF0000"/>
-        </w:rPr>
-        <w:t>Required</w:t>
-      </w:r>
-    </w:p>
-    <w:p>
-      <w:pPr>
-        <w:pStyle w:val="normal1"/>
-        <w:numPr>
-          <w:ilvl w:val="3"/>
-          <w:numId w:val="1"/>
-        </w:numPr>
-        <w:ind w:hanging="360" w:left="2880"/>
-        <w:rPr/>
-      </w:pPr>
-      <w:r>
-        <w:rPr/>
-        <w:t>Defines which page to return</w:t>
-      </w:r>
-    </w:p>
-    <w:p>
-      <w:pPr>
-        <w:pStyle w:val="normal1"/>
-        <w:numPr>
-          <w:ilvl w:val="3"/>
-          <w:numId w:val="1"/>
-        </w:numPr>
-        <w:ind w:hanging="360" w:left="2880"/>
-        <w:rPr/>
-      </w:pPr>
-      <w:r>
-        <w:rPr/>
-        <w:t>First page = 0 (zero)</w:t>
-      </w:r>
-    </w:p>
-    <w:p>
-      <w:pPr>
-        <w:pStyle w:val="normal1"/>
-        <w:numPr>
-          <w:ilvl w:val="2"/>
-          <w:numId w:val="1"/>
-        </w:numPr>
-        <w:ind w:hanging="360" w:left="2160"/>
-        <w:rPr/>
-      </w:pPr>
-      <w:r>
-        <w:rPr/>
-        <w:t>page_size={num_of_rows}</w:t>
-      </w:r>
-    </w:p>
-    <w:p>
-      <w:pPr>
-        <w:pStyle w:val="normal1"/>
-        <w:numPr>
-          <w:ilvl w:val="3"/>
-          <w:numId w:val="1"/>
-        </w:numPr>
-        <w:ind w:hanging="360" w:left="2880"/>
-        <w:rPr>
-          <w:color w:val="FF0000"/>
-        </w:rPr>
-      </w:pPr>
-      <w:r>
-        <w:rPr>
-          <w:color w:val="FF0000"/>
-        </w:rPr>
-        <w:t>Required</w:t>
-      </w:r>
-    </w:p>
-    <w:p>
-      <w:pPr>
-        <w:pStyle w:val="normal1"/>
-        <w:numPr>
-          <w:ilvl w:val="3"/>
-          <w:numId w:val="1"/>
-        </w:numPr>
-        <w:ind w:hanging="360" w:left="2880"/>
-        <w:rPr/>
-      </w:pPr>
-      <w:r>
-        <w:rPr/>
-        <w:t>Defines how many rows to return for the selected page</w:t>
+        <w:t xml:space="preserve">body: </w:t>
+      </w:r>
+    </w:p>
+    <w:p>
+      <w:pPr>
+        <w:pStyle w:val="normal1"/>
+        <w:numPr>
+          <w:ilvl w:val="1"/>
+          <w:numId w:val="1"/>
+        </w:numPr>
+        <w:ind w:hanging="360" w:left="1440"/>
+        <w:rPr/>
+      </w:pPr>
+      <w:r>
+        <w:rPr/>
+        <w:t xml:space="preserve">parameters: </w:t>
       </w:r>
     </w:p>
     <w:p>
@@ -5349,18 +5226,11 @@
         <w:spacing w:lineRule="auto" w:line="276" w:before="0" w:after="0"/>
         <w:ind w:hanging="360" w:left="2160" w:right="0"/>
         <w:jc w:val="left"/>
-        <w:rPr>
-          <w:b w:val="false"/>
-          <w:bCs w:val="false"/>
-        </w:rPr>
-      </w:pPr>
-      <w:r>
-        <w:rPr>
-          <w:b w:val="false"/>
-          <w:bCs w:val="false"/>
-          <w:color w:val="000000"/>
-        </w:rPr>
-        <w:t>a list of Divisions whose parent is the Tournament (the owner of the Divisions)</w:t>
+        <w:rPr/>
+      </w:pPr>
+      <w:r>
+        <w:rPr/>
+        <w:t>the created Create Tournament Applicant</w:t>
       </w:r>
     </w:p>
     <w:p>
@@ -5375,7 +5245,7 @@
       </w:pPr>
       <w:r>
         <w:rPr/>
-        <w:t>POST/Create Division</w:t>
+        <w:t>PUT/Update Create Tournament Applicant</w:t>
       </w:r>
     </w:p>
     <w:p>
@@ -5412,22 +5282,30 @@
       </w:pPr>
       <w:r>
         <w:rPr/>
-        <w:t>HTTP method: ‘POST’</w:t>
-      </w:r>
-    </w:p>
-    <w:p>
-      <w:pPr>
-        <w:pStyle w:val="normal1"/>
-        <w:numPr>
-          <w:ilvl w:val="1"/>
-          <w:numId w:val="1"/>
-        </w:numPr>
-        <w:ind w:hanging="360" w:left="1440"/>
-        <w:rPr/>
-      </w:pPr>
-      <w:r>
-        <w:rPr/>
-        <w:t>endpoint: {base_uri}/api/divisions</w:t>
+        <w:t>HTTP method: ‘PUT’</w:t>
+      </w:r>
+    </w:p>
+    <w:p>
+      <w:pPr>
+        <w:pStyle w:val="normal1"/>
+        <w:numPr>
+          <w:ilvl w:val="1"/>
+          <w:numId w:val="1"/>
+        </w:numPr>
+        <w:ind w:hanging="360" w:left="1440"/>
+        <w:rPr/>
+      </w:pPr>
+      <w:r>
+        <w:rPr/>
+        <w:t>endpoint: {base_uri}/api/</w:t>
+      </w:r>
+      <w:r>
+        <w:rPr/>
+        <w:t>createtournamentapplicants</w:t>
+      </w:r>
+      <w:r>
+        <w:rPr/>
+        <w:t>/{id}</w:t>
       </w:r>
     </w:p>
     <w:p>
@@ -5448,56 +5326,15 @@
     <w:p>
       <w:pPr>
         <w:pStyle w:val="normal1"/>
-        <w:numPr>
-          <w:ilvl w:val="1"/>
-          <w:numId w:val="1"/>
-        </w:numPr>
-        <w:ind w:hanging="360" w:left="1440"/>
-        <w:rPr/>
-      </w:pPr>
-      <w:r>
-        <w:rPr/>
-        <w:t xml:space="preserve">body: </w:t>
-      </w:r>
-    </w:p>
-    <w:p>
-      <w:pPr>
-        <w:pStyle w:val="normal1"/>
-        <w:numPr>
-          <w:ilvl w:val="1"/>
-          <w:numId w:val="1"/>
-        </w:numPr>
-        <w:ind w:hanging="360" w:left="1440"/>
-        <w:rPr/>
-      </w:pPr>
-      <w:r>
-        <w:rPr/>
-        <w:t xml:space="preserve">parameters: </w:t>
-      </w:r>
-    </w:p>
-    <w:p>
-      <w:pPr>
-        <w:pStyle w:val="normal1"/>
-        <w:numPr>
-          <w:ilvl w:val="1"/>
-          <w:numId w:val="1"/>
-        </w:numPr>
-        <w:ind w:hanging="360" w:left="1440"/>
-        <w:rPr/>
-      </w:pPr>
-      <w:r>
-        <w:rPr/>
-        <w:t xml:space="preserve">returns: </w:t>
-      </w:r>
-    </w:p>
-    <w:p>
-      <w:pPr>
-        <w:pStyle w:val="normal1"/>
         <w:widowControl/>
         <w:numPr>
           <w:ilvl w:val="2"/>
           <w:numId w:val="1"/>
         </w:numPr>
+        <w:tabs>
+          <w:tab w:val="clear" w:pos="720"/>
+          <w:tab w:val="left" w:pos="2160" w:leader="none"/>
+        </w:tabs>
         <w:suppressAutoHyphens w:val="true"/>
         <w:bidi w:val="0"/>
         <w:spacing w:lineRule="auto" w:line="276" w:before="0" w:after="0"/>
@@ -5507,89 +5344,7 @@
       </w:pPr>
       <w:r>
         <w:rPr/>
-        <w:t>the created Division</w:t>
-      </w:r>
-    </w:p>
-    <w:p>
-      <w:pPr>
-        <w:pStyle w:val="normal1"/>
-        <w:numPr>
-          <w:ilvl w:val="0"/>
-          <w:numId w:val="1"/>
-        </w:numPr>
-        <w:ind w:hanging="360" w:left="720"/>
-        <w:rPr/>
-      </w:pPr>
-      <w:r>
-        <w:rPr/>
-        <w:t>PUT/Update Division</w:t>
-      </w:r>
-    </w:p>
-    <w:p>
-      <w:pPr>
-        <w:pStyle w:val="normal1"/>
-        <w:numPr>
-          <w:ilvl w:val="1"/>
-          <w:numId w:val="1"/>
-        </w:numPr>
-        <w:ind w:hanging="360" w:left="1440"/>
-        <w:rPr/>
-      </w:pPr>
-      <w:r>
-        <w:rPr/>
-        <w:t xml:space="preserve">built_including_tests: </w:t>
-      </w:r>
-      <w:r>
-        <w:rPr>
-          <w:b/>
-          <w:bCs/>
-        </w:rPr>
-        <w:t>true</w:t>
-      </w:r>
-    </w:p>
-    <w:p>
-      <w:pPr>
-        <w:pStyle w:val="normal1"/>
-        <w:numPr>
-          <w:ilvl w:val="1"/>
-          <w:numId w:val="1"/>
-        </w:numPr>
-        <w:ind w:hanging="360" w:left="1440"/>
-        <w:rPr/>
-      </w:pPr>
-      <w:r>
-        <w:rPr/>
-        <w:t>HTTP method: ‘PUT’</w:t>
-      </w:r>
-    </w:p>
-    <w:p>
-      <w:pPr>
-        <w:pStyle w:val="normal1"/>
-        <w:numPr>
-          <w:ilvl w:val="1"/>
-          <w:numId w:val="1"/>
-        </w:numPr>
-        <w:ind w:hanging="360" w:left="1440"/>
-        <w:rPr/>
-      </w:pPr>
-      <w:r>
-        <w:rPr/>
-        <w:t>endpoint: {base_uri}/api/divisions/{id}</w:t>
-      </w:r>
-    </w:p>
-    <w:p>
-      <w:pPr>
-        <w:pStyle w:val="normal1"/>
-        <w:numPr>
-          <w:ilvl w:val="1"/>
-          <w:numId w:val="1"/>
-        </w:numPr>
-        <w:ind w:hanging="360" w:left="1440"/>
-        <w:rPr/>
-      </w:pPr>
-      <w:r>
-        <w:rPr/>
-        <w:t xml:space="preserve">description: </w:t>
+        <w:t>*If ‘status’ is being set to ‘approved’, then additionally the applicant is given role ‘tournamentowner’ which includes permissions ‘tournament:create’ and ‘tournamentgroup:create’.</w:t>
       </w:r>
     </w:p>
     <w:p>
@@ -5697,7 +5452,7 @@
         <w:rPr>
           <w:color w:val="000000"/>
         </w:rPr>
-        <w:t>ID of the Division to be updated</w:t>
+        <w:t>ID of the Create Tournament Applicant to be updated</w:t>
       </w:r>
     </w:p>
     <w:p>
@@ -5738,7 +5493,7 @@
         <w:rPr>
           <w:color w:val="000000"/>
         </w:rPr>
-        <w:t>the updated Division</w:t>
+        <w:t>the updated Create Tournament Applicant</w:t>
       </w:r>
     </w:p>
     <w:p>
@@ -5753,7 +5508,7 @@
       </w:pPr>
       <w:r>
         <w:rPr/>
-        <w:t>DELETE Division (by ID)</w:t>
+        <w:t>DELETE Create Tournament Applicant (by ID)</w:t>
       </w:r>
     </w:p>
     <w:p>
@@ -5805,7 +5560,15 @@
       </w:pPr>
       <w:r>
         <w:rPr/>
-        <w:t>endpoint: {base_uri}/api/divisions/{id}</w:t>
+        <w:t>endpoint: {base_uri}/api/</w:t>
+      </w:r>
+      <w:r>
+        <w:rPr/>
+        <w:t>createtournamentapplicants</w:t>
+      </w:r>
+      <w:r>
+        <w:rPr/>
+        <w:t>/{id}</w:t>
       </w:r>
     </w:p>
     <w:p>
@@ -5890,13 +5653,12 @@
         <w:ind w:hanging="360" w:left="360" w:right="0"/>
         <w:jc w:val="left"/>
         <w:rPr>
-          <w:color w:val="000000"/>
-        </w:rPr>
-      </w:pPr>
-      <w:r>
-        <w:rPr>
-          <w:color w:val="000000"/>
-        </w:rPr>
+          <w:b/>
+          <w:bCs/>
+        </w:rPr>
+      </w:pPr>
+      <w:r>
+        <w:rPr/>
       </w:r>
     </w:p>
     <w:p>
@@ -5909,13 +5671,12 @@
         <w:ind w:hanging="360" w:left="360" w:right="0"/>
         <w:jc w:val="left"/>
         <w:rPr>
-          <w:color w:val="000000"/>
-        </w:rPr>
-      </w:pPr>
-      <w:r>
-        <w:rPr>
-          <w:color w:val="000000"/>
-        </w:rPr>
+          <w:b/>
+          <w:bCs/>
+        </w:rPr>
+      </w:pPr>
+      <w:r>
+        <w:rPr/>
       </w:r>
     </w:p>
     <w:p>
@@ -5930,7 +5691,6 @@
         <w:rPr>
           <w:b/>
           <w:bCs/>
-          <w:color w:val="000000"/>
         </w:rPr>
       </w:pPr>
       <w:r>
@@ -5939,100 +5699,447 @@
           <w:bCs/>
           <w:color w:val="000000"/>
         </w:rPr>
-      </w:r>
-    </w:p>
-    <w:p>
-      <w:pPr>
-        <w:pStyle w:val="normal1"/>
+        <w:t>Divisions</w:t>
+      </w:r>
+    </w:p>
+    <w:p>
+      <w:pPr>
+        <w:pStyle w:val="normal1"/>
+        <w:numPr>
+          <w:ilvl w:val="0"/>
+          <w:numId w:val="1"/>
+        </w:numPr>
+        <w:ind w:hanging="360" w:left="720"/>
+        <w:rPr/>
+      </w:pPr>
+      <w:r>
+        <w:rPr/>
+        <w:t>GET All Divisions</w:t>
+      </w:r>
+    </w:p>
+    <w:p>
+      <w:pPr>
+        <w:pStyle w:val="normal1"/>
+        <w:numPr>
+          <w:ilvl w:val="1"/>
+          <w:numId w:val="1"/>
+        </w:numPr>
+        <w:ind w:hanging="360" w:left="1440"/>
+        <w:rPr/>
+      </w:pPr>
+      <w:r>
+        <w:rPr/>
+        <w:t xml:space="preserve">built_including_tests: </w:t>
+      </w:r>
+      <w:r>
         <w:rPr>
           <w:b/>
           <w:bCs/>
-          <w:highlight w:val="none"/>
-          <w:shd w:fill="auto" w:val="clear"/>
-        </w:rPr>
-      </w:pPr>
+        </w:rPr>
+        <w:t>true</w:t>
+      </w:r>
+    </w:p>
+    <w:p>
+      <w:pPr>
+        <w:pStyle w:val="normal1"/>
+        <w:numPr>
+          <w:ilvl w:val="1"/>
+          <w:numId w:val="1"/>
+        </w:numPr>
+        <w:ind w:hanging="360" w:left="1440"/>
+        <w:rPr/>
+      </w:pPr>
+      <w:r>
+        <w:rPr/>
+        <w:t>HTTP method: ‘GET’</w:t>
+      </w:r>
+    </w:p>
+    <w:p>
+      <w:pPr>
+        <w:pStyle w:val="normal1"/>
+        <w:numPr>
+          <w:ilvl w:val="1"/>
+          <w:numId w:val="1"/>
+        </w:numPr>
+        <w:ind w:hanging="360" w:left="1440"/>
+        <w:rPr/>
+      </w:pPr>
+      <w:r>
+        <w:rPr/>
+        <w:t>endpoint: {base_uri}/api/divisions?page={page_num}&amp;page_size={num_of_rows}</w:t>
+      </w:r>
+    </w:p>
+    <w:p>
+      <w:pPr>
+        <w:pStyle w:val="normal1"/>
+        <w:numPr>
+          <w:ilvl w:val="1"/>
+          <w:numId w:val="1"/>
+        </w:numPr>
+        <w:ind w:hanging="360" w:left="1440"/>
+        <w:rPr/>
+      </w:pPr>
+      <w:r>
+        <w:rPr/>
+        <w:t xml:space="preserve">description: </w:t>
+      </w:r>
+    </w:p>
+    <w:p>
+      <w:pPr>
+        <w:pStyle w:val="normal1"/>
+        <w:numPr>
+          <w:ilvl w:val="1"/>
+          <w:numId w:val="1"/>
+        </w:numPr>
+        <w:ind w:hanging="360" w:left="1440"/>
+        <w:rPr/>
+      </w:pPr>
+      <w:r>
+        <w:rPr/>
+        <w:t xml:space="preserve">parameters: </w:t>
+      </w:r>
+    </w:p>
+    <w:p>
+      <w:pPr>
+        <w:pStyle w:val="normal1"/>
+        <w:numPr>
+          <w:ilvl w:val="2"/>
+          <w:numId w:val="1"/>
+        </w:numPr>
+        <w:ind w:hanging="360" w:left="2160"/>
+        <w:rPr/>
+      </w:pPr>
+      <w:r>
+        <w:rPr/>
+        <w:t>page={page_num}</w:t>
+      </w:r>
+    </w:p>
+    <w:p>
+      <w:pPr>
+        <w:pStyle w:val="normal1"/>
+        <w:numPr>
+          <w:ilvl w:val="3"/>
+          <w:numId w:val="1"/>
+        </w:numPr>
+        <w:ind w:hanging="360" w:left="2880"/>
+        <w:rPr>
+          <w:color w:val="FF0000"/>
+        </w:rPr>
+      </w:pPr>
+      <w:r>
+        <w:rPr>
+          <w:color w:val="FF0000"/>
+        </w:rPr>
+        <w:t>Required</w:t>
+      </w:r>
+    </w:p>
+    <w:p>
+      <w:pPr>
+        <w:pStyle w:val="normal1"/>
+        <w:numPr>
+          <w:ilvl w:val="3"/>
+          <w:numId w:val="1"/>
+        </w:numPr>
+        <w:ind w:hanging="360" w:left="2880"/>
+        <w:rPr/>
+      </w:pPr>
+      <w:r>
+        <w:rPr/>
+        <w:t>Defines which page to return</w:t>
+      </w:r>
+    </w:p>
+    <w:p>
+      <w:pPr>
+        <w:pStyle w:val="normal1"/>
+        <w:numPr>
+          <w:ilvl w:val="3"/>
+          <w:numId w:val="1"/>
+        </w:numPr>
+        <w:ind w:hanging="360" w:left="2880"/>
+        <w:rPr/>
+      </w:pPr>
+      <w:r>
+        <w:rPr/>
+        <w:t>First page = 0 (zero)</w:t>
+      </w:r>
+    </w:p>
+    <w:p>
+      <w:pPr>
+        <w:pStyle w:val="normal1"/>
+        <w:numPr>
+          <w:ilvl w:val="2"/>
+          <w:numId w:val="1"/>
+        </w:numPr>
+        <w:ind w:hanging="360" w:left="2160"/>
+        <w:rPr/>
+      </w:pPr>
+      <w:r>
+        <w:rPr/>
+        <w:t>page_size={num_of_rows}</w:t>
+      </w:r>
+    </w:p>
+    <w:p>
+      <w:pPr>
+        <w:pStyle w:val="normal1"/>
+        <w:numPr>
+          <w:ilvl w:val="3"/>
+          <w:numId w:val="1"/>
+        </w:numPr>
+        <w:ind w:hanging="360" w:left="2880"/>
+        <w:rPr>
+          <w:color w:val="FF0000"/>
+        </w:rPr>
+      </w:pPr>
+      <w:r>
+        <w:rPr>
+          <w:color w:val="FF0000"/>
+        </w:rPr>
+        <w:t>Required</w:t>
+      </w:r>
+    </w:p>
+    <w:p>
+      <w:pPr>
+        <w:pStyle w:val="normal1"/>
+        <w:numPr>
+          <w:ilvl w:val="3"/>
+          <w:numId w:val="1"/>
+        </w:numPr>
+        <w:ind w:hanging="360" w:left="2880"/>
+        <w:rPr/>
+      </w:pPr>
+      <w:r>
+        <w:rPr/>
+        <w:t>Defines how many rows to return for the selected page</w:t>
+      </w:r>
+    </w:p>
+    <w:p>
+      <w:pPr>
+        <w:pStyle w:val="normal1"/>
+        <w:numPr>
+          <w:ilvl w:val="1"/>
+          <w:numId w:val="1"/>
+        </w:numPr>
+        <w:ind w:hanging="360" w:left="1440"/>
+        <w:rPr/>
+      </w:pPr>
+      <w:r>
+        <w:rPr/>
+        <w:t xml:space="preserve">returns: </w:t>
+      </w:r>
+    </w:p>
+    <w:p>
+      <w:pPr>
+        <w:pStyle w:val="normal1"/>
+        <w:numPr>
+          <w:ilvl w:val="0"/>
+          <w:numId w:val="1"/>
+        </w:numPr>
+        <w:ind w:hanging="360" w:left="720"/>
+        <w:rPr/>
+      </w:pPr>
+      <w:r>
+        <w:rPr/>
+        <w:t>GET Division by ID</w:t>
+      </w:r>
+    </w:p>
+    <w:p>
+      <w:pPr>
+        <w:pStyle w:val="normal1"/>
+        <w:numPr>
+          <w:ilvl w:val="1"/>
+          <w:numId w:val="1"/>
+        </w:numPr>
+        <w:ind w:hanging="360" w:left="1440"/>
+        <w:rPr/>
+      </w:pPr>
+      <w:r>
+        <w:rPr/>
+        <w:t xml:space="preserve">built_including_tests: </w:t>
+      </w:r>
       <w:r>
         <w:rPr>
           <w:b/>
           <w:bCs/>
-          <w:shd w:fill="auto" w:val="clear"/>
-        </w:rPr>
-        <w:t>Equipment</w:t>
-      </w:r>
-    </w:p>
-    <w:p>
-      <w:pPr>
-        <w:pStyle w:val="normal1"/>
-        <w:numPr>
-          <w:ilvl w:val="0"/>
-          <w:numId w:val="1"/>
-        </w:numPr>
-        <w:ind w:hanging="360" w:left="720"/>
-        <w:rPr>
-          <w:highlight w:val="none"/>
-          <w:shd w:fill="auto" w:val="clear"/>
-        </w:rPr>
-      </w:pPr>
-      <w:r>
-        <w:rPr>
-          <w:shd w:fill="auto" w:val="clear"/>
-        </w:rPr>
-        <w:t xml:space="preserve">GET All </w:t>
-      </w:r>
-      <w:r>
-        <w:rPr>
-          <w:b w:val="false"/>
-          <w:bCs w:val="false"/>
-          <w:shd w:fill="auto" w:val="clear"/>
-        </w:rPr>
-        <w:t>Equipment</w:t>
-      </w:r>
-    </w:p>
-    <w:p>
-      <w:pPr>
-        <w:pStyle w:val="normal1"/>
-        <w:numPr>
-          <w:ilvl w:val="1"/>
-          <w:numId w:val="1"/>
-        </w:numPr>
-        <w:ind w:hanging="360" w:left="1440"/>
-        <w:rPr>
-          <w:highlight w:val="none"/>
-          <w:shd w:fill="auto" w:val="clear"/>
-        </w:rPr>
-      </w:pPr>
-      <w:r>
-        <w:rPr>
-          <w:shd w:fill="auto" w:val="clear"/>
-        </w:rPr>
-        <w:t xml:space="preserve">built_including_tests: </w:t>
-      </w:r>
-      <w:r>
+        </w:rPr>
+        <w:t>true</w:t>
+      </w:r>
+    </w:p>
+    <w:p>
+      <w:pPr>
+        <w:pStyle w:val="normal1"/>
+        <w:numPr>
+          <w:ilvl w:val="1"/>
+          <w:numId w:val="1"/>
+        </w:numPr>
+        <w:ind w:hanging="360" w:left="1440"/>
+        <w:rPr/>
+      </w:pPr>
+      <w:r>
+        <w:rPr/>
+        <w:t>HTTP method: ‘GET’</w:t>
+      </w:r>
+    </w:p>
+    <w:p>
+      <w:pPr>
+        <w:pStyle w:val="normal1"/>
+        <w:numPr>
+          <w:ilvl w:val="1"/>
+          <w:numId w:val="1"/>
+        </w:numPr>
+        <w:ind w:hanging="360" w:left="1440"/>
+        <w:rPr/>
+      </w:pPr>
+      <w:r>
+        <w:rPr/>
+        <w:t>endpoint: {base_uri}/api/divisions/{id}</w:t>
+      </w:r>
+    </w:p>
+    <w:p>
+      <w:pPr>
+        <w:pStyle w:val="normal1"/>
+        <w:numPr>
+          <w:ilvl w:val="1"/>
+          <w:numId w:val="1"/>
+        </w:numPr>
+        <w:ind w:hanging="360" w:left="1440"/>
+        <w:rPr/>
+      </w:pPr>
+      <w:r>
+        <w:rPr/>
+        <w:t xml:space="preserve">description: </w:t>
+      </w:r>
+    </w:p>
+    <w:p>
+      <w:pPr>
+        <w:pStyle w:val="normal1"/>
+        <w:numPr>
+          <w:ilvl w:val="1"/>
+          <w:numId w:val="1"/>
+        </w:numPr>
+        <w:ind w:hanging="360" w:left="1440"/>
+        <w:rPr/>
+      </w:pPr>
+      <w:r>
+        <w:rPr/>
+        <w:t xml:space="preserve">parameters: </w:t>
+      </w:r>
+    </w:p>
+    <w:p>
+      <w:pPr>
+        <w:pStyle w:val="normal1"/>
+        <w:numPr>
+          <w:ilvl w:val="2"/>
+          <w:numId w:val="1"/>
+        </w:numPr>
+        <w:ind w:hanging="360" w:left="2160"/>
+        <w:rPr/>
+      </w:pPr>
+      <w:r>
+        <w:rPr/>
+        <w:t>id</w:t>
+      </w:r>
+    </w:p>
+    <w:p>
+      <w:pPr>
+        <w:pStyle w:val="normal1"/>
+        <w:numPr>
+          <w:ilvl w:val="3"/>
+          <w:numId w:val="1"/>
+        </w:numPr>
+        <w:ind w:hanging="360" w:left="2880"/>
+        <w:rPr>
+          <w:color w:val="FF0000"/>
+        </w:rPr>
+      </w:pPr>
+      <w:r>
+        <w:rPr>
+          <w:color w:val="FF0000"/>
+        </w:rPr>
+        <w:t>Required</w:t>
+      </w:r>
+    </w:p>
+    <w:p>
+      <w:pPr>
+        <w:pStyle w:val="normal1"/>
+        <w:numPr>
+          <w:ilvl w:val="3"/>
+          <w:numId w:val="1"/>
+        </w:numPr>
+        <w:ind w:hanging="360" w:left="2880"/>
+        <w:rPr/>
+      </w:pPr>
+      <w:r>
+        <w:rPr/>
+        <w:t>ID of the Division to receive</w:t>
+      </w:r>
+    </w:p>
+    <w:p>
+      <w:pPr>
+        <w:pStyle w:val="normal1"/>
+        <w:numPr>
+          <w:ilvl w:val="1"/>
+          <w:numId w:val="1"/>
+        </w:numPr>
+        <w:ind w:hanging="360" w:left="1440"/>
         <w:rPr>
           <w:b/>
           <w:bCs/>
-          <w:shd w:fill="auto" w:val="clear"/>
-        </w:rPr>
-        <w:t>false</w:t>
-      </w:r>
-    </w:p>
-    <w:p>
-      <w:pPr>
-        <w:pStyle w:val="normal1"/>
-        <w:numPr>
-          <w:ilvl w:val="1"/>
-          <w:numId w:val="1"/>
-        </w:numPr>
-        <w:ind w:hanging="360" w:left="1440"/>
-        <w:rPr>
-          <w:highlight w:val="none"/>
-          <w:shd w:fill="auto" w:val="clear"/>
-        </w:rPr>
-      </w:pPr>
-      <w:r>
-        <w:rPr>
-          <w:shd w:fill="auto" w:val="clear"/>
-        </w:rPr>
+        </w:rPr>
+      </w:pPr>
+      <w:r>
+        <w:rPr/>
+        <w:t xml:space="preserve">returns: </w:t>
+      </w:r>
+    </w:p>
+    <w:p>
+      <w:pPr>
+        <w:pStyle w:val="normal1"/>
+        <w:numPr>
+          <w:ilvl w:val="0"/>
+          <w:numId w:val="1"/>
+        </w:numPr>
+        <w:ind w:hanging="360" w:left="720"/>
+        <w:rPr/>
+      </w:pPr>
+      <w:r>
+        <w:rPr/>
+        <w:t>GET Divisions of Tournament</w:t>
+      </w:r>
+    </w:p>
+    <w:p>
+      <w:pPr>
+        <w:pStyle w:val="normal1"/>
+        <w:numPr>
+          <w:ilvl w:val="1"/>
+          <w:numId w:val="1"/>
+        </w:numPr>
+        <w:ind w:hanging="360" w:left="1440"/>
+        <w:rPr/>
+      </w:pPr>
+      <w:r>
+        <w:rPr/>
+        <w:t xml:space="preserve">built_including_tests: </w:t>
+      </w:r>
+      <w:r>
+        <w:rPr>
+          <w:b/>
+          <w:bCs/>
+        </w:rPr>
+        <w:t>true</w:t>
+      </w:r>
+    </w:p>
+    <w:p>
+      <w:pPr>
+        <w:pStyle w:val="normal1"/>
+        <w:numPr>
+          <w:ilvl w:val="1"/>
+          <w:numId w:val="1"/>
+        </w:numPr>
+        <w:ind w:hanging="360" w:left="1440"/>
+        <w:rPr/>
+      </w:pPr>
+      <w:r>
+        <w:rPr/>
         <w:t>HTTP method: ‘GET’</w:t>
       </w:r>
     </w:p>
@@ -6044,35 +6151,25 @@
           <w:numId w:val="1"/>
         </w:numPr>
         <w:ind w:hanging="360" w:left="1440"/>
-        <w:rPr>
-          <w:highlight w:val="none"/>
-          <w:shd w:fill="auto" w:val="clear"/>
-        </w:rPr>
-      </w:pPr>
-      <w:r>
-        <w:rPr>
-          <w:shd w:fill="auto" w:val="clear"/>
-        </w:rPr>
-        <w:t>endpoint: {base_uri}/api/equipment?page={page_num}&amp;page_size={num_of_rows}</w:t>
-      </w:r>
-    </w:p>
-    <w:p>
-      <w:pPr>
-        <w:pStyle w:val="normal1"/>
-        <w:numPr>
-          <w:ilvl w:val="1"/>
-          <w:numId w:val="1"/>
-        </w:numPr>
-        <w:ind w:hanging="360" w:left="1440"/>
-        <w:rPr>
-          <w:highlight w:val="none"/>
-          <w:shd w:fill="auto" w:val="clear"/>
-        </w:rPr>
-      </w:pPr>
-      <w:r>
-        <w:rPr>
-          <w:shd w:fill="auto" w:val="clear"/>
-        </w:rPr>
+        <w:rPr/>
+      </w:pPr>
+      <w:r>
+        <w:rPr/>
+        <w:t>endpoint: {base_uri}/api/tournaments/{id}/divisions?page={page_num}&amp;page_size={num_of_rows}</w:t>
+      </w:r>
+    </w:p>
+    <w:p>
+      <w:pPr>
+        <w:pStyle w:val="normal1"/>
+        <w:numPr>
+          <w:ilvl w:val="1"/>
+          <w:numId w:val="1"/>
+        </w:numPr>
+        <w:ind w:hanging="360" w:left="1440"/>
+        <w:rPr/>
+      </w:pPr>
+      <w:r>
+        <w:rPr/>
         <w:t xml:space="preserve">description: </w:t>
       </w:r>
     </w:p>
@@ -6084,16 +6181,11 @@
           <w:numId w:val="1"/>
         </w:numPr>
         <w:ind w:hanging="360" w:left="1440"/>
-        <w:rPr>
-          <w:highlight w:val="none"/>
-          <w:shd w:fill="auto" w:val="clear"/>
-        </w:rPr>
-      </w:pPr>
-      <w:r>
-        <w:rPr>
-          <w:shd w:fill="auto" w:val="clear"/>
-        </w:rPr>
-        <w:t xml:space="preserve">parameters: </w:t>
+        <w:rPr/>
+      </w:pPr>
+      <w:r>
+        <w:rPr/>
+        <w:t>parameters:</w:t>
       </w:r>
     </w:p>
     <w:p>
@@ -6104,15 +6196,59 @@
           <w:numId w:val="1"/>
         </w:numPr>
         <w:ind w:hanging="360" w:left="2160"/>
-        <w:rPr>
-          <w:highlight w:val="none"/>
-          <w:shd w:fill="auto" w:val="clear"/>
-        </w:rPr>
-      </w:pPr>
-      <w:r>
-        <w:rPr>
-          <w:shd w:fill="auto" w:val="clear"/>
-        </w:rPr>
+        <w:rPr/>
+      </w:pPr>
+      <w:r>
+        <w:rPr/>
+        <w:t>id</w:t>
+      </w:r>
+    </w:p>
+    <w:p>
+      <w:pPr>
+        <w:pStyle w:val="normal1"/>
+        <w:numPr>
+          <w:ilvl w:val="3"/>
+          <w:numId w:val="1"/>
+        </w:numPr>
+        <w:ind w:hanging="360" w:left="2880"/>
+        <w:rPr>
+          <w:color w:val="FF0000"/>
+        </w:rPr>
+      </w:pPr>
+      <w:r>
+        <w:rPr>
+          <w:color w:val="FF0000"/>
+        </w:rPr>
+        <w:t>Required</w:t>
+      </w:r>
+    </w:p>
+    <w:p>
+      <w:pPr>
+        <w:pStyle w:val="normal1"/>
+        <w:numPr>
+          <w:ilvl w:val="3"/>
+          <w:numId w:val="1"/>
+        </w:numPr>
+        <w:ind w:hanging="360" w:left="2880"/>
+        <w:rPr/>
+      </w:pPr>
+      <w:r>
+        <w:rPr/>
+        <w:t>ID of the Tournament the Divisions belong to</w:t>
+      </w:r>
+    </w:p>
+    <w:p>
+      <w:pPr>
+        <w:pStyle w:val="normal1"/>
+        <w:numPr>
+          <w:ilvl w:val="2"/>
+          <w:numId w:val="1"/>
+        </w:numPr>
+        <w:ind w:hanging="360" w:left="2160"/>
+        <w:rPr/>
+      </w:pPr>
+      <w:r>
+        <w:rPr/>
         <w:t>page={page_num}</w:t>
       </w:r>
     </w:p>
@@ -6125,14 +6261,12 @@
         </w:numPr>
         <w:ind w:hanging="360" w:left="2880"/>
         <w:rPr>
-          <w:highlight w:val="none"/>
-          <w:shd w:fill="auto" w:val="clear"/>
-        </w:rPr>
-      </w:pPr>
-      <w:r>
-        <w:rPr>
           <w:color w:val="FF0000"/>
-          <w:shd w:fill="auto" w:val="clear"/>
+        </w:rPr>
+      </w:pPr>
+      <w:r>
+        <w:rPr>
+          <w:color w:val="FF0000"/>
         </w:rPr>
         <w:t>Required</w:t>
       </w:r>
@@ -6145,15 +6279,10 @@
           <w:numId w:val="1"/>
         </w:numPr>
         <w:ind w:hanging="360" w:left="2880"/>
-        <w:rPr>
-          <w:highlight w:val="none"/>
-          <w:shd w:fill="auto" w:val="clear"/>
-        </w:rPr>
-      </w:pPr>
-      <w:r>
-        <w:rPr>
-          <w:shd w:fill="auto" w:val="clear"/>
-        </w:rPr>
+        <w:rPr/>
+      </w:pPr>
+      <w:r>
+        <w:rPr/>
         <w:t>Defines which page to return</w:t>
       </w:r>
     </w:p>
@@ -6165,15 +6294,10 @@
           <w:numId w:val="1"/>
         </w:numPr>
         <w:ind w:hanging="360" w:left="2880"/>
-        <w:rPr>
-          <w:highlight w:val="none"/>
-          <w:shd w:fill="auto" w:val="clear"/>
-        </w:rPr>
-      </w:pPr>
-      <w:r>
-        <w:rPr>
-          <w:shd w:fill="auto" w:val="clear"/>
-        </w:rPr>
+        <w:rPr/>
+      </w:pPr>
+      <w:r>
+        <w:rPr/>
         <w:t>First page = 0 (zero)</w:t>
       </w:r>
     </w:p>
@@ -6185,15 +6309,10 @@
           <w:numId w:val="1"/>
         </w:numPr>
         <w:ind w:hanging="360" w:left="2160"/>
-        <w:rPr>
-          <w:highlight w:val="none"/>
-          <w:shd w:fill="auto" w:val="clear"/>
-        </w:rPr>
-      </w:pPr>
-      <w:r>
-        <w:rPr>
-          <w:shd w:fill="auto" w:val="clear"/>
-        </w:rPr>
+        <w:rPr/>
+      </w:pPr>
+      <w:r>
+        <w:rPr/>
         <w:t>page_size={num_of_rows}</w:t>
       </w:r>
     </w:p>
@@ -6206,14 +6325,12 @@
         </w:numPr>
         <w:ind w:hanging="360" w:left="2880"/>
         <w:rPr>
-          <w:highlight w:val="none"/>
-          <w:shd w:fill="auto" w:val="clear"/>
-        </w:rPr>
-      </w:pPr>
-      <w:r>
-        <w:rPr>
           <w:color w:val="FF0000"/>
-          <w:shd w:fill="auto" w:val="clear"/>
+        </w:rPr>
+      </w:pPr>
+      <w:r>
+        <w:rPr>
+          <w:color w:val="FF0000"/>
         </w:rPr>
         <w:t>Required</w:t>
       </w:r>
@@ -6226,15 +6343,10 @@
           <w:numId w:val="1"/>
         </w:numPr>
         <w:ind w:hanging="360" w:left="2880"/>
-        <w:rPr>
-          <w:highlight w:val="none"/>
-          <w:shd w:fill="auto" w:val="clear"/>
-        </w:rPr>
-      </w:pPr>
-      <w:r>
-        <w:rPr>
-          <w:shd w:fill="auto" w:val="clear"/>
-        </w:rPr>
+        <w:rPr/>
+      </w:pPr>
+      <w:r>
+        <w:rPr/>
         <w:t>Defines how many rows to return for the selected page</w:t>
       </w:r>
     </w:p>
@@ -6246,15 +6358,10 @@
           <w:numId w:val="1"/>
         </w:numPr>
         <w:ind w:hanging="360" w:left="1440"/>
-        <w:rPr>
-          <w:highlight w:val="none"/>
-          <w:shd w:fill="auto" w:val="clear"/>
-        </w:rPr>
-      </w:pPr>
-      <w:r>
-        <w:rPr>
-          <w:shd w:fill="auto" w:val="clear"/>
-        </w:rPr>
+        <w:rPr/>
+      </w:pPr>
+      <w:r>
+        <w:rPr/>
         <w:t xml:space="preserve">returns: </w:t>
       </w:r>
     </w:p>
@@ -6272,6 +6379,928 @@
         <w:ind w:hanging="360" w:left="2160" w:right="0"/>
         <w:jc w:val="left"/>
         <w:rPr>
+          <w:b w:val="false"/>
+          <w:bCs w:val="false"/>
+        </w:rPr>
+      </w:pPr>
+      <w:r>
+        <w:rPr>
+          <w:b w:val="false"/>
+          <w:bCs w:val="false"/>
+          <w:color w:val="000000"/>
+        </w:rPr>
+        <w:t>a list of Divisions whose parent is the Tournament (the owner of the Divisions)</w:t>
+      </w:r>
+    </w:p>
+    <w:p>
+      <w:pPr>
+        <w:pStyle w:val="normal1"/>
+        <w:numPr>
+          <w:ilvl w:val="0"/>
+          <w:numId w:val="1"/>
+        </w:numPr>
+        <w:ind w:hanging="360" w:left="720"/>
+        <w:rPr/>
+      </w:pPr>
+      <w:r>
+        <w:rPr/>
+        <w:t>POST/Create Division</w:t>
+      </w:r>
+    </w:p>
+    <w:p>
+      <w:pPr>
+        <w:pStyle w:val="normal1"/>
+        <w:numPr>
+          <w:ilvl w:val="1"/>
+          <w:numId w:val="1"/>
+        </w:numPr>
+        <w:ind w:hanging="360" w:left="1440"/>
+        <w:rPr/>
+      </w:pPr>
+      <w:r>
+        <w:rPr/>
+        <w:t xml:space="preserve">built_including_tests: </w:t>
+      </w:r>
+      <w:r>
+        <w:rPr>
+          <w:b/>
+          <w:bCs/>
+        </w:rPr>
+        <w:t>true</w:t>
+      </w:r>
+    </w:p>
+    <w:p>
+      <w:pPr>
+        <w:pStyle w:val="normal1"/>
+        <w:numPr>
+          <w:ilvl w:val="1"/>
+          <w:numId w:val="1"/>
+        </w:numPr>
+        <w:ind w:hanging="360" w:left="1440"/>
+        <w:rPr/>
+      </w:pPr>
+      <w:r>
+        <w:rPr/>
+        <w:t>HTTP method: ‘POST’</w:t>
+      </w:r>
+    </w:p>
+    <w:p>
+      <w:pPr>
+        <w:pStyle w:val="normal1"/>
+        <w:numPr>
+          <w:ilvl w:val="1"/>
+          <w:numId w:val="1"/>
+        </w:numPr>
+        <w:ind w:hanging="360" w:left="1440"/>
+        <w:rPr/>
+      </w:pPr>
+      <w:r>
+        <w:rPr/>
+        <w:t>endpoint: {base_uri}/api/divisions</w:t>
+      </w:r>
+    </w:p>
+    <w:p>
+      <w:pPr>
+        <w:pStyle w:val="normal1"/>
+        <w:numPr>
+          <w:ilvl w:val="1"/>
+          <w:numId w:val="1"/>
+        </w:numPr>
+        <w:ind w:hanging="360" w:left="1440"/>
+        <w:rPr/>
+      </w:pPr>
+      <w:r>
+        <w:rPr/>
+        <w:t xml:space="preserve">description: </w:t>
+      </w:r>
+    </w:p>
+    <w:p>
+      <w:pPr>
+        <w:pStyle w:val="normal1"/>
+        <w:numPr>
+          <w:ilvl w:val="1"/>
+          <w:numId w:val="1"/>
+        </w:numPr>
+        <w:ind w:hanging="360" w:left="1440"/>
+        <w:rPr/>
+      </w:pPr>
+      <w:r>
+        <w:rPr/>
+        <w:t xml:space="preserve">body: </w:t>
+      </w:r>
+    </w:p>
+    <w:p>
+      <w:pPr>
+        <w:pStyle w:val="normal1"/>
+        <w:numPr>
+          <w:ilvl w:val="1"/>
+          <w:numId w:val="1"/>
+        </w:numPr>
+        <w:ind w:hanging="360" w:left="1440"/>
+        <w:rPr/>
+      </w:pPr>
+      <w:r>
+        <w:rPr/>
+        <w:t xml:space="preserve">parameters: </w:t>
+      </w:r>
+    </w:p>
+    <w:p>
+      <w:pPr>
+        <w:pStyle w:val="normal1"/>
+        <w:numPr>
+          <w:ilvl w:val="1"/>
+          <w:numId w:val="1"/>
+        </w:numPr>
+        <w:ind w:hanging="360" w:left="1440"/>
+        <w:rPr/>
+      </w:pPr>
+      <w:r>
+        <w:rPr/>
+        <w:t xml:space="preserve">returns: </w:t>
+      </w:r>
+    </w:p>
+    <w:p>
+      <w:pPr>
+        <w:pStyle w:val="normal1"/>
+        <w:widowControl/>
+        <w:numPr>
+          <w:ilvl w:val="2"/>
+          <w:numId w:val="1"/>
+        </w:numPr>
+        <w:suppressAutoHyphens w:val="true"/>
+        <w:bidi w:val="0"/>
+        <w:spacing w:lineRule="auto" w:line="276" w:before="0" w:after="0"/>
+        <w:ind w:hanging="360" w:left="2160" w:right="0"/>
+        <w:jc w:val="left"/>
+        <w:rPr/>
+      </w:pPr>
+      <w:r>
+        <w:rPr/>
+        <w:t>the created Division</w:t>
+      </w:r>
+    </w:p>
+    <w:p>
+      <w:pPr>
+        <w:pStyle w:val="normal1"/>
+        <w:numPr>
+          <w:ilvl w:val="0"/>
+          <w:numId w:val="1"/>
+        </w:numPr>
+        <w:ind w:hanging="360" w:left="720"/>
+        <w:rPr/>
+      </w:pPr>
+      <w:r>
+        <w:rPr/>
+        <w:t>PUT/Update Division</w:t>
+      </w:r>
+    </w:p>
+    <w:p>
+      <w:pPr>
+        <w:pStyle w:val="normal1"/>
+        <w:numPr>
+          <w:ilvl w:val="1"/>
+          <w:numId w:val="1"/>
+        </w:numPr>
+        <w:ind w:hanging="360" w:left="1440"/>
+        <w:rPr/>
+      </w:pPr>
+      <w:r>
+        <w:rPr/>
+        <w:t xml:space="preserve">built_including_tests: </w:t>
+      </w:r>
+      <w:r>
+        <w:rPr>
+          <w:b/>
+          <w:bCs/>
+        </w:rPr>
+        <w:t>true</w:t>
+      </w:r>
+    </w:p>
+    <w:p>
+      <w:pPr>
+        <w:pStyle w:val="normal1"/>
+        <w:numPr>
+          <w:ilvl w:val="1"/>
+          <w:numId w:val="1"/>
+        </w:numPr>
+        <w:ind w:hanging="360" w:left="1440"/>
+        <w:rPr/>
+      </w:pPr>
+      <w:r>
+        <w:rPr/>
+        <w:t>HTTP method: ‘PUT’</w:t>
+      </w:r>
+    </w:p>
+    <w:p>
+      <w:pPr>
+        <w:pStyle w:val="normal1"/>
+        <w:numPr>
+          <w:ilvl w:val="1"/>
+          <w:numId w:val="1"/>
+        </w:numPr>
+        <w:ind w:hanging="360" w:left="1440"/>
+        <w:rPr/>
+      </w:pPr>
+      <w:r>
+        <w:rPr/>
+        <w:t>endpoint: {base_uri}/api/divisions/{id}</w:t>
+      </w:r>
+    </w:p>
+    <w:p>
+      <w:pPr>
+        <w:pStyle w:val="normal1"/>
+        <w:numPr>
+          <w:ilvl w:val="1"/>
+          <w:numId w:val="1"/>
+        </w:numPr>
+        <w:ind w:hanging="360" w:left="1440"/>
+        <w:rPr/>
+      </w:pPr>
+      <w:r>
+        <w:rPr/>
+        <w:t xml:space="preserve">description: </w:t>
+      </w:r>
+    </w:p>
+    <w:p>
+      <w:pPr>
+        <w:pStyle w:val="normal1"/>
+        <w:numPr>
+          <w:ilvl w:val="1"/>
+          <w:numId w:val="1"/>
+        </w:numPr>
+        <w:ind w:hanging="360" w:left="1440"/>
+        <w:rPr/>
+      </w:pPr>
+      <w:r>
+        <w:rPr/>
+        <w:t xml:space="preserve">body: </w:t>
+      </w:r>
+    </w:p>
+    <w:p>
+      <w:pPr>
+        <w:pStyle w:val="normal1"/>
+        <w:widowControl/>
+        <w:numPr>
+          <w:ilvl w:val="2"/>
+          <w:numId w:val="1"/>
+        </w:numPr>
+        <w:suppressAutoHyphens w:val="true"/>
+        <w:bidi w:val="0"/>
+        <w:spacing w:lineRule="auto" w:line="276" w:before="0" w:after="0"/>
+        <w:ind w:hanging="360" w:left="2160" w:right="0"/>
+        <w:jc w:val="left"/>
+        <w:rPr/>
+      </w:pPr>
+      <w:r>
+        <w:rPr/>
+        <w:t>only fields that you want to update (other than ID in the URI path) need to be provided</w:t>
+      </w:r>
+    </w:p>
+    <w:p>
+      <w:pPr>
+        <w:pStyle w:val="normal1"/>
+        <w:numPr>
+          <w:ilvl w:val="1"/>
+          <w:numId w:val="1"/>
+        </w:numPr>
+        <w:ind w:hanging="360" w:left="1440"/>
+        <w:rPr/>
+      </w:pPr>
+      <w:r>
+        <w:rPr/>
+        <w:t>parameters:</w:t>
+      </w:r>
+    </w:p>
+    <w:p>
+      <w:pPr>
+        <w:pStyle w:val="normal1"/>
+        <w:numPr>
+          <w:ilvl w:val="2"/>
+          <w:numId w:val="1"/>
+        </w:numPr>
+        <w:ind w:hanging="360" w:left="2160"/>
+        <w:rPr/>
+      </w:pPr>
+      <w:r>
+        <w:rPr/>
+        <w:t>id</w:t>
+      </w:r>
+    </w:p>
+    <w:p>
+      <w:pPr>
+        <w:pStyle w:val="normal1"/>
+        <w:numPr>
+          <w:ilvl w:val="3"/>
+          <w:numId w:val="1"/>
+        </w:numPr>
+        <w:ind w:hanging="360" w:left="2880"/>
+        <w:rPr>
+          <w:color w:val="FF0000"/>
+        </w:rPr>
+      </w:pPr>
+      <w:r>
+        <w:rPr>
+          <w:color w:val="FF0000"/>
+        </w:rPr>
+        <w:t>Required</w:t>
+      </w:r>
+    </w:p>
+    <w:p>
+      <w:pPr>
+        <w:pStyle w:val="normal1"/>
+        <w:widowControl/>
+        <w:numPr>
+          <w:ilvl w:val="3"/>
+          <w:numId w:val="1"/>
+        </w:numPr>
+        <w:suppressAutoHyphens w:val="true"/>
+        <w:bidi w:val="0"/>
+        <w:spacing w:lineRule="auto" w:line="276" w:before="0" w:after="0"/>
+        <w:ind w:hanging="360" w:left="2880" w:right="0"/>
+        <w:jc w:val="left"/>
+        <w:rPr>
+          <w:color w:val="000000"/>
+        </w:rPr>
+      </w:pPr>
+      <w:r>
+        <w:rPr>
+          <w:color w:val="000000"/>
+        </w:rPr>
+        <w:t>ID of the Division to be updated</w:t>
+      </w:r>
+    </w:p>
+    <w:p>
+      <w:pPr>
+        <w:pStyle w:val="normal1"/>
+        <w:numPr>
+          <w:ilvl w:val="1"/>
+          <w:numId w:val="1"/>
+        </w:numPr>
+        <w:ind w:hanging="360" w:left="1440"/>
+        <w:rPr>
+          <w:color w:val="000000"/>
+        </w:rPr>
+      </w:pPr>
+      <w:r>
+        <w:rPr/>
+        <w:t xml:space="preserve">returns: </w:t>
+      </w:r>
+    </w:p>
+    <w:p>
+      <w:pPr>
+        <w:pStyle w:val="normal1"/>
+        <w:widowControl/>
+        <w:numPr>
+          <w:ilvl w:val="2"/>
+          <w:numId w:val="1"/>
+        </w:numPr>
+        <w:suppressAutoHyphens w:val="true"/>
+        <w:bidi w:val="0"/>
+        <w:spacing w:lineRule="auto" w:line="276" w:before="0" w:after="0"/>
+        <w:ind w:hanging="360" w:left="2160" w:right="0"/>
+        <w:jc w:val="left"/>
+        <w:rPr>
+          <w:color w:val="000000"/>
+        </w:rPr>
+      </w:pPr>
+      <w:r>
+        <w:rPr>
+          <w:color w:val="000000"/>
+        </w:rPr>
+        <w:t>the updated Division</w:t>
+      </w:r>
+    </w:p>
+    <w:p>
+      <w:pPr>
+        <w:pStyle w:val="normal1"/>
+        <w:numPr>
+          <w:ilvl w:val="0"/>
+          <w:numId w:val="1"/>
+        </w:numPr>
+        <w:ind w:hanging="360" w:left="720"/>
+        <w:rPr/>
+      </w:pPr>
+      <w:r>
+        <w:rPr/>
+        <w:t>DELETE Division (by ID)</w:t>
+      </w:r>
+    </w:p>
+    <w:p>
+      <w:pPr>
+        <w:pStyle w:val="normal1"/>
+        <w:numPr>
+          <w:ilvl w:val="1"/>
+          <w:numId w:val="1"/>
+        </w:numPr>
+        <w:ind w:hanging="360" w:left="1440"/>
+        <w:rPr/>
+      </w:pPr>
+      <w:r>
+        <w:rPr/>
+        <w:t xml:space="preserve">built_including_tests: </w:t>
+      </w:r>
+      <w:r>
+        <w:rPr>
+          <w:b/>
+          <w:bCs/>
+        </w:rPr>
+        <w:t>true</w:t>
+      </w:r>
+    </w:p>
+    <w:p>
+      <w:pPr>
+        <w:pStyle w:val="normal1"/>
+        <w:numPr>
+          <w:ilvl w:val="1"/>
+          <w:numId w:val="1"/>
+        </w:numPr>
+        <w:ind w:hanging="360" w:left="1440"/>
+        <w:rPr/>
+      </w:pPr>
+      <w:r>
+        <w:rPr/>
+        <w:t>HTTP method: ‘DELETE’</w:t>
+      </w:r>
+    </w:p>
+    <w:p>
+      <w:pPr>
+        <w:pStyle w:val="normal1"/>
+        <w:numPr>
+          <w:ilvl w:val="1"/>
+          <w:numId w:val="1"/>
+        </w:numPr>
+        <w:ind w:hanging="360" w:left="1440"/>
+        <w:rPr/>
+      </w:pPr>
+      <w:r>
+        <w:rPr/>
+        <w:t>endpoint: {base_uri}/api/divisions/{id}</w:t>
+      </w:r>
+    </w:p>
+    <w:p>
+      <w:pPr>
+        <w:pStyle w:val="normal1"/>
+        <w:numPr>
+          <w:ilvl w:val="1"/>
+          <w:numId w:val="1"/>
+        </w:numPr>
+        <w:ind w:hanging="360" w:left="1440"/>
+        <w:rPr/>
+      </w:pPr>
+      <w:r>
+        <w:rPr/>
+        <w:t xml:space="preserve">description: </w:t>
+      </w:r>
+    </w:p>
+    <w:p>
+      <w:pPr>
+        <w:pStyle w:val="normal1"/>
+        <w:numPr>
+          <w:ilvl w:val="1"/>
+          <w:numId w:val="1"/>
+        </w:numPr>
+        <w:ind w:hanging="360" w:left="1440"/>
+        <w:rPr/>
+      </w:pPr>
+      <w:r>
+        <w:rPr/>
+        <w:t xml:space="preserve">parameters: </w:t>
+      </w:r>
+    </w:p>
+    <w:p>
+      <w:pPr>
+        <w:pStyle w:val="normal1"/>
+        <w:numPr>
+          <w:ilvl w:val="1"/>
+          <w:numId w:val="1"/>
+        </w:numPr>
+        <w:ind w:hanging="360" w:left="1440"/>
+        <w:rPr/>
+      </w:pPr>
+      <w:r>
+        <w:rPr/>
+        <w:t xml:space="preserve">returns: </w:t>
+      </w:r>
+    </w:p>
+    <w:p>
+      <w:pPr>
+        <w:pStyle w:val="normal1"/>
+        <w:widowControl/>
+        <w:numPr>
+          <w:ilvl w:val="2"/>
+          <w:numId w:val="1"/>
+        </w:numPr>
+        <w:suppressAutoHyphens w:val="true"/>
+        <w:bidi w:val="0"/>
+        <w:spacing w:lineRule="auto" w:line="276" w:before="0" w:after="0"/>
+        <w:ind w:hanging="360" w:left="2160" w:right="0"/>
+        <w:jc w:val="left"/>
+        <w:rPr>
+          <w:b w:val="false"/>
+          <w:bCs w:val="false"/>
+        </w:rPr>
+      </w:pPr>
+      <w:r>
+        <w:rPr>
+          <w:b w:val="false"/>
+          <w:bCs w:val="false"/>
+          <w:color w:val="000000"/>
+        </w:rPr>
+        <w:t>a 200 OK response only</w:t>
+      </w:r>
+    </w:p>
+    <w:p>
+      <w:pPr>
+        <w:pStyle w:val="normal1"/>
+        <w:widowControl/>
+        <w:suppressAutoHyphens w:val="true"/>
+        <w:bidi w:val="0"/>
+        <w:spacing w:lineRule="auto" w:line="276" w:before="0" w:after="0"/>
+        <w:ind w:hanging="360" w:left="360" w:right="0"/>
+        <w:jc w:val="left"/>
+        <w:rPr>
+          <w:color w:val="000000"/>
+        </w:rPr>
+      </w:pPr>
+      <w:r>
+        <w:rPr>
+          <w:color w:val="000000"/>
+        </w:rPr>
+      </w:r>
+    </w:p>
+    <w:p>
+      <w:pPr>
+        <w:pStyle w:val="normal1"/>
+        <w:widowControl/>
+        <w:suppressAutoHyphens w:val="true"/>
+        <w:bidi w:val="0"/>
+        <w:spacing w:lineRule="auto" w:line="276" w:before="0" w:after="0"/>
+        <w:ind w:hanging="360" w:left="360" w:right="0"/>
+        <w:jc w:val="left"/>
+        <w:rPr>
+          <w:color w:val="000000"/>
+        </w:rPr>
+      </w:pPr>
+      <w:r>
+        <w:rPr>
+          <w:color w:val="000000"/>
+        </w:rPr>
+      </w:r>
+    </w:p>
+    <w:p>
+      <w:pPr>
+        <w:pStyle w:val="normal1"/>
+        <w:widowControl/>
+        <w:suppressAutoHyphens w:val="true"/>
+        <w:bidi w:val="0"/>
+        <w:spacing w:lineRule="auto" w:line="276" w:before="0" w:after="0"/>
+        <w:ind w:hanging="360" w:left="360" w:right="0"/>
+        <w:jc w:val="left"/>
+        <w:rPr>
+          <w:b/>
+          <w:bCs/>
+          <w:color w:val="000000"/>
+        </w:rPr>
+      </w:pPr>
+      <w:r>
+        <w:rPr>
+          <w:b/>
+          <w:bCs/>
+          <w:color w:val="000000"/>
+        </w:rPr>
+      </w:r>
+    </w:p>
+    <w:p>
+      <w:pPr>
+        <w:pStyle w:val="normal1"/>
+        <w:rPr>
+          <w:b/>
+          <w:bCs/>
+          <w:highlight w:val="none"/>
+          <w:shd w:fill="auto" w:val="clear"/>
+        </w:rPr>
+      </w:pPr>
+      <w:r>
+        <w:rPr>
+          <w:b/>
+          <w:bCs/>
+          <w:shd w:fill="auto" w:val="clear"/>
+        </w:rPr>
+        <w:t>Equipment</w:t>
+      </w:r>
+    </w:p>
+    <w:p>
+      <w:pPr>
+        <w:pStyle w:val="normal1"/>
+        <w:numPr>
+          <w:ilvl w:val="0"/>
+          <w:numId w:val="1"/>
+        </w:numPr>
+        <w:ind w:hanging="360" w:left="720"/>
+        <w:rPr>
+          <w:highlight w:val="none"/>
+          <w:shd w:fill="auto" w:val="clear"/>
+        </w:rPr>
+      </w:pPr>
+      <w:r>
+        <w:rPr>
+          <w:shd w:fill="auto" w:val="clear"/>
+        </w:rPr>
+        <w:t xml:space="preserve">GET All </w:t>
+      </w:r>
+      <w:r>
+        <w:rPr>
+          <w:b w:val="false"/>
+          <w:bCs w:val="false"/>
+          <w:shd w:fill="auto" w:val="clear"/>
+        </w:rPr>
+        <w:t>Equipment</w:t>
+      </w:r>
+    </w:p>
+    <w:p>
+      <w:pPr>
+        <w:pStyle w:val="normal1"/>
+        <w:numPr>
+          <w:ilvl w:val="1"/>
+          <w:numId w:val="1"/>
+        </w:numPr>
+        <w:ind w:hanging="360" w:left="1440"/>
+        <w:rPr>
+          <w:highlight w:val="none"/>
+          <w:shd w:fill="auto" w:val="clear"/>
+        </w:rPr>
+      </w:pPr>
+      <w:r>
+        <w:rPr>
+          <w:shd w:fill="auto" w:val="clear"/>
+        </w:rPr>
+        <w:t xml:space="preserve">built_including_tests: </w:t>
+      </w:r>
+      <w:r>
+        <w:rPr>
+          <w:b/>
+          <w:bCs/>
+          <w:shd w:fill="auto" w:val="clear"/>
+        </w:rPr>
+        <w:t>false</w:t>
+      </w:r>
+    </w:p>
+    <w:p>
+      <w:pPr>
+        <w:pStyle w:val="normal1"/>
+        <w:numPr>
+          <w:ilvl w:val="1"/>
+          <w:numId w:val="1"/>
+        </w:numPr>
+        <w:ind w:hanging="360" w:left="1440"/>
+        <w:rPr>
+          <w:highlight w:val="none"/>
+          <w:shd w:fill="auto" w:val="clear"/>
+        </w:rPr>
+      </w:pPr>
+      <w:r>
+        <w:rPr>
+          <w:shd w:fill="auto" w:val="clear"/>
+        </w:rPr>
+        <w:t>HTTP method: ‘GET’</w:t>
+      </w:r>
+    </w:p>
+    <w:p>
+      <w:pPr>
+        <w:pStyle w:val="normal1"/>
+        <w:numPr>
+          <w:ilvl w:val="1"/>
+          <w:numId w:val="1"/>
+        </w:numPr>
+        <w:ind w:hanging="360" w:left="1440"/>
+        <w:rPr>
+          <w:highlight w:val="none"/>
+          <w:shd w:fill="auto" w:val="clear"/>
+        </w:rPr>
+      </w:pPr>
+      <w:r>
+        <w:rPr>
+          <w:shd w:fill="auto" w:val="clear"/>
+        </w:rPr>
+        <w:t>endpoint: {base_uri}/api/equipment?page={page_num}&amp;page_size={num_of_rows}</w:t>
+      </w:r>
+    </w:p>
+    <w:p>
+      <w:pPr>
+        <w:pStyle w:val="normal1"/>
+        <w:numPr>
+          <w:ilvl w:val="1"/>
+          <w:numId w:val="1"/>
+        </w:numPr>
+        <w:ind w:hanging="360" w:left="1440"/>
+        <w:rPr>
+          <w:highlight w:val="none"/>
+          <w:shd w:fill="auto" w:val="clear"/>
+        </w:rPr>
+      </w:pPr>
+      <w:r>
+        <w:rPr>
+          <w:shd w:fill="auto" w:val="clear"/>
+        </w:rPr>
+        <w:t xml:space="preserve">description: </w:t>
+      </w:r>
+    </w:p>
+    <w:p>
+      <w:pPr>
+        <w:pStyle w:val="normal1"/>
+        <w:numPr>
+          <w:ilvl w:val="1"/>
+          <w:numId w:val="1"/>
+        </w:numPr>
+        <w:ind w:hanging="360" w:left="1440"/>
+        <w:rPr>
+          <w:highlight w:val="none"/>
+          <w:shd w:fill="auto" w:val="clear"/>
+        </w:rPr>
+      </w:pPr>
+      <w:r>
+        <w:rPr>
+          <w:shd w:fill="auto" w:val="clear"/>
+        </w:rPr>
+        <w:t xml:space="preserve">parameters: </w:t>
+      </w:r>
+    </w:p>
+    <w:p>
+      <w:pPr>
+        <w:pStyle w:val="normal1"/>
+        <w:numPr>
+          <w:ilvl w:val="2"/>
+          <w:numId w:val="1"/>
+        </w:numPr>
+        <w:ind w:hanging="360" w:left="2160"/>
+        <w:rPr>
+          <w:highlight w:val="none"/>
+          <w:shd w:fill="auto" w:val="clear"/>
+        </w:rPr>
+      </w:pPr>
+      <w:r>
+        <w:rPr>
+          <w:shd w:fill="auto" w:val="clear"/>
+        </w:rPr>
+        <w:t>page={page_num}</w:t>
+      </w:r>
+    </w:p>
+    <w:p>
+      <w:pPr>
+        <w:pStyle w:val="normal1"/>
+        <w:numPr>
+          <w:ilvl w:val="3"/>
+          <w:numId w:val="1"/>
+        </w:numPr>
+        <w:ind w:hanging="360" w:left="2880"/>
+        <w:rPr>
+          <w:highlight w:val="none"/>
+          <w:shd w:fill="auto" w:val="clear"/>
+        </w:rPr>
+      </w:pPr>
+      <w:r>
+        <w:rPr>
+          <w:color w:val="FF0000"/>
+          <w:shd w:fill="auto" w:val="clear"/>
+        </w:rPr>
+        <w:t>Required</w:t>
+      </w:r>
+    </w:p>
+    <w:p>
+      <w:pPr>
+        <w:pStyle w:val="normal1"/>
+        <w:numPr>
+          <w:ilvl w:val="3"/>
+          <w:numId w:val="1"/>
+        </w:numPr>
+        <w:ind w:hanging="360" w:left="2880"/>
+        <w:rPr>
+          <w:highlight w:val="none"/>
+          <w:shd w:fill="auto" w:val="clear"/>
+        </w:rPr>
+      </w:pPr>
+      <w:r>
+        <w:rPr>
+          <w:shd w:fill="auto" w:val="clear"/>
+        </w:rPr>
+        <w:t>Defines which page to return</w:t>
+      </w:r>
+    </w:p>
+    <w:p>
+      <w:pPr>
+        <w:pStyle w:val="normal1"/>
+        <w:numPr>
+          <w:ilvl w:val="3"/>
+          <w:numId w:val="1"/>
+        </w:numPr>
+        <w:ind w:hanging="360" w:left="2880"/>
+        <w:rPr>
+          <w:highlight w:val="none"/>
+          <w:shd w:fill="auto" w:val="clear"/>
+        </w:rPr>
+      </w:pPr>
+      <w:r>
+        <w:rPr>
+          <w:shd w:fill="auto" w:val="clear"/>
+        </w:rPr>
+        <w:t>First page = 0 (zero)</w:t>
+      </w:r>
+    </w:p>
+    <w:p>
+      <w:pPr>
+        <w:pStyle w:val="normal1"/>
+        <w:numPr>
+          <w:ilvl w:val="2"/>
+          <w:numId w:val="1"/>
+        </w:numPr>
+        <w:ind w:hanging="360" w:left="2160"/>
+        <w:rPr>
+          <w:highlight w:val="none"/>
+          <w:shd w:fill="auto" w:val="clear"/>
+        </w:rPr>
+      </w:pPr>
+      <w:r>
+        <w:rPr>
+          <w:shd w:fill="auto" w:val="clear"/>
+        </w:rPr>
+        <w:t>page_size={num_of_rows}</w:t>
+      </w:r>
+    </w:p>
+    <w:p>
+      <w:pPr>
+        <w:pStyle w:val="normal1"/>
+        <w:numPr>
+          <w:ilvl w:val="3"/>
+          <w:numId w:val="1"/>
+        </w:numPr>
+        <w:ind w:hanging="360" w:left="2880"/>
+        <w:rPr>
+          <w:highlight w:val="none"/>
+          <w:shd w:fill="auto" w:val="clear"/>
+        </w:rPr>
+      </w:pPr>
+      <w:r>
+        <w:rPr>
+          <w:color w:val="FF0000"/>
+          <w:shd w:fill="auto" w:val="clear"/>
+        </w:rPr>
+        <w:t>Required</w:t>
+      </w:r>
+    </w:p>
+    <w:p>
+      <w:pPr>
+        <w:pStyle w:val="normal1"/>
+        <w:numPr>
+          <w:ilvl w:val="3"/>
+          <w:numId w:val="1"/>
+        </w:numPr>
+        <w:ind w:hanging="360" w:left="2880"/>
+        <w:rPr>
+          <w:highlight w:val="none"/>
+          <w:shd w:fill="auto" w:val="clear"/>
+        </w:rPr>
+      </w:pPr>
+      <w:r>
+        <w:rPr>
+          <w:shd w:fill="auto" w:val="clear"/>
+        </w:rPr>
+        <w:t>Defines how many rows to return for the selected page</w:t>
+      </w:r>
+    </w:p>
+    <w:p>
+      <w:pPr>
+        <w:pStyle w:val="normal1"/>
+        <w:numPr>
+          <w:ilvl w:val="1"/>
+          <w:numId w:val="1"/>
+        </w:numPr>
+        <w:ind w:hanging="360" w:left="1440"/>
+        <w:rPr>
+          <w:highlight w:val="none"/>
+          <w:shd w:fill="auto" w:val="clear"/>
+        </w:rPr>
+      </w:pPr>
+      <w:r>
+        <w:rPr>
+          <w:shd w:fill="auto" w:val="clear"/>
+        </w:rPr>
+        <w:t xml:space="preserve">returns: </w:t>
+      </w:r>
+    </w:p>
+    <w:p>
+      <w:pPr>
+        <w:pStyle w:val="normal1"/>
+        <w:widowControl/>
+        <w:numPr>
+          <w:ilvl w:val="2"/>
+          <w:numId w:val="1"/>
+        </w:numPr>
+        <w:suppressAutoHyphens w:val="true"/>
+        <w:bidi w:val="0"/>
+        <w:spacing w:lineRule="auto" w:line="276" w:before="0" w:after="0"/>
+        <w:ind w:hanging="360" w:left="2160" w:right="0"/>
+        <w:jc w:val="left"/>
+        <w:rPr>
           <w:highlight w:val="none"/>
           <w:shd w:fill="auto" w:val="clear"/>
         </w:rPr>
@@ -6580,13 +7609,7 @@
         <w:rPr>
           <w:shd w:fill="auto" w:val="clear"/>
         </w:rPr>
-        <w:t xml:space="preserve"> </w:t>
-      </w:r>
-      <w:r>
-        <w:rPr>
-          <w:shd w:fill="auto" w:val="clear"/>
-        </w:rPr>
-        <w:t>of EquipmentSet</w:t>
+        <w:t xml:space="preserve"> of EquipmentSet</w:t>
       </w:r>
     </w:p>
     <w:p>
@@ -6654,25 +7677,7 @@
         <w:rPr>
           <w:shd w:fill="auto" w:val="clear"/>
         </w:rPr>
-        <w:t>endpoint: {base_uri}/api/equipment</w:t>
-      </w:r>
-      <w:r>
-        <w:rPr>
-          <w:shd w:fill="auto" w:val="clear"/>
-        </w:rPr>
-        <w:t>set</w:t>
-      </w:r>
-      <w:r>
-        <w:rPr>
-          <w:shd w:fill="auto" w:val="clear"/>
-        </w:rPr>
-        <w:t>/{id}/</w:t>
-      </w:r>
-      <w:r>
-        <w:rPr>
-          <w:shd w:fill="auto" w:val="clear"/>
-        </w:rPr>
-        <w:t>equipment</w:t>
+        <w:t>endpoint: {base_uri}/api/equipmentset/{id}/equipment</w:t>
       </w:r>
     </w:p>
     <w:p>
@@ -6840,19 +7845,7 @@
         <w:rPr>
           <w:shd w:fill="auto" w:val="clear"/>
         </w:rPr>
-        <w:t xml:space="preserve">an </w:t>
-      </w:r>
-      <w:r>
-        <w:rPr>
-          <w:shd w:fill="auto" w:val="clear"/>
-        </w:rPr>
-        <w:t xml:space="preserve">array of </w:t>
-      </w:r>
-      <w:r>
-        <w:rPr>
-          <w:shd w:fill="auto" w:val="clear"/>
-        </w:rPr>
-        <w:t>Equipment</w:t>
+        <w:t>an array of Equipment</w:t>
       </w:r>
     </w:p>
     <w:p>
@@ -10388,33 +11381,13 @@
           <w:bCs w:val="false"/>
           <w:shd w:fill="auto" w:val="clear"/>
         </w:rPr>
-        <w:t>EquipmentSet</w:t>
-      </w:r>
-      <w:r>
-        <w:rPr>
-          <w:b w:val="false"/>
-          <w:bCs w:val="false"/>
-          <w:shd w:fill="auto" w:val="clear"/>
-        </w:rPr>
-        <w:t>s</w:t>
-      </w:r>
-      <w:r>
-        <w:rPr>
-          <w:shd w:fill="auto" w:val="clear"/>
-        </w:rPr>
-        <w:t xml:space="preserve"> by </w:t>
-      </w:r>
-      <w:r>
-        <w:rPr>
-          <w:shd w:fill="auto" w:val="clear"/>
-        </w:rPr>
-        <w:t xml:space="preserve">User </w:t>
-      </w:r>
-      <w:r>
-        <w:rPr>
-          <w:shd w:fill="auto" w:val="clear"/>
-        </w:rPr>
-        <w:t>ID</w:t>
+        <w:t>EquipmentSets</w:t>
+      </w:r>
+      <w:r>
+        <w:rPr>
+          <w:shd w:fill="auto" w:val="clear"/>
+        </w:rPr>
+        <w:t xml:space="preserve"> by User ID</w:t>
       </w:r>
     </w:p>
     <w:p>
@@ -10482,25 +11455,7 @@
         <w:rPr>
           <w:shd w:fill="auto" w:val="clear"/>
         </w:rPr>
-        <w:t>endpoint: {base_uri}/api/</w:t>
-      </w:r>
-      <w:r>
-        <w:rPr>
-          <w:shd w:fill="auto" w:val="clear"/>
-        </w:rPr>
-        <w:t>user</w:t>
-      </w:r>
-      <w:r>
-        <w:rPr>
-          <w:shd w:fill="auto" w:val="clear"/>
-        </w:rPr>
-        <w:t>/{id}/</w:t>
-      </w:r>
-      <w:r>
-        <w:rPr>
-          <w:shd w:fill="auto" w:val="clear"/>
-        </w:rPr>
-        <w:t>equipmentsets</w:t>
+        <w:t>endpoint: {base_uri}/api/user/{id}/equipmentsets</w:t>
       </w:r>
     </w:p>
     <w:p>

</xml_diff>

<commit_message>
brought back code from original QView codebase for receiving requests from QuizMachine client for /namelist /pingmsg and /scoreevent; updated docs though integration tests do not currently exist for new endpoints; merged quizevent service into gameevent service; fixed the logging for monitoring incoming HTTP requests in stdout; one error which will require a migration and an update to a model fix
</commit_message>
<xml_diff>
--- a/docs/QView API Documentation.docx
+++ b/docs/QView API Documentation.docx
@@ -14,15 +14,15 @@
       </w:r>
       <w:r>
         <w:rPr/>
-        <w:t>4</w:t>
-      </w:r>
-      <w:r>
-        <w:rPr/>
-        <w:t>_2026.0</w:t>
-      </w:r>
-      <w:r>
-        <w:rPr/>
-        <w:t>4.07</w:t>
+        <w:t>5</w:t>
+      </w:r>
+      <w:r>
+        <w:rPr/>
+        <w:t>_2026.04.</w:t>
+      </w:r>
+      <w:r>
+        <w:rPr/>
+        <w:t>27</w:t>
       </w:r>
       <w:r>
         <w:rPr/>
@@ -4737,15 +4737,7 @@
       </w:pPr>
       <w:r>
         <w:rPr/>
-        <w:t>endpoint: {base_uri}/api/</w:t>
-      </w:r>
-      <w:r>
-        <w:rPr/>
-        <w:t>createtournamentapplicants</w:t>
-      </w:r>
-      <w:r>
-        <w:rPr/>
-        <w:t>?page={page_num}&amp;page_size={num_of_rows}</w:t>
+        <w:t>endpoint: {base_uri}/api/createtournamentapplicants?page={page_num}&amp;page_size={num_of_rows}</w:t>
       </w:r>
     </w:p>
     <w:p>
@@ -4970,15 +4962,7 @@
       </w:pPr>
       <w:r>
         <w:rPr/>
-        <w:t>endpoint: {base_uri}/api/</w:t>
-      </w:r>
-      <w:r>
-        <w:rPr/>
-        <w:t>createtournamentapplicants</w:t>
-      </w:r>
-      <w:r>
-        <w:rPr/>
-        <w:t>/{id}</w:t>
+        <w:t>endpoint: {base_uri}/api/createtournamentapplicants/{id}</w:t>
       </w:r>
     </w:p>
     <w:p>
@@ -5090,11 +5074,7 @@
       </w:pPr>
       <w:r>
         <w:rPr/>
-        <w:t xml:space="preserve">POST/Create </w:t>
-      </w:r>
-      <w:r>
-        <w:rPr/>
-        <w:t>Create Tournament Applicant</w:t>
+        <w:t>POST/Create Create Tournament Applicant</w:t>
       </w:r>
     </w:p>
     <w:p>
@@ -5146,11 +5126,7 @@
       </w:pPr>
       <w:r>
         <w:rPr/>
-        <w:t>endpoint: {base_uri}/api/</w:t>
-      </w:r>
-      <w:r>
-        <w:rPr/>
-        <w:t>createtournamentapplicants</w:t>
+        <w:t>endpoint: {base_uri}/api/createtournamentapplicants</w:t>
       </w:r>
     </w:p>
     <w:p>
@@ -5297,15 +5273,7 @@
       </w:pPr>
       <w:r>
         <w:rPr/>
-        <w:t>endpoint: {base_uri}/api/</w:t>
-      </w:r>
-      <w:r>
-        <w:rPr/>
-        <w:t>createtournamentapplicants</w:t>
-      </w:r>
-      <w:r>
-        <w:rPr/>
-        <w:t>/{id}</w:t>
+        <w:t>endpoint: {base_uri}/api/createtournamentapplicants/{id}</w:t>
       </w:r>
     </w:p>
     <w:p>
@@ -5560,15 +5528,7 @@
       </w:pPr>
       <w:r>
         <w:rPr/>
-        <w:t>endpoint: {base_uri}/api/</w:t>
-      </w:r>
-      <w:r>
-        <w:rPr/>
-        <w:t>createtournamentapplicants</w:t>
-      </w:r>
-      <w:r>
-        <w:rPr/>
-        <w:t>/{id}</w:t>
+        <w:t>endpoint: {base_uri}/api/createtournamentapplicants/{id}</w:t>
       </w:r>
     </w:p>
     <w:p>
@@ -5658,7 +5618,10 @@
         </w:rPr>
       </w:pPr>
       <w:r>
-        <w:rPr/>
+        <w:rPr>
+          <w:b/>
+          <w:bCs/>
+        </w:rPr>
       </w:r>
     </w:p>
     <w:p>
@@ -5676,7 +5639,10 @@
         </w:rPr>
       </w:pPr>
       <w:r>
-        <w:rPr/>
+        <w:rPr>
+          <w:b/>
+          <w:bCs/>
+        </w:rPr>
       </w:r>
     </w:p>
     <w:p>
@@ -26956,7 +26922,7 @@
       </w:pPr>
       <w:r>
         <w:rPr/>
-        <w:t>endpoint: {base_uri}/api/gameevents?page={page_num}&amp;page_size={num_of_rows}</w:t>
+        <w:t>endpoint: {base_uri}/api/scoreevents?page={page_num}&amp;page_size={num_of_rows}</w:t>
       </w:r>
     </w:p>
     <w:p>
@@ -27181,7 +27147,7 @@
       </w:pPr>
       <w:r>
         <w:rPr/>
-        <w:t>endpoint: {base_uri}/api/game/{id}/gameevents</w:t>
+        <w:t>endpoint: {base_uri}/api/game/{id}/scoreevents</w:t>
       </w:r>
     </w:p>
     <w:p>
@@ -27362,7 +27328,7 @@
       </w:pPr>
       <w:r>
         <w:rPr/>
-        <w:t>endpoint: {base_uri}/api/gameevents</w:t>
+        <w:t>endpoint: {base_uri}/api/scoreevents</w:t>
       </w:r>
     </w:p>
     <w:p>
@@ -27492,10 +27458,7 @@
         <w:spacing w:lineRule="auto" w:line="276" w:before="0" w:after="0"/>
         <w:ind w:hanging="360" w:left="360" w:right="0"/>
         <w:jc w:val="left"/>
-        <w:rPr>
-          <w:b/>
-          <w:bCs/>
-        </w:rPr>
+        <w:rPr/>
       </w:pPr>
       <w:r>
         <w:rPr>
@@ -27503,7 +27466,7 @@
           <w:bCs/>
           <w:color w:val="000000"/>
         </w:rPr>
-        <w:t>Permissions</w:t>
+        <w:t>Namelist</w:t>
       </w:r>
     </w:p>
     <w:p>
@@ -27518,14 +27481,7 @@
       </w:pPr>
       <w:r>
         <w:rPr/>
-        <w:t xml:space="preserve">GET All </w:t>
-      </w:r>
-      <w:r>
-        <w:rPr>
-          <w:b w:val="false"/>
-          <w:bCs w:val="false"/>
-        </w:rPr>
-        <w:t>Permissions</w:t>
+        <w:t>GET All Namelists</w:t>
       </w:r>
     </w:p>
     <w:p>
@@ -27547,7 +27503,7 @@
           <w:b/>
           <w:bCs/>
         </w:rPr>
-        <w:t>true</w:t>
+        <w:t>false</w:t>
       </w:r>
     </w:p>
     <w:p>
@@ -27577,7 +27533,7 @@
       </w:pPr>
       <w:r>
         <w:rPr/>
-        <w:t>endpoint: {base_uri}/api/permissions?page={page_num}&amp;page_size={num_of_rows}</w:t>
+        <w:t>endpoint: {base_uri}/namelist?page={page_num}&amp;page_size={num_of_rows}</w:t>
       </w:r>
     </w:p>
     <w:p>
@@ -27750,18 +27706,7 @@
       </w:pPr>
       <w:r>
         <w:rPr/>
-        <w:t xml:space="preserve">GET </w:t>
-      </w:r>
-      <w:r>
-        <w:rPr>
-          <w:b w:val="false"/>
-          <w:bCs w:val="false"/>
-        </w:rPr>
-        <w:t>Permission</w:t>
-      </w:r>
-      <w:r>
-        <w:rPr/>
-        <w:t xml:space="preserve"> by ID</w:t>
+        <w:t>GET Namelist by ID</w:t>
       </w:r>
     </w:p>
     <w:p>
@@ -27783,7 +27728,7 @@
           <w:b/>
           <w:bCs/>
         </w:rPr>
-        <w:t>true</w:t>
+        <w:t>false</w:t>
       </w:r>
     </w:p>
     <w:p>
@@ -27813,7 +27758,7 @@
       </w:pPr>
       <w:r>
         <w:rPr/>
-        <w:t>endpoint: {base_uri}/api/permissions/{id}</w:t>
+        <w:t>endpoint: {base_uri}/namelist/{id}</w:t>
       </w:r>
     </w:p>
     <w:p>
@@ -27892,18 +27837,7 @@
       </w:pPr>
       <w:r>
         <w:rPr/>
-        <w:t xml:space="preserve">ID of the </w:t>
-      </w:r>
-      <w:r>
-        <w:rPr>
-          <w:b w:val="false"/>
-          <w:bCs w:val="false"/>
-        </w:rPr>
-        <w:t>Permission</w:t>
-      </w:r>
-      <w:r>
-        <w:rPr/>
-        <w:t xml:space="preserve"> to be received</w:t>
+        <w:t>ID of the Namelist to receive</w:t>
       </w:r>
     </w:p>
     <w:p>
@@ -27919,10 +27853,7 @@
         <w:spacing w:lineRule="auto" w:line="276" w:before="0" w:after="0"/>
         <w:ind w:hanging="360" w:left="1440" w:right="0"/>
         <w:jc w:val="left"/>
-        <w:rPr>
-          <w:b w:val="false"/>
-          <w:bCs w:val="false"/>
-        </w:rPr>
+        <w:rPr/>
       </w:pPr>
       <w:r>
         <w:rPr>
@@ -27945,14 +27876,7 @@
       </w:pPr>
       <w:r>
         <w:rPr/>
-        <w:t xml:space="preserve">POST/Create </w:t>
-      </w:r>
-      <w:r>
-        <w:rPr>
-          <w:b w:val="false"/>
-          <w:bCs w:val="false"/>
-        </w:rPr>
-        <w:t>Permission</w:t>
+        <w:t>POST/Create Namelist</w:t>
       </w:r>
     </w:p>
     <w:p>
@@ -27974,7 +27898,7 @@
           <w:b/>
           <w:bCs/>
         </w:rPr>
-        <w:t>true</w:t>
+        <w:t>false</w:t>
       </w:r>
     </w:p>
     <w:p>
@@ -28004,7 +27928,7 @@
       </w:pPr>
       <w:r>
         <w:rPr/>
-        <w:t>endpoint: {base_uri}/api/permissions</w:t>
+        <w:t>endpoint: {base_uri}/namelist</w:t>
       </w:r>
     </w:p>
     <w:p>
@@ -28020,6 +27944,21 @@
       <w:r>
         <w:rPr/>
         <w:t xml:space="preserve">description: </w:t>
+      </w:r>
+    </w:p>
+    <w:p>
+      <w:pPr>
+        <w:pStyle w:val="normal1"/>
+        <w:numPr>
+          <w:ilvl w:val="1"/>
+          <w:numId w:val="1"/>
+        </w:numPr>
+        <w:ind w:hanging="360" w:left="1440"/>
+        <w:rPr/>
+      </w:pPr>
+      <w:r>
+        <w:rPr/>
+        <w:t xml:space="preserve">body: </w:t>
       </w:r>
     </w:p>
     <w:p>
@@ -28069,14 +28008,7 @@
       </w:pPr>
       <w:r>
         <w:rPr/>
-        <w:t xml:space="preserve">the created </w:t>
-      </w:r>
-      <w:r>
-        <w:rPr>
-          <w:b w:val="false"/>
-          <w:bCs w:val="false"/>
-        </w:rPr>
-        <w:t>Permission</w:t>
+        <w:t>the created Namelist</w:t>
       </w:r>
     </w:p>
     <w:p>
@@ -28091,14 +28023,7 @@
       </w:pPr>
       <w:r>
         <w:rPr/>
-        <w:t xml:space="preserve">PUT/Update </w:t>
-      </w:r>
-      <w:r>
-        <w:rPr>
-          <w:b w:val="false"/>
-          <w:bCs w:val="false"/>
-        </w:rPr>
-        <w:t>Permission</w:t>
+        <w:t>PUT/Update Namelist</w:t>
       </w:r>
     </w:p>
     <w:p>
@@ -28120,7 +28045,7 @@
           <w:b/>
           <w:bCs/>
         </w:rPr>
-        <w:t>true</w:t>
+        <w:t>false</w:t>
       </w:r>
     </w:p>
     <w:p>
@@ -28150,7 +28075,7 @@
       </w:pPr>
       <w:r>
         <w:rPr/>
-        <w:t>endpoint: {base_uri}/api/permissions/{id}</w:t>
+        <w:t>endpoint: {base_uri}/namelist/{id}</w:t>
       </w:r>
     </w:p>
     <w:p>
@@ -28273,21 +28198,7 @@
         <w:rPr>
           <w:color w:val="000000"/>
         </w:rPr>
-        <w:t xml:space="preserve">ID of the </w:t>
-      </w:r>
-      <w:r>
-        <w:rPr>
-          <w:b w:val="false"/>
-          <w:bCs w:val="false"/>
-          <w:color w:val="000000"/>
-        </w:rPr>
-        <w:t>Permission</w:t>
-      </w:r>
-      <w:r>
-        <w:rPr>
-          <w:color w:val="000000"/>
-        </w:rPr>
-        <w:t xml:space="preserve"> to be updated</w:t>
+        <w:t>ID of the Namelist to be updated</w:t>
       </w:r>
     </w:p>
     <w:p>
@@ -28328,15 +28239,7 @@
         <w:rPr>
           <w:color w:val="000000"/>
         </w:rPr>
-        <w:t xml:space="preserve">the updated </w:t>
-      </w:r>
-      <w:r>
-        <w:rPr>
-          <w:b w:val="false"/>
-          <w:bCs w:val="false"/>
-          <w:color w:val="000000"/>
-        </w:rPr>
-        <w:t>Permission</w:t>
+        <w:t>the updated Namelist</w:t>
       </w:r>
     </w:p>
     <w:p>
@@ -28351,18 +28254,7 @@
       </w:pPr>
       <w:r>
         <w:rPr/>
-        <w:t xml:space="preserve">DELETE </w:t>
-      </w:r>
-      <w:r>
-        <w:rPr>
-          <w:b w:val="false"/>
-          <w:bCs w:val="false"/>
-        </w:rPr>
-        <w:t>Permission</w:t>
-      </w:r>
-      <w:r>
-        <w:rPr/>
-        <w:t xml:space="preserve"> (by ID)</w:t>
+        <w:t>DELETE Namelist (by ID)</w:t>
       </w:r>
     </w:p>
     <w:p>
@@ -28384,7 +28276,7 @@
           <w:b/>
           <w:bCs/>
         </w:rPr>
-        <w:t>true</w:t>
+        <w:t>false</w:t>
       </w:r>
     </w:p>
     <w:p>
@@ -28414,7 +28306,7 @@
       </w:pPr>
       <w:r>
         <w:rPr/>
-        <w:t>endpoint: {base_uri}/api/permissions/{id}</w:t>
+        <w:t>endpoint: {base_uri}/namelist/{id}</w:t>
       </w:r>
     </w:p>
     <w:p>
@@ -28475,7 +28367,10 @@
         <w:spacing w:lineRule="auto" w:line="276" w:before="0" w:after="0"/>
         <w:ind w:hanging="360" w:left="2160" w:right="0"/>
         <w:jc w:val="left"/>
-        <w:rPr/>
+        <w:rPr>
+          <w:b w:val="false"/>
+          <w:bCs w:val="false"/>
+        </w:rPr>
       </w:pPr>
       <w:r>
         <w:rPr>
@@ -28501,10 +28396,7 @@
         </w:rPr>
       </w:pPr>
       <w:r>
-        <w:rPr>
-          <w:b/>
-          <w:bCs/>
-        </w:rPr>
+        <w:rPr/>
       </w:r>
     </w:p>
     <w:p>
@@ -28522,10 +28414,2020 @@
         </w:rPr>
       </w:pPr>
       <w:r>
+        <w:rPr/>
+      </w:r>
+    </w:p>
+    <w:p>
+      <w:pPr>
+        <w:pStyle w:val="normal1"/>
+        <w:widowControl/>
+        <w:suppressAutoHyphens w:val="true"/>
+        <w:bidi w:val="0"/>
+        <w:spacing w:lineRule="auto" w:line="276" w:before="0" w:after="0"/>
+        <w:ind w:hanging="360" w:left="360" w:right="0"/>
+        <w:jc w:val="left"/>
         <w:rPr>
           <w:b/>
           <w:bCs/>
         </w:rPr>
+      </w:pPr>
+      <w:r>
+        <w:rPr>
+          <w:b/>
+          <w:bCs/>
+          <w:color w:val="000000"/>
+        </w:rPr>
+        <w:t>Permissions</w:t>
+      </w:r>
+    </w:p>
+    <w:p>
+      <w:pPr>
+        <w:pStyle w:val="normal1"/>
+        <w:numPr>
+          <w:ilvl w:val="0"/>
+          <w:numId w:val="1"/>
+        </w:numPr>
+        <w:ind w:hanging="360" w:left="720"/>
+        <w:rPr/>
+      </w:pPr>
+      <w:r>
+        <w:rPr/>
+        <w:t xml:space="preserve">GET All </w:t>
+      </w:r>
+      <w:r>
+        <w:rPr>
+          <w:b w:val="false"/>
+          <w:bCs w:val="false"/>
+        </w:rPr>
+        <w:t>Permissions</w:t>
+      </w:r>
+    </w:p>
+    <w:p>
+      <w:pPr>
+        <w:pStyle w:val="normal1"/>
+        <w:numPr>
+          <w:ilvl w:val="1"/>
+          <w:numId w:val="1"/>
+        </w:numPr>
+        <w:ind w:hanging="360" w:left="1440"/>
+        <w:rPr/>
+      </w:pPr>
+      <w:r>
+        <w:rPr/>
+        <w:t xml:space="preserve">built_including_tests: </w:t>
+      </w:r>
+      <w:r>
+        <w:rPr>
+          <w:b/>
+          <w:bCs/>
+        </w:rPr>
+        <w:t>true</w:t>
+      </w:r>
+    </w:p>
+    <w:p>
+      <w:pPr>
+        <w:pStyle w:val="normal1"/>
+        <w:numPr>
+          <w:ilvl w:val="1"/>
+          <w:numId w:val="1"/>
+        </w:numPr>
+        <w:ind w:hanging="360" w:left="1440"/>
+        <w:rPr/>
+      </w:pPr>
+      <w:r>
+        <w:rPr/>
+        <w:t>HTTP method: ‘GET’</w:t>
+      </w:r>
+    </w:p>
+    <w:p>
+      <w:pPr>
+        <w:pStyle w:val="normal1"/>
+        <w:numPr>
+          <w:ilvl w:val="1"/>
+          <w:numId w:val="1"/>
+        </w:numPr>
+        <w:ind w:hanging="360" w:left="1440"/>
+        <w:rPr/>
+      </w:pPr>
+      <w:r>
+        <w:rPr/>
+        <w:t>endpoint: {base_uri}/api/permissions?page={page_num}&amp;page_size={num_of_rows}</w:t>
+      </w:r>
+    </w:p>
+    <w:p>
+      <w:pPr>
+        <w:pStyle w:val="normal1"/>
+        <w:numPr>
+          <w:ilvl w:val="1"/>
+          <w:numId w:val="1"/>
+        </w:numPr>
+        <w:ind w:hanging="360" w:left="1440"/>
+        <w:rPr/>
+      </w:pPr>
+      <w:r>
+        <w:rPr/>
+        <w:t xml:space="preserve">description: </w:t>
+      </w:r>
+    </w:p>
+    <w:p>
+      <w:pPr>
+        <w:pStyle w:val="normal1"/>
+        <w:numPr>
+          <w:ilvl w:val="1"/>
+          <w:numId w:val="1"/>
+        </w:numPr>
+        <w:ind w:hanging="360" w:left="1440"/>
+        <w:rPr/>
+      </w:pPr>
+      <w:r>
+        <w:rPr/>
+        <w:t xml:space="preserve">parameters: </w:t>
+      </w:r>
+    </w:p>
+    <w:p>
+      <w:pPr>
+        <w:pStyle w:val="normal1"/>
+        <w:numPr>
+          <w:ilvl w:val="2"/>
+          <w:numId w:val="1"/>
+        </w:numPr>
+        <w:ind w:hanging="360" w:left="2160"/>
+        <w:rPr/>
+      </w:pPr>
+      <w:r>
+        <w:rPr/>
+        <w:t>page={page_num}</w:t>
+      </w:r>
+    </w:p>
+    <w:p>
+      <w:pPr>
+        <w:pStyle w:val="normal1"/>
+        <w:numPr>
+          <w:ilvl w:val="3"/>
+          <w:numId w:val="1"/>
+        </w:numPr>
+        <w:ind w:hanging="360" w:left="2880"/>
+        <w:rPr>
+          <w:color w:val="FF0000"/>
+        </w:rPr>
+      </w:pPr>
+      <w:r>
+        <w:rPr>
+          <w:color w:val="FF0000"/>
+        </w:rPr>
+        <w:t>Required</w:t>
+      </w:r>
+    </w:p>
+    <w:p>
+      <w:pPr>
+        <w:pStyle w:val="normal1"/>
+        <w:numPr>
+          <w:ilvl w:val="3"/>
+          <w:numId w:val="1"/>
+        </w:numPr>
+        <w:ind w:hanging="360" w:left="2880"/>
+        <w:rPr/>
+      </w:pPr>
+      <w:r>
+        <w:rPr/>
+        <w:t>Defines which page to return</w:t>
+      </w:r>
+    </w:p>
+    <w:p>
+      <w:pPr>
+        <w:pStyle w:val="normal1"/>
+        <w:numPr>
+          <w:ilvl w:val="3"/>
+          <w:numId w:val="1"/>
+        </w:numPr>
+        <w:ind w:hanging="360" w:left="2880"/>
+        <w:rPr/>
+      </w:pPr>
+      <w:r>
+        <w:rPr/>
+        <w:t>First page = 0 (zero)</w:t>
+      </w:r>
+    </w:p>
+    <w:p>
+      <w:pPr>
+        <w:pStyle w:val="normal1"/>
+        <w:numPr>
+          <w:ilvl w:val="2"/>
+          <w:numId w:val="1"/>
+        </w:numPr>
+        <w:ind w:hanging="360" w:left="2160"/>
+        <w:rPr/>
+      </w:pPr>
+      <w:r>
+        <w:rPr/>
+        <w:t>page_size={num_of_rows}</w:t>
+      </w:r>
+    </w:p>
+    <w:p>
+      <w:pPr>
+        <w:pStyle w:val="normal1"/>
+        <w:numPr>
+          <w:ilvl w:val="3"/>
+          <w:numId w:val="1"/>
+        </w:numPr>
+        <w:ind w:hanging="360" w:left="2880"/>
+        <w:rPr>
+          <w:color w:val="FF0000"/>
+        </w:rPr>
+      </w:pPr>
+      <w:r>
+        <w:rPr>
+          <w:color w:val="FF0000"/>
+        </w:rPr>
+        <w:t>Required</w:t>
+      </w:r>
+    </w:p>
+    <w:p>
+      <w:pPr>
+        <w:pStyle w:val="normal1"/>
+        <w:numPr>
+          <w:ilvl w:val="3"/>
+          <w:numId w:val="1"/>
+        </w:numPr>
+        <w:ind w:hanging="360" w:left="2880"/>
+        <w:rPr/>
+      </w:pPr>
+      <w:r>
+        <w:rPr/>
+        <w:t>Defines how many rows to return for the selected page</w:t>
+      </w:r>
+    </w:p>
+    <w:p>
+      <w:pPr>
+        <w:pStyle w:val="normal1"/>
+        <w:numPr>
+          <w:ilvl w:val="1"/>
+          <w:numId w:val="1"/>
+        </w:numPr>
+        <w:ind w:hanging="360" w:left="1440"/>
+        <w:rPr/>
+      </w:pPr>
+      <w:r>
+        <w:rPr/>
+        <w:t xml:space="preserve">returns: </w:t>
+      </w:r>
+    </w:p>
+    <w:p>
+      <w:pPr>
+        <w:pStyle w:val="normal1"/>
+        <w:numPr>
+          <w:ilvl w:val="0"/>
+          <w:numId w:val="1"/>
+        </w:numPr>
+        <w:ind w:hanging="360" w:left="720"/>
+        <w:rPr/>
+      </w:pPr>
+      <w:r>
+        <w:rPr/>
+        <w:t xml:space="preserve">GET </w:t>
+      </w:r>
+      <w:r>
+        <w:rPr>
+          <w:b w:val="false"/>
+          <w:bCs w:val="false"/>
+        </w:rPr>
+        <w:t>Permission</w:t>
+      </w:r>
+      <w:r>
+        <w:rPr/>
+        <w:t xml:space="preserve"> by ID</w:t>
+      </w:r>
+    </w:p>
+    <w:p>
+      <w:pPr>
+        <w:pStyle w:val="normal1"/>
+        <w:numPr>
+          <w:ilvl w:val="1"/>
+          <w:numId w:val="1"/>
+        </w:numPr>
+        <w:ind w:hanging="360" w:left="1440"/>
+        <w:rPr/>
+      </w:pPr>
+      <w:r>
+        <w:rPr/>
+        <w:t xml:space="preserve">built_including_tests: </w:t>
+      </w:r>
+      <w:r>
+        <w:rPr>
+          <w:b/>
+          <w:bCs/>
+        </w:rPr>
+        <w:t>true</w:t>
+      </w:r>
+    </w:p>
+    <w:p>
+      <w:pPr>
+        <w:pStyle w:val="normal1"/>
+        <w:numPr>
+          <w:ilvl w:val="1"/>
+          <w:numId w:val="1"/>
+        </w:numPr>
+        <w:ind w:hanging="360" w:left="1440"/>
+        <w:rPr/>
+      </w:pPr>
+      <w:r>
+        <w:rPr/>
+        <w:t>HTTP method: ‘GET’</w:t>
+      </w:r>
+    </w:p>
+    <w:p>
+      <w:pPr>
+        <w:pStyle w:val="normal1"/>
+        <w:numPr>
+          <w:ilvl w:val="1"/>
+          <w:numId w:val="1"/>
+        </w:numPr>
+        <w:ind w:hanging="360" w:left="1440"/>
+        <w:rPr/>
+      </w:pPr>
+      <w:r>
+        <w:rPr/>
+        <w:t>endpoint: {base_uri}/api/permissions/{id}</w:t>
+      </w:r>
+    </w:p>
+    <w:p>
+      <w:pPr>
+        <w:pStyle w:val="normal1"/>
+        <w:numPr>
+          <w:ilvl w:val="1"/>
+          <w:numId w:val="1"/>
+        </w:numPr>
+        <w:ind w:hanging="360" w:left="1440"/>
+        <w:rPr/>
+      </w:pPr>
+      <w:r>
+        <w:rPr/>
+        <w:t xml:space="preserve">description: </w:t>
+      </w:r>
+    </w:p>
+    <w:p>
+      <w:pPr>
+        <w:pStyle w:val="normal1"/>
+        <w:numPr>
+          <w:ilvl w:val="1"/>
+          <w:numId w:val="1"/>
+        </w:numPr>
+        <w:ind w:hanging="360" w:left="1440"/>
+        <w:rPr/>
+      </w:pPr>
+      <w:r>
+        <w:rPr/>
+        <w:t xml:space="preserve">parameters: </w:t>
+      </w:r>
+    </w:p>
+    <w:p>
+      <w:pPr>
+        <w:pStyle w:val="normal1"/>
+        <w:numPr>
+          <w:ilvl w:val="2"/>
+          <w:numId w:val="1"/>
+        </w:numPr>
+        <w:ind w:hanging="360" w:left="2160"/>
+        <w:rPr/>
+      </w:pPr>
+      <w:r>
+        <w:rPr/>
+        <w:t>id</w:t>
+      </w:r>
+    </w:p>
+    <w:p>
+      <w:pPr>
+        <w:pStyle w:val="normal1"/>
+        <w:numPr>
+          <w:ilvl w:val="3"/>
+          <w:numId w:val="1"/>
+        </w:numPr>
+        <w:ind w:hanging="360" w:left="2880"/>
+        <w:rPr>
+          <w:color w:val="FF0000"/>
+        </w:rPr>
+      </w:pPr>
+      <w:r>
+        <w:rPr>
+          <w:color w:val="FF0000"/>
+        </w:rPr>
+        <w:t>Required</w:t>
+      </w:r>
+    </w:p>
+    <w:p>
+      <w:pPr>
+        <w:pStyle w:val="normal1"/>
+        <w:numPr>
+          <w:ilvl w:val="3"/>
+          <w:numId w:val="1"/>
+        </w:numPr>
+        <w:ind w:hanging="360" w:left="2880"/>
+        <w:rPr/>
+      </w:pPr>
+      <w:r>
+        <w:rPr/>
+        <w:t xml:space="preserve">ID of the </w:t>
+      </w:r>
+      <w:r>
+        <w:rPr>
+          <w:b w:val="false"/>
+          <w:bCs w:val="false"/>
+        </w:rPr>
+        <w:t>Permission</w:t>
+      </w:r>
+      <w:r>
+        <w:rPr/>
+        <w:t xml:space="preserve"> to be received</w:t>
+      </w:r>
+    </w:p>
+    <w:p>
+      <w:pPr>
+        <w:pStyle w:val="normal1"/>
+        <w:widowControl/>
+        <w:numPr>
+          <w:ilvl w:val="1"/>
+          <w:numId w:val="1"/>
+        </w:numPr>
+        <w:suppressAutoHyphens w:val="true"/>
+        <w:bidi w:val="0"/>
+        <w:spacing w:lineRule="auto" w:line="276" w:before="0" w:after="0"/>
+        <w:ind w:hanging="360" w:left="1440" w:right="0"/>
+        <w:jc w:val="left"/>
+        <w:rPr>
+          <w:b w:val="false"/>
+          <w:bCs w:val="false"/>
+        </w:rPr>
+      </w:pPr>
+      <w:r>
+        <w:rPr>
+          <w:b w:val="false"/>
+          <w:bCs w:val="false"/>
+          <w:color w:val="000000"/>
+        </w:rPr>
+        <w:t xml:space="preserve">returns: </w:t>
+      </w:r>
+    </w:p>
+    <w:p>
+      <w:pPr>
+        <w:pStyle w:val="normal1"/>
+        <w:numPr>
+          <w:ilvl w:val="0"/>
+          <w:numId w:val="1"/>
+        </w:numPr>
+        <w:ind w:hanging="360" w:left="720"/>
+        <w:rPr/>
+      </w:pPr>
+      <w:r>
+        <w:rPr/>
+        <w:t xml:space="preserve">POST/Create </w:t>
+      </w:r>
+      <w:r>
+        <w:rPr>
+          <w:b w:val="false"/>
+          <w:bCs w:val="false"/>
+        </w:rPr>
+        <w:t>Permission</w:t>
+      </w:r>
+    </w:p>
+    <w:p>
+      <w:pPr>
+        <w:pStyle w:val="normal1"/>
+        <w:numPr>
+          <w:ilvl w:val="1"/>
+          <w:numId w:val="1"/>
+        </w:numPr>
+        <w:ind w:hanging="360" w:left="1440"/>
+        <w:rPr/>
+      </w:pPr>
+      <w:r>
+        <w:rPr/>
+        <w:t xml:space="preserve">built_including_tests: </w:t>
+      </w:r>
+      <w:r>
+        <w:rPr>
+          <w:b/>
+          <w:bCs/>
+        </w:rPr>
+        <w:t>true</w:t>
+      </w:r>
+    </w:p>
+    <w:p>
+      <w:pPr>
+        <w:pStyle w:val="normal1"/>
+        <w:numPr>
+          <w:ilvl w:val="1"/>
+          <w:numId w:val="1"/>
+        </w:numPr>
+        <w:ind w:hanging="360" w:left="1440"/>
+        <w:rPr/>
+      </w:pPr>
+      <w:r>
+        <w:rPr/>
+        <w:t>HTTP method: ‘POST’</w:t>
+      </w:r>
+    </w:p>
+    <w:p>
+      <w:pPr>
+        <w:pStyle w:val="normal1"/>
+        <w:numPr>
+          <w:ilvl w:val="1"/>
+          <w:numId w:val="1"/>
+        </w:numPr>
+        <w:ind w:hanging="360" w:left="1440"/>
+        <w:rPr/>
+      </w:pPr>
+      <w:r>
+        <w:rPr/>
+        <w:t>endpoint: {base_uri}/api/permissions</w:t>
+      </w:r>
+    </w:p>
+    <w:p>
+      <w:pPr>
+        <w:pStyle w:val="normal1"/>
+        <w:numPr>
+          <w:ilvl w:val="1"/>
+          <w:numId w:val="1"/>
+        </w:numPr>
+        <w:ind w:hanging="360" w:left="1440"/>
+        <w:rPr/>
+      </w:pPr>
+      <w:r>
+        <w:rPr/>
+        <w:t xml:space="preserve">description: </w:t>
+      </w:r>
+    </w:p>
+    <w:p>
+      <w:pPr>
+        <w:pStyle w:val="normal1"/>
+        <w:numPr>
+          <w:ilvl w:val="1"/>
+          <w:numId w:val="1"/>
+        </w:numPr>
+        <w:ind w:hanging="360" w:left="1440"/>
+        <w:rPr/>
+      </w:pPr>
+      <w:r>
+        <w:rPr/>
+        <w:t xml:space="preserve">parameters: </w:t>
+      </w:r>
+    </w:p>
+    <w:p>
+      <w:pPr>
+        <w:pStyle w:val="normal1"/>
+        <w:numPr>
+          <w:ilvl w:val="1"/>
+          <w:numId w:val="1"/>
+        </w:numPr>
+        <w:ind w:hanging="360" w:left="1440"/>
+        <w:rPr/>
+      </w:pPr>
+      <w:r>
+        <w:rPr/>
+        <w:t xml:space="preserve">returns: </w:t>
+      </w:r>
+    </w:p>
+    <w:p>
+      <w:pPr>
+        <w:pStyle w:val="normal1"/>
+        <w:widowControl/>
+        <w:numPr>
+          <w:ilvl w:val="2"/>
+          <w:numId w:val="1"/>
+        </w:numPr>
+        <w:suppressAutoHyphens w:val="true"/>
+        <w:bidi w:val="0"/>
+        <w:spacing w:lineRule="auto" w:line="276" w:before="0" w:after="0"/>
+        <w:ind w:hanging="360" w:left="2160" w:right="0"/>
+        <w:jc w:val="left"/>
+        <w:rPr/>
+      </w:pPr>
+      <w:r>
+        <w:rPr/>
+        <w:t xml:space="preserve">the created </w:t>
+      </w:r>
+      <w:r>
+        <w:rPr>
+          <w:b w:val="false"/>
+          <w:bCs w:val="false"/>
+        </w:rPr>
+        <w:t>Permission</w:t>
+      </w:r>
+    </w:p>
+    <w:p>
+      <w:pPr>
+        <w:pStyle w:val="normal1"/>
+        <w:numPr>
+          <w:ilvl w:val="0"/>
+          <w:numId w:val="1"/>
+        </w:numPr>
+        <w:ind w:hanging="360" w:left="720"/>
+        <w:rPr/>
+      </w:pPr>
+      <w:r>
+        <w:rPr/>
+        <w:t xml:space="preserve">PUT/Update </w:t>
+      </w:r>
+      <w:r>
+        <w:rPr>
+          <w:b w:val="false"/>
+          <w:bCs w:val="false"/>
+        </w:rPr>
+        <w:t>Permission</w:t>
+      </w:r>
+    </w:p>
+    <w:p>
+      <w:pPr>
+        <w:pStyle w:val="normal1"/>
+        <w:numPr>
+          <w:ilvl w:val="1"/>
+          <w:numId w:val="1"/>
+        </w:numPr>
+        <w:ind w:hanging="360" w:left="1440"/>
+        <w:rPr/>
+      </w:pPr>
+      <w:r>
+        <w:rPr/>
+        <w:t xml:space="preserve">built_including_tests: </w:t>
+      </w:r>
+      <w:r>
+        <w:rPr>
+          <w:b/>
+          <w:bCs/>
+        </w:rPr>
+        <w:t>true</w:t>
+      </w:r>
+    </w:p>
+    <w:p>
+      <w:pPr>
+        <w:pStyle w:val="normal1"/>
+        <w:numPr>
+          <w:ilvl w:val="1"/>
+          <w:numId w:val="1"/>
+        </w:numPr>
+        <w:ind w:hanging="360" w:left="1440"/>
+        <w:rPr/>
+      </w:pPr>
+      <w:r>
+        <w:rPr/>
+        <w:t>HTTP method: ‘PUT’</w:t>
+      </w:r>
+    </w:p>
+    <w:p>
+      <w:pPr>
+        <w:pStyle w:val="normal1"/>
+        <w:numPr>
+          <w:ilvl w:val="1"/>
+          <w:numId w:val="1"/>
+        </w:numPr>
+        <w:ind w:hanging="360" w:left="1440"/>
+        <w:rPr/>
+      </w:pPr>
+      <w:r>
+        <w:rPr/>
+        <w:t>endpoint: {base_uri}/api/permissions/{id}</w:t>
+      </w:r>
+    </w:p>
+    <w:p>
+      <w:pPr>
+        <w:pStyle w:val="normal1"/>
+        <w:numPr>
+          <w:ilvl w:val="1"/>
+          <w:numId w:val="1"/>
+        </w:numPr>
+        <w:ind w:hanging="360" w:left="1440"/>
+        <w:rPr/>
+      </w:pPr>
+      <w:r>
+        <w:rPr/>
+        <w:t xml:space="preserve">description: </w:t>
+      </w:r>
+    </w:p>
+    <w:p>
+      <w:pPr>
+        <w:pStyle w:val="normal1"/>
+        <w:numPr>
+          <w:ilvl w:val="1"/>
+          <w:numId w:val="1"/>
+        </w:numPr>
+        <w:ind w:hanging="360" w:left="1440"/>
+        <w:rPr/>
+      </w:pPr>
+      <w:r>
+        <w:rPr/>
+        <w:t xml:space="preserve">body: </w:t>
+      </w:r>
+    </w:p>
+    <w:p>
+      <w:pPr>
+        <w:pStyle w:val="normal1"/>
+        <w:widowControl/>
+        <w:numPr>
+          <w:ilvl w:val="2"/>
+          <w:numId w:val="1"/>
+        </w:numPr>
+        <w:suppressAutoHyphens w:val="true"/>
+        <w:bidi w:val="0"/>
+        <w:spacing w:lineRule="auto" w:line="276" w:before="0" w:after="0"/>
+        <w:ind w:hanging="360" w:left="2160" w:right="0"/>
+        <w:jc w:val="left"/>
+        <w:rPr/>
+      </w:pPr>
+      <w:r>
+        <w:rPr/>
+        <w:t>only fields that you want to update (other than ID in the URI path) need to be provided</w:t>
+      </w:r>
+    </w:p>
+    <w:p>
+      <w:pPr>
+        <w:pStyle w:val="normal1"/>
+        <w:numPr>
+          <w:ilvl w:val="1"/>
+          <w:numId w:val="1"/>
+        </w:numPr>
+        <w:ind w:hanging="360" w:left="1440"/>
+        <w:rPr/>
+      </w:pPr>
+      <w:r>
+        <w:rPr/>
+        <w:t>parameters:</w:t>
+      </w:r>
+    </w:p>
+    <w:p>
+      <w:pPr>
+        <w:pStyle w:val="normal1"/>
+        <w:numPr>
+          <w:ilvl w:val="2"/>
+          <w:numId w:val="1"/>
+        </w:numPr>
+        <w:ind w:hanging="360" w:left="2160"/>
+        <w:rPr/>
+      </w:pPr>
+      <w:r>
+        <w:rPr/>
+        <w:t>id</w:t>
+      </w:r>
+    </w:p>
+    <w:p>
+      <w:pPr>
+        <w:pStyle w:val="normal1"/>
+        <w:numPr>
+          <w:ilvl w:val="3"/>
+          <w:numId w:val="1"/>
+        </w:numPr>
+        <w:ind w:hanging="360" w:left="2880"/>
+        <w:rPr>
+          <w:color w:val="FF0000"/>
+        </w:rPr>
+      </w:pPr>
+      <w:r>
+        <w:rPr>
+          <w:color w:val="FF0000"/>
+        </w:rPr>
+        <w:t>Required</w:t>
+      </w:r>
+    </w:p>
+    <w:p>
+      <w:pPr>
+        <w:pStyle w:val="normal1"/>
+        <w:widowControl/>
+        <w:numPr>
+          <w:ilvl w:val="3"/>
+          <w:numId w:val="1"/>
+        </w:numPr>
+        <w:suppressAutoHyphens w:val="true"/>
+        <w:bidi w:val="0"/>
+        <w:spacing w:lineRule="auto" w:line="276" w:before="0" w:after="0"/>
+        <w:ind w:hanging="360" w:left="2880" w:right="0"/>
+        <w:jc w:val="left"/>
+        <w:rPr>
+          <w:color w:val="000000"/>
+        </w:rPr>
+      </w:pPr>
+      <w:r>
+        <w:rPr>
+          <w:color w:val="000000"/>
+        </w:rPr>
+        <w:t xml:space="preserve">ID of the </w:t>
+      </w:r>
+      <w:r>
+        <w:rPr>
+          <w:b w:val="false"/>
+          <w:bCs w:val="false"/>
+          <w:color w:val="000000"/>
+        </w:rPr>
+        <w:t>Permission</w:t>
+      </w:r>
+      <w:r>
+        <w:rPr>
+          <w:color w:val="000000"/>
+        </w:rPr>
+        <w:t xml:space="preserve"> to be updated</w:t>
+      </w:r>
+    </w:p>
+    <w:p>
+      <w:pPr>
+        <w:pStyle w:val="normal1"/>
+        <w:numPr>
+          <w:ilvl w:val="1"/>
+          <w:numId w:val="1"/>
+        </w:numPr>
+        <w:ind w:hanging="360" w:left="1440"/>
+        <w:rPr>
+          <w:color w:val="000000"/>
+        </w:rPr>
+      </w:pPr>
+      <w:r>
+        <w:rPr/>
+        <w:t xml:space="preserve">returns: </w:t>
+      </w:r>
+    </w:p>
+    <w:p>
+      <w:pPr>
+        <w:pStyle w:val="normal1"/>
+        <w:widowControl/>
+        <w:numPr>
+          <w:ilvl w:val="2"/>
+          <w:numId w:val="1"/>
+        </w:numPr>
+        <w:suppressAutoHyphens w:val="true"/>
+        <w:bidi w:val="0"/>
+        <w:spacing w:lineRule="auto" w:line="276" w:before="0" w:after="0"/>
+        <w:ind w:hanging="360" w:left="2160" w:right="0"/>
+        <w:jc w:val="left"/>
+        <w:rPr>
+          <w:color w:val="000000"/>
+        </w:rPr>
+      </w:pPr>
+      <w:r>
+        <w:rPr>
+          <w:color w:val="000000"/>
+        </w:rPr>
+        <w:t xml:space="preserve">the updated </w:t>
+      </w:r>
+      <w:r>
+        <w:rPr>
+          <w:b w:val="false"/>
+          <w:bCs w:val="false"/>
+          <w:color w:val="000000"/>
+        </w:rPr>
+        <w:t>Permission</w:t>
+      </w:r>
+    </w:p>
+    <w:p>
+      <w:pPr>
+        <w:pStyle w:val="normal1"/>
+        <w:numPr>
+          <w:ilvl w:val="0"/>
+          <w:numId w:val="1"/>
+        </w:numPr>
+        <w:ind w:hanging="360" w:left="720"/>
+        <w:rPr/>
+      </w:pPr>
+      <w:r>
+        <w:rPr/>
+        <w:t xml:space="preserve">DELETE </w:t>
+      </w:r>
+      <w:r>
+        <w:rPr>
+          <w:b w:val="false"/>
+          <w:bCs w:val="false"/>
+        </w:rPr>
+        <w:t>Permission</w:t>
+      </w:r>
+      <w:r>
+        <w:rPr/>
+        <w:t xml:space="preserve"> (by ID)</w:t>
+      </w:r>
+    </w:p>
+    <w:p>
+      <w:pPr>
+        <w:pStyle w:val="normal1"/>
+        <w:numPr>
+          <w:ilvl w:val="1"/>
+          <w:numId w:val="1"/>
+        </w:numPr>
+        <w:ind w:hanging="360" w:left="1440"/>
+        <w:rPr/>
+      </w:pPr>
+      <w:r>
+        <w:rPr/>
+        <w:t xml:space="preserve">built_including_tests: </w:t>
+      </w:r>
+      <w:r>
+        <w:rPr>
+          <w:b/>
+          <w:bCs/>
+        </w:rPr>
+        <w:t>true</w:t>
+      </w:r>
+    </w:p>
+    <w:p>
+      <w:pPr>
+        <w:pStyle w:val="normal1"/>
+        <w:numPr>
+          <w:ilvl w:val="1"/>
+          <w:numId w:val="1"/>
+        </w:numPr>
+        <w:ind w:hanging="360" w:left="1440"/>
+        <w:rPr/>
+      </w:pPr>
+      <w:r>
+        <w:rPr/>
+        <w:t>HTTP method: ‘DELETE’</w:t>
+      </w:r>
+    </w:p>
+    <w:p>
+      <w:pPr>
+        <w:pStyle w:val="normal1"/>
+        <w:numPr>
+          <w:ilvl w:val="1"/>
+          <w:numId w:val="1"/>
+        </w:numPr>
+        <w:ind w:hanging="360" w:left="1440"/>
+        <w:rPr/>
+      </w:pPr>
+      <w:r>
+        <w:rPr/>
+        <w:t>endpoint: {base_uri}/api/permissions/{id}</w:t>
+      </w:r>
+    </w:p>
+    <w:p>
+      <w:pPr>
+        <w:pStyle w:val="normal1"/>
+        <w:numPr>
+          <w:ilvl w:val="1"/>
+          <w:numId w:val="1"/>
+        </w:numPr>
+        <w:ind w:hanging="360" w:left="1440"/>
+        <w:rPr/>
+      </w:pPr>
+      <w:r>
+        <w:rPr/>
+        <w:t xml:space="preserve">description: </w:t>
+      </w:r>
+    </w:p>
+    <w:p>
+      <w:pPr>
+        <w:pStyle w:val="normal1"/>
+        <w:numPr>
+          <w:ilvl w:val="1"/>
+          <w:numId w:val="1"/>
+        </w:numPr>
+        <w:ind w:hanging="360" w:left="1440"/>
+        <w:rPr/>
+      </w:pPr>
+      <w:r>
+        <w:rPr/>
+        <w:t xml:space="preserve">parameters: </w:t>
+      </w:r>
+    </w:p>
+    <w:p>
+      <w:pPr>
+        <w:pStyle w:val="normal1"/>
+        <w:numPr>
+          <w:ilvl w:val="1"/>
+          <w:numId w:val="1"/>
+        </w:numPr>
+        <w:ind w:hanging="360" w:left="1440"/>
+        <w:rPr/>
+      </w:pPr>
+      <w:r>
+        <w:rPr/>
+        <w:t xml:space="preserve">returns: </w:t>
+      </w:r>
+    </w:p>
+    <w:p>
+      <w:pPr>
+        <w:pStyle w:val="normal1"/>
+        <w:widowControl/>
+        <w:numPr>
+          <w:ilvl w:val="2"/>
+          <w:numId w:val="1"/>
+        </w:numPr>
+        <w:suppressAutoHyphens w:val="true"/>
+        <w:bidi w:val="0"/>
+        <w:spacing w:lineRule="auto" w:line="276" w:before="0" w:after="0"/>
+        <w:ind w:hanging="360" w:left="2160" w:right="0"/>
+        <w:jc w:val="left"/>
+        <w:rPr/>
+      </w:pPr>
+      <w:r>
+        <w:rPr>
+          <w:b w:val="false"/>
+          <w:bCs w:val="false"/>
+          <w:color w:val="000000"/>
+        </w:rPr>
+        <w:t>a 200 OK response only</w:t>
+      </w:r>
+    </w:p>
+    <w:p>
+      <w:pPr>
+        <w:pStyle w:val="normal1"/>
+        <w:widowControl/>
+        <w:suppressAutoHyphens w:val="true"/>
+        <w:bidi w:val="0"/>
+        <w:spacing w:lineRule="auto" w:line="276" w:before="0" w:after="0"/>
+        <w:ind w:hanging="360" w:left="360" w:right="0"/>
+        <w:jc w:val="left"/>
+        <w:rPr>
+          <w:b/>
+          <w:bCs/>
+        </w:rPr>
+      </w:pPr>
+      <w:r>
+        <w:rPr>
+          <w:b/>
+          <w:bCs/>
+        </w:rPr>
+      </w:r>
+    </w:p>
+    <w:p>
+      <w:pPr>
+        <w:pStyle w:val="normal1"/>
+        <w:widowControl/>
+        <w:suppressAutoHyphens w:val="true"/>
+        <w:bidi w:val="0"/>
+        <w:spacing w:lineRule="auto" w:line="276" w:before="0" w:after="0"/>
+        <w:ind w:hanging="360" w:left="360" w:right="0"/>
+        <w:jc w:val="left"/>
+        <w:rPr>
+          <w:b/>
+          <w:bCs/>
+        </w:rPr>
+      </w:pPr>
+      <w:r>
+        <w:rPr>
+          <w:b/>
+          <w:bCs/>
+        </w:rPr>
+      </w:r>
+    </w:p>
+    <w:p>
+      <w:pPr>
+        <w:pStyle w:val="normal1"/>
+        <w:widowControl/>
+        <w:suppressAutoHyphens w:val="true"/>
+        <w:bidi w:val="0"/>
+        <w:spacing w:lineRule="auto" w:line="276" w:before="0" w:after="0"/>
+        <w:ind w:hanging="360" w:left="360" w:right="0"/>
+        <w:jc w:val="left"/>
+        <w:rPr/>
+      </w:pPr>
+      <w:r>
+        <w:rPr>
+          <w:b/>
+          <w:bCs/>
+          <w:color w:val="000000"/>
+        </w:rPr>
+        <w:t>PingMsg</w:t>
+      </w:r>
+    </w:p>
+    <w:p>
+      <w:pPr>
+        <w:pStyle w:val="normal1"/>
+        <w:numPr>
+          <w:ilvl w:val="0"/>
+          <w:numId w:val="1"/>
+        </w:numPr>
+        <w:ind w:hanging="360" w:left="720"/>
+        <w:rPr/>
+      </w:pPr>
+      <w:r>
+        <w:rPr/>
+        <w:t>GET All PingMsgs</w:t>
+      </w:r>
+    </w:p>
+    <w:p>
+      <w:pPr>
+        <w:pStyle w:val="normal1"/>
+        <w:numPr>
+          <w:ilvl w:val="1"/>
+          <w:numId w:val="1"/>
+        </w:numPr>
+        <w:ind w:hanging="360" w:left="1440"/>
+        <w:rPr/>
+      </w:pPr>
+      <w:r>
+        <w:rPr/>
+        <w:t xml:space="preserve">built_including_tests: </w:t>
+      </w:r>
+      <w:r>
+        <w:rPr>
+          <w:b/>
+          <w:bCs/>
+        </w:rPr>
+        <w:t>false</w:t>
+      </w:r>
+    </w:p>
+    <w:p>
+      <w:pPr>
+        <w:pStyle w:val="normal1"/>
+        <w:numPr>
+          <w:ilvl w:val="1"/>
+          <w:numId w:val="1"/>
+        </w:numPr>
+        <w:ind w:hanging="360" w:left="1440"/>
+        <w:rPr/>
+      </w:pPr>
+      <w:r>
+        <w:rPr/>
+        <w:t>HTTP method: ‘GET’</w:t>
+      </w:r>
+    </w:p>
+    <w:p>
+      <w:pPr>
+        <w:pStyle w:val="normal1"/>
+        <w:numPr>
+          <w:ilvl w:val="1"/>
+          <w:numId w:val="1"/>
+        </w:numPr>
+        <w:ind w:hanging="360" w:left="1440"/>
+        <w:rPr/>
+      </w:pPr>
+      <w:r>
+        <w:rPr/>
+        <w:t>endpoint: {base_uri}/pingmsg?page={page_num}&amp;page_size={num_of_rows}</w:t>
+      </w:r>
+    </w:p>
+    <w:p>
+      <w:pPr>
+        <w:pStyle w:val="normal1"/>
+        <w:numPr>
+          <w:ilvl w:val="1"/>
+          <w:numId w:val="1"/>
+        </w:numPr>
+        <w:ind w:hanging="360" w:left="1440"/>
+        <w:rPr/>
+      </w:pPr>
+      <w:r>
+        <w:rPr/>
+        <w:t xml:space="preserve">description: </w:t>
+      </w:r>
+    </w:p>
+    <w:p>
+      <w:pPr>
+        <w:pStyle w:val="normal1"/>
+        <w:numPr>
+          <w:ilvl w:val="1"/>
+          <w:numId w:val="1"/>
+        </w:numPr>
+        <w:ind w:hanging="360" w:left="1440"/>
+        <w:rPr/>
+      </w:pPr>
+      <w:r>
+        <w:rPr/>
+        <w:t xml:space="preserve">parameters: </w:t>
+      </w:r>
+    </w:p>
+    <w:p>
+      <w:pPr>
+        <w:pStyle w:val="normal1"/>
+        <w:numPr>
+          <w:ilvl w:val="2"/>
+          <w:numId w:val="1"/>
+        </w:numPr>
+        <w:ind w:hanging="360" w:left="2160"/>
+        <w:rPr/>
+      </w:pPr>
+      <w:r>
+        <w:rPr/>
+        <w:t>page={page_num}</w:t>
+      </w:r>
+    </w:p>
+    <w:p>
+      <w:pPr>
+        <w:pStyle w:val="normal1"/>
+        <w:numPr>
+          <w:ilvl w:val="3"/>
+          <w:numId w:val="1"/>
+        </w:numPr>
+        <w:ind w:hanging="360" w:left="2880"/>
+        <w:rPr>
+          <w:color w:val="FF0000"/>
+        </w:rPr>
+      </w:pPr>
+      <w:r>
+        <w:rPr>
+          <w:color w:val="FF0000"/>
+        </w:rPr>
+        <w:t>Required</w:t>
+      </w:r>
+    </w:p>
+    <w:p>
+      <w:pPr>
+        <w:pStyle w:val="normal1"/>
+        <w:numPr>
+          <w:ilvl w:val="3"/>
+          <w:numId w:val="1"/>
+        </w:numPr>
+        <w:ind w:hanging="360" w:left="2880"/>
+        <w:rPr/>
+      </w:pPr>
+      <w:r>
+        <w:rPr/>
+        <w:t>Defines which page to return</w:t>
+      </w:r>
+    </w:p>
+    <w:p>
+      <w:pPr>
+        <w:pStyle w:val="normal1"/>
+        <w:numPr>
+          <w:ilvl w:val="3"/>
+          <w:numId w:val="1"/>
+        </w:numPr>
+        <w:ind w:hanging="360" w:left="2880"/>
+        <w:rPr/>
+      </w:pPr>
+      <w:r>
+        <w:rPr/>
+        <w:t>First page = 0 (zero)</w:t>
+      </w:r>
+    </w:p>
+    <w:p>
+      <w:pPr>
+        <w:pStyle w:val="normal1"/>
+        <w:numPr>
+          <w:ilvl w:val="2"/>
+          <w:numId w:val="1"/>
+        </w:numPr>
+        <w:ind w:hanging="360" w:left="2160"/>
+        <w:rPr/>
+      </w:pPr>
+      <w:r>
+        <w:rPr/>
+        <w:t>page_size={num_of_rows}</w:t>
+      </w:r>
+    </w:p>
+    <w:p>
+      <w:pPr>
+        <w:pStyle w:val="normal1"/>
+        <w:numPr>
+          <w:ilvl w:val="3"/>
+          <w:numId w:val="1"/>
+        </w:numPr>
+        <w:ind w:hanging="360" w:left="2880"/>
+        <w:rPr>
+          <w:color w:val="FF0000"/>
+        </w:rPr>
+      </w:pPr>
+      <w:r>
+        <w:rPr>
+          <w:color w:val="FF0000"/>
+        </w:rPr>
+        <w:t>Required</w:t>
+      </w:r>
+    </w:p>
+    <w:p>
+      <w:pPr>
+        <w:pStyle w:val="normal1"/>
+        <w:numPr>
+          <w:ilvl w:val="3"/>
+          <w:numId w:val="1"/>
+        </w:numPr>
+        <w:ind w:hanging="360" w:left="2880"/>
+        <w:rPr/>
+      </w:pPr>
+      <w:r>
+        <w:rPr/>
+        <w:t>Defines how many rows to return for the selected page</w:t>
+      </w:r>
+    </w:p>
+    <w:p>
+      <w:pPr>
+        <w:pStyle w:val="normal1"/>
+        <w:numPr>
+          <w:ilvl w:val="1"/>
+          <w:numId w:val="1"/>
+        </w:numPr>
+        <w:ind w:hanging="360" w:left="1440"/>
+        <w:rPr/>
+      </w:pPr>
+      <w:r>
+        <w:rPr/>
+        <w:t xml:space="preserve">returns: </w:t>
+      </w:r>
+    </w:p>
+    <w:p>
+      <w:pPr>
+        <w:pStyle w:val="normal1"/>
+        <w:numPr>
+          <w:ilvl w:val="0"/>
+          <w:numId w:val="1"/>
+        </w:numPr>
+        <w:ind w:hanging="360" w:left="720"/>
+        <w:rPr/>
+      </w:pPr>
+      <w:r>
+        <w:rPr/>
+        <w:t>GET PingMsg by ID</w:t>
+      </w:r>
+    </w:p>
+    <w:p>
+      <w:pPr>
+        <w:pStyle w:val="normal1"/>
+        <w:numPr>
+          <w:ilvl w:val="1"/>
+          <w:numId w:val="1"/>
+        </w:numPr>
+        <w:ind w:hanging="360" w:left="1440"/>
+        <w:rPr/>
+      </w:pPr>
+      <w:r>
+        <w:rPr/>
+        <w:t xml:space="preserve">built_including_tests: </w:t>
+      </w:r>
+      <w:r>
+        <w:rPr>
+          <w:b/>
+          <w:bCs/>
+        </w:rPr>
+        <w:t>false</w:t>
+      </w:r>
+    </w:p>
+    <w:p>
+      <w:pPr>
+        <w:pStyle w:val="normal1"/>
+        <w:numPr>
+          <w:ilvl w:val="1"/>
+          <w:numId w:val="1"/>
+        </w:numPr>
+        <w:ind w:hanging="360" w:left="1440"/>
+        <w:rPr/>
+      </w:pPr>
+      <w:r>
+        <w:rPr/>
+        <w:t>HTTP method: ‘GET’</w:t>
+      </w:r>
+    </w:p>
+    <w:p>
+      <w:pPr>
+        <w:pStyle w:val="normal1"/>
+        <w:numPr>
+          <w:ilvl w:val="1"/>
+          <w:numId w:val="1"/>
+        </w:numPr>
+        <w:ind w:hanging="360" w:left="1440"/>
+        <w:rPr/>
+      </w:pPr>
+      <w:r>
+        <w:rPr/>
+        <w:t>endpoint: {base_uri}/pingmsg/{id}</w:t>
+      </w:r>
+    </w:p>
+    <w:p>
+      <w:pPr>
+        <w:pStyle w:val="normal1"/>
+        <w:numPr>
+          <w:ilvl w:val="1"/>
+          <w:numId w:val="1"/>
+        </w:numPr>
+        <w:ind w:hanging="360" w:left="1440"/>
+        <w:rPr/>
+      </w:pPr>
+      <w:r>
+        <w:rPr/>
+        <w:t xml:space="preserve">description: </w:t>
+      </w:r>
+    </w:p>
+    <w:p>
+      <w:pPr>
+        <w:pStyle w:val="normal1"/>
+        <w:numPr>
+          <w:ilvl w:val="1"/>
+          <w:numId w:val="1"/>
+        </w:numPr>
+        <w:ind w:hanging="360" w:left="1440"/>
+        <w:rPr/>
+      </w:pPr>
+      <w:r>
+        <w:rPr/>
+        <w:t xml:space="preserve">parameters: </w:t>
+      </w:r>
+    </w:p>
+    <w:p>
+      <w:pPr>
+        <w:pStyle w:val="normal1"/>
+        <w:numPr>
+          <w:ilvl w:val="2"/>
+          <w:numId w:val="1"/>
+        </w:numPr>
+        <w:ind w:hanging="360" w:left="2160"/>
+        <w:rPr/>
+      </w:pPr>
+      <w:r>
+        <w:rPr/>
+        <w:t>id</w:t>
+      </w:r>
+    </w:p>
+    <w:p>
+      <w:pPr>
+        <w:pStyle w:val="normal1"/>
+        <w:numPr>
+          <w:ilvl w:val="3"/>
+          <w:numId w:val="1"/>
+        </w:numPr>
+        <w:ind w:hanging="360" w:left="2880"/>
+        <w:rPr>
+          <w:color w:val="FF0000"/>
+        </w:rPr>
+      </w:pPr>
+      <w:r>
+        <w:rPr>
+          <w:color w:val="FF0000"/>
+        </w:rPr>
+        <w:t>Required</w:t>
+      </w:r>
+    </w:p>
+    <w:p>
+      <w:pPr>
+        <w:pStyle w:val="normal1"/>
+        <w:numPr>
+          <w:ilvl w:val="3"/>
+          <w:numId w:val="1"/>
+        </w:numPr>
+        <w:ind w:hanging="360" w:left="2880"/>
+        <w:rPr/>
+      </w:pPr>
+      <w:r>
+        <w:rPr/>
+        <w:t>ID of the PingMsg to receive</w:t>
+      </w:r>
+    </w:p>
+    <w:p>
+      <w:pPr>
+        <w:pStyle w:val="normal1"/>
+        <w:widowControl/>
+        <w:numPr>
+          <w:ilvl w:val="1"/>
+          <w:numId w:val="1"/>
+        </w:numPr>
+        <w:suppressAutoHyphens w:val="true"/>
+        <w:bidi w:val="0"/>
+        <w:spacing w:lineRule="auto" w:line="276" w:before="0" w:after="0"/>
+        <w:ind w:hanging="360" w:left="1440" w:right="0"/>
+        <w:jc w:val="left"/>
+        <w:rPr/>
+      </w:pPr>
+      <w:r>
+        <w:rPr>
+          <w:b w:val="false"/>
+          <w:bCs w:val="false"/>
+          <w:color w:val="000000"/>
+        </w:rPr>
+        <w:t xml:space="preserve">returns: </w:t>
+      </w:r>
+    </w:p>
+    <w:p>
+      <w:pPr>
+        <w:pStyle w:val="normal1"/>
+        <w:numPr>
+          <w:ilvl w:val="0"/>
+          <w:numId w:val="1"/>
+        </w:numPr>
+        <w:ind w:hanging="360" w:left="720"/>
+        <w:rPr/>
+      </w:pPr>
+      <w:r>
+        <w:rPr/>
+        <w:t>POST/Create PingMsg</w:t>
+      </w:r>
+    </w:p>
+    <w:p>
+      <w:pPr>
+        <w:pStyle w:val="normal1"/>
+        <w:numPr>
+          <w:ilvl w:val="1"/>
+          <w:numId w:val="1"/>
+        </w:numPr>
+        <w:ind w:hanging="360" w:left="1440"/>
+        <w:rPr/>
+      </w:pPr>
+      <w:r>
+        <w:rPr/>
+        <w:t xml:space="preserve">built_including_tests: </w:t>
+      </w:r>
+      <w:r>
+        <w:rPr>
+          <w:b/>
+          <w:bCs/>
+        </w:rPr>
+        <w:t>false</w:t>
+      </w:r>
+    </w:p>
+    <w:p>
+      <w:pPr>
+        <w:pStyle w:val="normal1"/>
+        <w:numPr>
+          <w:ilvl w:val="1"/>
+          <w:numId w:val="1"/>
+        </w:numPr>
+        <w:ind w:hanging="360" w:left="1440"/>
+        <w:rPr/>
+      </w:pPr>
+      <w:r>
+        <w:rPr/>
+        <w:t>HTTP method: ‘POST’</w:t>
+      </w:r>
+    </w:p>
+    <w:p>
+      <w:pPr>
+        <w:pStyle w:val="normal1"/>
+        <w:numPr>
+          <w:ilvl w:val="1"/>
+          <w:numId w:val="1"/>
+        </w:numPr>
+        <w:ind w:hanging="360" w:left="1440"/>
+        <w:rPr/>
+      </w:pPr>
+      <w:r>
+        <w:rPr/>
+        <w:t>endpoint: {base_uri}/pingmsg</w:t>
+      </w:r>
+    </w:p>
+    <w:p>
+      <w:pPr>
+        <w:pStyle w:val="normal1"/>
+        <w:numPr>
+          <w:ilvl w:val="1"/>
+          <w:numId w:val="1"/>
+        </w:numPr>
+        <w:ind w:hanging="360" w:left="1440"/>
+        <w:rPr/>
+      </w:pPr>
+      <w:r>
+        <w:rPr/>
+        <w:t xml:space="preserve">description: </w:t>
+      </w:r>
+    </w:p>
+    <w:p>
+      <w:pPr>
+        <w:pStyle w:val="normal1"/>
+        <w:numPr>
+          <w:ilvl w:val="1"/>
+          <w:numId w:val="1"/>
+        </w:numPr>
+        <w:ind w:hanging="360" w:left="1440"/>
+        <w:rPr/>
+      </w:pPr>
+      <w:r>
+        <w:rPr/>
+        <w:t xml:space="preserve">body: </w:t>
+      </w:r>
+    </w:p>
+    <w:p>
+      <w:pPr>
+        <w:pStyle w:val="normal1"/>
+        <w:numPr>
+          <w:ilvl w:val="1"/>
+          <w:numId w:val="1"/>
+        </w:numPr>
+        <w:ind w:hanging="360" w:left="1440"/>
+        <w:rPr/>
+      </w:pPr>
+      <w:r>
+        <w:rPr/>
+        <w:t xml:space="preserve">parameters: </w:t>
+      </w:r>
+    </w:p>
+    <w:p>
+      <w:pPr>
+        <w:pStyle w:val="normal1"/>
+        <w:numPr>
+          <w:ilvl w:val="1"/>
+          <w:numId w:val="1"/>
+        </w:numPr>
+        <w:ind w:hanging="360" w:left="1440"/>
+        <w:rPr/>
+      </w:pPr>
+      <w:r>
+        <w:rPr/>
+        <w:t xml:space="preserve">returns: </w:t>
+      </w:r>
+    </w:p>
+    <w:p>
+      <w:pPr>
+        <w:pStyle w:val="normal1"/>
+        <w:widowControl/>
+        <w:numPr>
+          <w:ilvl w:val="2"/>
+          <w:numId w:val="1"/>
+        </w:numPr>
+        <w:suppressAutoHyphens w:val="true"/>
+        <w:bidi w:val="0"/>
+        <w:spacing w:lineRule="auto" w:line="276" w:before="0" w:after="0"/>
+        <w:ind w:hanging="360" w:left="2160" w:right="0"/>
+        <w:jc w:val="left"/>
+        <w:rPr/>
+      </w:pPr>
+      <w:r>
+        <w:rPr/>
+        <w:t>the created PingMsg</w:t>
+      </w:r>
+    </w:p>
+    <w:p>
+      <w:pPr>
+        <w:pStyle w:val="normal1"/>
+        <w:numPr>
+          <w:ilvl w:val="0"/>
+          <w:numId w:val="1"/>
+        </w:numPr>
+        <w:ind w:hanging="360" w:left="720"/>
+        <w:rPr/>
+      </w:pPr>
+      <w:r>
+        <w:rPr/>
+        <w:t>PUT/Update PingMsg</w:t>
+      </w:r>
+    </w:p>
+    <w:p>
+      <w:pPr>
+        <w:pStyle w:val="normal1"/>
+        <w:numPr>
+          <w:ilvl w:val="1"/>
+          <w:numId w:val="1"/>
+        </w:numPr>
+        <w:ind w:hanging="360" w:left="1440"/>
+        <w:rPr/>
+      </w:pPr>
+      <w:r>
+        <w:rPr/>
+        <w:t xml:space="preserve">built_including_tests: </w:t>
+      </w:r>
+      <w:r>
+        <w:rPr>
+          <w:b/>
+          <w:bCs/>
+        </w:rPr>
+        <w:t>false</w:t>
+      </w:r>
+    </w:p>
+    <w:p>
+      <w:pPr>
+        <w:pStyle w:val="normal1"/>
+        <w:numPr>
+          <w:ilvl w:val="1"/>
+          <w:numId w:val="1"/>
+        </w:numPr>
+        <w:ind w:hanging="360" w:left="1440"/>
+        <w:rPr/>
+      </w:pPr>
+      <w:r>
+        <w:rPr/>
+        <w:t>HTTP method: ‘PUT’</w:t>
+      </w:r>
+    </w:p>
+    <w:p>
+      <w:pPr>
+        <w:pStyle w:val="normal1"/>
+        <w:numPr>
+          <w:ilvl w:val="1"/>
+          <w:numId w:val="1"/>
+        </w:numPr>
+        <w:ind w:hanging="360" w:left="1440"/>
+        <w:rPr/>
+      </w:pPr>
+      <w:r>
+        <w:rPr/>
+        <w:t>endpoint: {base_uri}/pingmsg/{id}</w:t>
+      </w:r>
+    </w:p>
+    <w:p>
+      <w:pPr>
+        <w:pStyle w:val="normal1"/>
+        <w:numPr>
+          <w:ilvl w:val="1"/>
+          <w:numId w:val="1"/>
+        </w:numPr>
+        <w:ind w:hanging="360" w:left="1440"/>
+        <w:rPr/>
+      </w:pPr>
+      <w:r>
+        <w:rPr/>
+        <w:t xml:space="preserve">description: </w:t>
+      </w:r>
+    </w:p>
+    <w:p>
+      <w:pPr>
+        <w:pStyle w:val="normal1"/>
+        <w:numPr>
+          <w:ilvl w:val="1"/>
+          <w:numId w:val="1"/>
+        </w:numPr>
+        <w:ind w:hanging="360" w:left="1440"/>
+        <w:rPr/>
+      </w:pPr>
+      <w:r>
+        <w:rPr/>
+        <w:t xml:space="preserve">body: </w:t>
+      </w:r>
+    </w:p>
+    <w:p>
+      <w:pPr>
+        <w:pStyle w:val="normal1"/>
+        <w:widowControl/>
+        <w:numPr>
+          <w:ilvl w:val="2"/>
+          <w:numId w:val="1"/>
+        </w:numPr>
+        <w:suppressAutoHyphens w:val="true"/>
+        <w:bidi w:val="0"/>
+        <w:spacing w:lineRule="auto" w:line="276" w:before="0" w:after="0"/>
+        <w:ind w:hanging="360" w:left="2160" w:right="0"/>
+        <w:jc w:val="left"/>
+        <w:rPr/>
+      </w:pPr>
+      <w:r>
+        <w:rPr/>
+        <w:t>only fields that you want to update (other than ID in the URI path) need to be provided</w:t>
+      </w:r>
+    </w:p>
+    <w:p>
+      <w:pPr>
+        <w:pStyle w:val="normal1"/>
+        <w:numPr>
+          <w:ilvl w:val="1"/>
+          <w:numId w:val="1"/>
+        </w:numPr>
+        <w:ind w:hanging="360" w:left="1440"/>
+        <w:rPr/>
+      </w:pPr>
+      <w:r>
+        <w:rPr/>
+        <w:t>parameters:</w:t>
+      </w:r>
+    </w:p>
+    <w:p>
+      <w:pPr>
+        <w:pStyle w:val="normal1"/>
+        <w:numPr>
+          <w:ilvl w:val="2"/>
+          <w:numId w:val="1"/>
+        </w:numPr>
+        <w:ind w:hanging="360" w:left="2160"/>
+        <w:rPr/>
+      </w:pPr>
+      <w:r>
+        <w:rPr/>
+        <w:t>id</w:t>
+      </w:r>
+    </w:p>
+    <w:p>
+      <w:pPr>
+        <w:pStyle w:val="normal1"/>
+        <w:numPr>
+          <w:ilvl w:val="3"/>
+          <w:numId w:val="1"/>
+        </w:numPr>
+        <w:ind w:hanging="360" w:left="2880"/>
+        <w:rPr>
+          <w:color w:val="FF0000"/>
+        </w:rPr>
+      </w:pPr>
+      <w:r>
+        <w:rPr>
+          <w:color w:val="FF0000"/>
+        </w:rPr>
+        <w:t>Required</w:t>
+      </w:r>
+    </w:p>
+    <w:p>
+      <w:pPr>
+        <w:pStyle w:val="normal1"/>
+        <w:widowControl/>
+        <w:numPr>
+          <w:ilvl w:val="3"/>
+          <w:numId w:val="1"/>
+        </w:numPr>
+        <w:suppressAutoHyphens w:val="true"/>
+        <w:bidi w:val="0"/>
+        <w:spacing w:lineRule="auto" w:line="276" w:before="0" w:after="0"/>
+        <w:ind w:hanging="360" w:left="2880" w:right="0"/>
+        <w:jc w:val="left"/>
+        <w:rPr>
+          <w:color w:val="000000"/>
+        </w:rPr>
+      </w:pPr>
+      <w:r>
+        <w:rPr>
+          <w:color w:val="000000"/>
+        </w:rPr>
+        <w:t>ID of the PingMsg to be updated</w:t>
+      </w:r>
+    </w:p>
+    <w:p>
+      <w:pPr>
+        <w:pStyle w:val="normal1"/>
+        <w:numPr>
+          <w:ilvl w:val="1"/>
+          <w:numId w:val="1"/>
+        </w:numPr>
+        <w:ind w:hanging="360" w:left="1440"/>
+        <w:rPr>
+          <w:color w:val="000000"/>
+        </w:rPr>
+      </w:pPr>
+      <w:r>
+        <w:rPr/>
+        <w:t xml:space="preserve">returns: </w:t>
+      </w:r>
+    </w:p>
+    <w:p>
+      <w:pPr>
+        <w:pStyle w:val="normal1"/>
+        <w:widowControl/>
+        <w:numPr>
+          <w:ilvl w:val="2"/>
+          <w:numId w:val="1"/>
+        </w:numPr>
+        <w:suppressAutoHyphens w:val="true"/>
+        <w:bidi w:val="0"/>
+        <w:spacing w:lineRule="auto" w:line="276" w:before="0" w:after="0"/>
+        <w:ind w:hanging="360" w:left="2160" w:right="0"/>
+        <w:jc w:val="left"/>
+        <w:rPr>
+          <w:color w:val="000000"/>
+        </w:rPr>
+      </w:pPr>
+      <w:r>
+        <w:rPr>
+          <w:color w:val="000000"/>
+        </w:rPr>
+        <w:t>the updated PingMsg</w:t>
+      </w:r>
+    </w:p>
+    <w:p>
+      <w:pPr>
+        <w:pStyle w:val="normal1"/>
+        <w:numPr>
+          <w:ilvl w:val="0"/>
+          <w:numId w:val="1"/>
+        </w:numPr>
+        <w:ind w:hanging="360" w:left="720"/>
+        <w:rPr/>
+      </w:pPr>
+      <w:r>
+        <w:rPr/>
+        <w:t>DELETE PingMsg (by ID)</w:t>
+      </w:r>
+    </w:p>
+    <w:p>
+      <w:pPr>
+        <w:pStyle w:val="normal1"/>
+        <w:numPr>
+          <w:ilvl w:val="1"/>
+          <w:numId w:val="1"/>
+        </w:numPr>
+        <w:ind w:hanging="360" w:left="1440"/>
+        <w:rPr/>
+      </w:pPr>
+      <w:r>
+        <w:rPr/>
+        <w:t xml:space="preserve">built_including_tests: </w:t>
+      </w:r>
+      <w:r>
+        <w:rPr>
+          <w:b/>
+          <w:bCs/>
+        </w:rPr>
+        <w:t>false</w:t>
+      </w:r>
+    </w:p>
+    <w:p>
+      <w:pPr>
+        <w:pStyle w:val="normal1"/>
+        <w:numPr>
+          <w:ilvl w:val="1"/>
+          <w:numId w:val="1"/>
+        </w:numPr>
+        <w:ind w:hanging="360" w:left="1440"/>
+        <w:rPr/>
+      </w:pPr>
+      <w:r>
+        <w:rPr/>
+        <w:t>HTTP method: ‘DELETE’</w:t>
+      </w:r>
+    </w:p>
+    <w:p>
+      <w:pPr>
+        <w:pStyle w:val="normal1"/>
+        <w:numPr>
+          <w:ilvl w:val="1"/>
+          <w:numId w:val="1"/>
+        </w:numPr>
+        <w:ind w:hanging="360" w:left="1440"/>
+        <w:rPr/>
+      </w:pPr>
+      <w:r>
+        <w:rPr/>
+        <w:t>endpoint: {base_uri}/pingmsg/{id}</w:t>
+      </w:r>
+    </w:p>
+    <w:p>
+      <w:pPr>
+        <w:pStyle w:val="normal1"/>
+        <w:numPr>
+          <w:ilvl w:val="1"/>
+          <w:numId w:val="1"/>
+        </w:numPr>
+        <w:ind w:hanging="360" w:left="1440"/>
+        <w:rPr/>
+      </w:pPr>
+      <w:r>
+        <w:rPr/>
+        <w:t xml:space="preserve">description: </w:t>
+      </w:r>
+    </w:p>
+    <w:p>
+      <w:pPr>
+        <w:pStyle w:val="normal1"/>
+        <w:numPr>
+          <w:ilvl w:val="1"/>
+          <w:numId w:val="1"/>
+        </w:numPr>
+        <w:ind w:hanging="360" w:left="1440"/>
+        <w:rPr/>
+      </w:pPr>
+      <w:r>
+        <w:rPr/>
+        <w:t xml:space="preserve">parameters: </w:t>
+      </w:r>
+    </w:p>
+    <w:p>
+      <w:pPr>
+        <w:pStyle w:val="normal1"/>
+        <w:numPr>
+          <w:ilvl w:val="1"/>
+          <w:numId w:val="1"/>
+        </w:numPr>
+        <w:ind w:hanging="360" w:left="1440"/>
+        <w:rPr/>
+      </w:pPr>
+      <w:r>
+        <w:rPr/>
+        <w:t xml:space="preserve">returns: </w:t>
+      </w:r>
+    </w:p>
+    <w:p>
+      <w:pPr>
+        <w:pStyle w:val="normal1"/>
+        <w:widowControl/>
+        <w:numPr>
+          <w:ilvl w:val="2"/>
+          <w:numId w:val="1"/>
+        </w:numPr>
+        <w:suppressAutoHyphens w:val="true"/>
+        <w:bidi w:val="0"/>
+        <w:spacing w:lineRule="auto" w:line="276" w:before="0" w:after="0"/>
+        <w:ind w:hanging="360" w:left="2160" w:right="0"/>
+        <w:jc w:val="left"/>
+        <w:rPr>
+          <w:b w:val="false"/>
+          <w:bCs w:val="false"/>
+        </w:rPr>
+      </w:pPr>
+      <w:r>
+        <w:rPr>
+          <w:b w:val="false"/>
+          <w:bCs w:val="false"/>
+          <w:color w:val="000000"/>
+        </w:rPr>
+        <w:t>a 200 OK response only</w:t>
+      </w:r>
+    </w:p>
+    <w:p>
+      <w:pPr>
+        <w:pStyle w:val="normal1"/>
+        <w:widowControl/>
+        <w:suppressAutoHyphens w:val="true"/>
+        <w:bidi w:val="0"/>
+        <w:spacing w:lineRule="auto" w:line="276" w:before="0" w:after="0"/>
+        <w:ind w:hanging="360" w:left="360" w:right="0"/>
+        <w:jc w:val="left"/>
+        <w:rPr>
+          <w:b/>
+          <w:bCs/>
+        </w:rPr>
+      </w:pPr>
+      <w:r>
+        <w:rPr/>
+      </w:r>
+    </w:p>
+    <w:p>
+      <w:pPr>
+        <w:pStyle w:val="normal1"/>
+        <w:widowControl/>
+        <w:suppressAutoHyphens w:val="true"/>
+        <w:bidi w:val="0"/>
+        <w:spacing w:lineRule="auto" w:line="276" w:before="0" w:after="0"/>
+        <w:ind w:hanging="360" w:left="360" w:right="0"/>
+        <w:jc w:val="left"/>
+        <w:rPr>
+          <w:b/>
+          <w:bCs/>
+        </w:rPr>
+      </w:pPr>
+      <w:r>
+        <w:rPr/>
       </w:r>
     </w:p>
     <w:p>

</xml_diff>

<commit_message>
replaced the /api/tournaments/today endpoint with the /api/tournaments/today-max-100 endpoint and then renamed it so that only the /api/tournaments/today endpoint remains; updated integratoin tests accordingly; updated API docs to reflect the change; logic of the endpoint itself was not changed
</commit_message>
<xml_diff>
--- a/docs/QView API Documentation.docx
+++ b/docs/QView API Documentation.docx
@@ -1,6 +1,6 @@
 
 <file path=word/document.xml><?xml version="1.0" encoding="utf-8"?>
-<w:document xmlns:o="urn:schemas-microsoft-com:office:office" xmlns:r="http://schemas.openxmlformats.org/officeDocument/2006/relationships" xmlns:v="urn:schemas-microsoft-com:vml" xmlns:w="http://schemas.openxmlformats.org/wordprocessingml/2006/main" xmlns:w10="urn:schemas-microsoft-com:office:word" xmlns:wp="http://schemas.openxmlformats.org/drawingml/2006/wordprocessingDrawing" xmlns:wps="http://schemas.microsoft.com/office/word/2010/wordprocessingShape" xmlns:wpg="http://schemas.microsoft.com/office/word/2010/wordprocessingGroup" xmlns:mc="http://schemas.openxmlformats.org/markup-compatibility/2006" xmlns:wp14="http://schemas.microsoft.com/office/word/2010/wordprocessingDrawing" xmlns:w14="http://schemas.microsoft.com/office/word/2010/wordml" xmlns:w15="http://schemas.microsoft.com/office/word/2012/wordml" mc:Ignorable="w14 wp14 w15">
+<w:document xmlns:o="urn:schemas-microsoft-com:office:office" xmlns:r="http://schemas.openxmlformats.org/officeDocument/2006/relationships" xmlns:v="urn:schemas-microsoft-com:vml" xmlns:w="http://schemas.openxmlformats.org/wordprocessingml/2006/main" xmlns:w10="urn:schemas-microsoft-com:office:word" xmlns:wp="http://schemas.openxmlformats.org/drawingml/2006/wordprocessingDrawing" xmlns:pic="http://schemas.openxmlformats.org/drawingml/2006/picture" xmlns:wps="http://schemas.microsoft.com/office/word/2010/wordprocessingShape" xmlns:wpg="http://schemas.microsoft.com/office/word/2010/wordprocessingGroup" xmlns:mc="http://schemas.openxmlformats.org/markup-compatibility/2006" xmlns:wp14="http://schemas.microsoft.com/office/word/2010/wordprocessingDrawing" xmlns:w14="http://schemas.microsoft.com/office/word/2010/wordml" xmlns:w15="http://schemas.microsoft.com/office/word/2012/wordml" mc:Ignorable="w14 wp14 w15">
   <w:body>
     <w:p>
       <w:pPr>
@@ -14,15 +14,15 @@
       </w:r>
       <w:r>
         <w:rPr/>
-        <w:t>5</w:t>
-      </w:r>
-      <w:r>
-        <w:rPr/>
-        <w:t>_2026.04.</w:t>
-      </w:r>
-      <w:r>
-        <w:rPr/>
-        <w:t>27</w:t>
+        <w:t>6</w:t>
+      </w:r>
+      <w:r>
+        <w:rPr/>
+        <w:t>_2026.0</w:t>
+      </w:r>
+      <w:r>
+        <w:rPr/>
+        <w:t>6.23</w:t>
       </w:r>
       <w:r>
         <w:rPr/>
@@ -72,7 +72,7 @@
       <w:hyperlink r:id="rId2">
         <w:r>
           <w:rPr>
-            <w:rStyle w:val="ListLabel55"/>
+            <w:rStyle w:val="Style3"/>
             <w:color w:val="1155CC"/>
             <w:u w:val="single"/>
           </w:rPr>
@@ -8114,7 +8114,6 @@
         <w:ind w:hanging="360" w:left="1440"/>
         <w:rPr>
           <w:i/>
-          <w:i/>
           <w:iCs/>
           <w:highlight w:val="none"/>
           <w:shd w:fill="auto" w:val="clear"/>
@@ -8168,7 +8167,6 @@
         </w:numPr>
         <w:ind w:hanging="360" w:left="1440"/>
         <w:rPr>
-          <w:i/>
           <w:i/>
           <w:iCs/>
           <w:highlight w:val="none"/>
@@ -28396,7 +28394,10 @@
         </w:rPr>
       </w:pPr>
       <w:r>
-        <w:rPr/>
+        <w:rPr>
+          <w:b/>
+          <w:bCs/>
+        </w:rPr>
       </w:r>
     </w:p>
     <w:p>
@@ -28414,7 +28415,10 @@
         </w:rPr>
       </w:pPr>
       <w:r>
-        <w:rPr/>
+        <w:rPr>
+          <w:b/>
+          <w:bCs/>
+        </w:rPr>
       </w:r>
     </w:p>
     <w:p>
@@ -30409,7 +30413,10 @@
         </w:rPr>
       </w:pPr>
       <w:r>
-        <w:rPr/>
+        <w:rPr>
+          <w:b/>
+          <w:bCs/>
+        </w:rPr>
       </w:r>
     </w:p>
     <w:p>
@@ -30427,7 +30434,10 @@
         </w:rPr>
       </w:pPr>
       <w:r>
-        <w:rPr/>
+        <w:rPr>
+          <w:b/>
+          <w:bCs/>
+        </w:rPr>
       </w:r>
     </w:p>
     <w:p>
@@ -43933,7 +43943,11 @@
       </w:pPr>
       <w:r>
         <w:rPr/>
-        <w:t>GET All Tournaments Happening Today</w:t>
+        <w:t xml:space="preserve">GET All Tournaments </w:t>
+      </w:r>
+      <w:r>
+        <w:rPr/>
+        <w:t>Around Today’s Date</w:t>
       </w:r>
     </w:p>
     <w:p>
@@ -44006,6 +44020,26 @@
     <w:p>
       <w:pPr>
         <w:pStyle w:val="normal1"/>
+        <w:widowControl/>
+        <w:numPr>
+          <w:ilvl w:val="2"/>
+          <w:numId w:val="1"/>
+        </w:numPr>
+        <w:suppressAutoHyphens w:val="true"/>
+        <w:bidi w:val="0"/>
+        <w:spacing w:lineRule="auto" w:line="276" w:before="0" w:after="0"/>
+        <w:ind w:hanging="360" w:left="2160" w:right="0"/>
+        <w:jc w:val="left"/>
+        <w:rPr/>
+      </w:pPr>
+      <w:r>
+        <w:rPr/>
+        <w:t>Looks at today’s data and returns tournaments up to 31 days before and after the current date (today). If the total number of tournaments returned is &gt; 100, then tournaments are removed from the beginning and end of the list until there are 100 or 99 tournaments. Includes the rooms of the tournaments also.</w:t>
+      </w:r>
+    </w:p>
+    <w:p>
+      <w:pPr>
+        <w:pStyle w:val="normal1"/>
         <w:numPr>
           <w:ilvl w:val="1"/>
           <w:numId w:val="1"/>
@@ -44026,15 +44060,47 @@
           <w:numId w:val="1"/>
         </w:numPr>
         <w:ind w:hanging="360" w:left="1440"/>
-        <w:rPr/>
-      </w:pPr>
-      <w:r>
         <w:rPr>
           <w:b w:val="false"/>
           <w:bCs w:val="false"/>
           <w:color w:val="000000"/>
         </w:rPr>
+      </w:pPr>
+      <w:r>
+        <w:rPr>
+          <w:b w:val="false"/>
+          <w:bCs w:val="false"/>
+          <w:color w:val="000000"/>
+        </w:rPr>
         <w:t xml:space="preserve">returns: </w:t>
+      </w:r>
+    </w:p>
+    <w:p>
+      <w:pPr>
+        <w:pStyle w:val="normal1"/>
+        <w:widowControl/>
+        <w:numPr>
+          <w:ilvl w:val="2"/>
+          <w:numId w:val="1"/>
+        </w:numPr>
+        <w:suppressAutoHyphens w:val="true"/>
+        <w:bidi w:val="0"/>
+        <w:spacing w:lineRule="auto" w:line="276" w:before="0" w:after="0"/>
+        <w:ind w:hanging="360" w:left="2160" w:right="0"/>
+        <w:jc w:val="left"/>
+        <w:rPr>
+          <w:b w:val="false"/>
+          <w:bCs w:val="false"/>
+          <w:color w:val="000000"/>
+        </w:rPr>
+      </w:pPr>
+      <w:r>
+        <w:rPr>
+          <w:b w:val="false"/>
+          <w:bCs w:val="false"/>
+          <w:color w:val="000000"/>
+        </w:rPr>
+        <w:t>See description.</w:t>
       </w:r>
     </w:p>
     <w:p>
@@ -48756,7 +48822,7 @@
     </w:rPr>
   </w:style>
   <w:style w:type="paragraph" w:styleId="Heading1">
-    <w:name w:val="Heading 1"/>
+    <w:name w:val="heading 1"/>
     <w:basedOn w:val="normal1"/>
     <w:next w:val="normal1"/>
     <w:qFormat/>
@@ -48772,7 +48838,7 @@
     </w:rPr>
   </w:style>
   <w:style w:type="paragraph" w:styleId="Heading2">
-    <w:name w:val="Heading 2"/>
+    <w:name w:val="heading 2"/>
     <w:basedOn w:val="normal1"/>
     <w:next w:val="normal1"/>
     <w:qFormat/>
@@ -48790,7 +48856,7 @@
     </w:rPr>
   </w:style>
   <w:style w:type="paragraph" w:styleId="Heading3">
-    <w:name w:val="Heading 3"/>
+    <w:name w:val="heading 3"/>
     <w:basedOn w:val="normal1"/>
     <w:next w:val="normal1"/>
     <w:qFormat/>
@@ -48809,7 +48875,7 @@
     </w:rPr>
   </w:style>
   <w:style w:type="paragraph" w:styleId="Heading4">
-    <w:name w:val="Heading 4"/>
+    <w:name w:val="heading 4"/>
     <w:basedOn w:val="normal1"/>
     <w:next w:val="normal1"/>
     <w:qFormat/>
@@ -48826,7 +48892,7 @@
     </w:rPr>
   </w:style>
   <w:style w:type="paragraph" w:styleId="Heading5">
-    <w:name w:val="Heading 5"/>
+    <w:name w:val="heading 5"/>
     <w:basedOn w:val="normal1"/>
     <w:next w:val="normal1"/>
     <w:qFormat/>
@@ -48843,7 +48909,7 @@
     </w:rPr>
   </w:style>
   <w:style w:type="paragraph" w:styleId="Heading6">
-    <w:name w:val="Heading 6"/>
+    <w:name w:val="heading 6"/>
     <w:basedOn w:val="normal1"/>
     <w:next w:val="normal1"/>
     <w:qFormat/>
@@ -48868,8 +48934,8 @@
       <w:u w:val="single"/>
     </w:rPr>
   </w:style>
-  <w:style w:type="character" w:styleId="Bullets">
-    <w:name w:val="Bullets"/>
+  <w:style w:type="character" w:styleId="Bulletsuser">
+    <w:name w:val="Bullets (user)"/>
     <w:qFormat/>
     <w:rPr>
       <w:rFonts w:ascii="OpenSymbol" w:hAnsi="OpenSymbol" w:eastAsia="OpenSymbol" w:cs="OpenSymbol"/>
@@ -48907,7 +48973,7 @@
     </w:rPr>
   </w:style>
   <w:style w:type="paragraph" w:styleId="Caption">
-    <w:name w:val="Caption"/>
+    <w:name w:val="caption"/>
     <w:basedOn w:val="Normal"/>
     <w:qFormat/>
     <w:pPr>
@@ -49010,34 +49076,34 @@
         <a:srgbClr val="000000"/>
       </a:dk1>
       <a:lt1>
-        <a:srgbClr val="ffffff"/>
+        <a:srgbClr val="FFFFFF"/>
       </a:lt1>
       <a:dk2>
-        <a:srgbClr val="1f497d"/>
+        <a:srgbClr val="1F497D"/>
       </a:dk2>
       <a:lt2>
-        <a:srgbClr val="eeece1"/>
+        <a:srgbClr val="EEECE1"/>
       </a:lt2>
       <a:accent1>
-        <a:srgbClr val="4f81bd"/>
+        <a:srgbClr val="4F81BD"/>
       </a:accent1>
       <a:accent2>
-        <a:srgbClr val="c0504d"/>
+        <a:srgbClr val="C0504D"/>
       </a:accent2>
       <a:accent3>
-        <a:srgbClr val="9bbb59"/>
+        <a:srgbClr val="9BBB59"/>
       </a:accent3>
       <a:accent4>
-        <a:srgbClr val="8064a2"/>
+        <a:srgbClr val="8064A2"/>
       </a:accent4>
       <a:accent5>
-        <a:srgbClr val="4bacc6"/>
+        <a:srgbClr val="4BACC6"/>
       </a:accent5>
       <a:accent6>
-        <a:srgbClr val="f79646"/>
+        <a:srgbClr val="F79646"/>
       </a:accent6>
       <a:hlink>
-        <a:srgbClr val="0000ff"/>
+        <a:srgbClr val="0000FF"/>
       </a:hlink>
       <a:folHlink>
         <a:srgbClr val="800080"/>

</xml_diff>

<commit_message>
added the GET Detailed Games of Room endpoint
</commit_message>
<xml_diff>
--- a/docs/QView API Documentation.docx
+++ b/docs/QView API Documentation.docx
@@ -14,19 +14,11 @@
       </w:r>
       <w:r>
         <w:rPr/>
-        <w:t>6</w:t>
-      </w:r>
-      <w:r>
-        <w:rPr/>
-        <w:t>_2026.0</w:t>
-      </w:r>
-      <w:r>
-        <w:rPr/>
-        <w:t>6.23</w:t>
-      </w:r>
-      <w:r>
-        <w:rPr/>
-        <w:t>)</w:t>
+        <w:t>7</w:t>
+      </w:r>
+      <w:r>
+        <w:rPr/>
+        <w:t>_2026.06.23)</w:t>
       </w:r>
     </w:p>
     <w:p>
@@ -16395,6 +16387,340 @@
       </w:pPr>
       <w:r>
         <w:rPr/>
+        <w:t xml:space="preserve">GET </w:t>
+      </w:r>
+      <w:r>
+        <w:rPr/>
+        <w:t xml:space="preserve">Detailed </w:t>
+      </w:r>
+      <w:r>
+        <w:rPr/>
+        <w:t>Games of Room</w:t>
+      </w:r>
+    </w:p>
+    <w:p>
+      <w:pPr>
+        <w:pStyle w:val="normal1"/>
+        <w:numPr>
+          <w:ilvl w:val="1"/>
+          <w:numId w:val="1"/>
+        </w:numPr>
+        <w:ind w:hanging="360" w:left="1440"/>
+        <w:rPr/>
+      </w:pPr>
+      <w:r>
+        <w:rPr/>
+        <w:t xml:space="preserve">built_including_tests: </w:t>
+      </w:r>
+      <w:r>
+        <w:rPr>
+          <w:b/>
+          <w:bCs/>
+        </w:rPr>
+        <w:t>true</w:t>
+      </w:r>
+    </w:p>
+    <w:p>
+      <w:pPr>
+        <w:pStyle w:val="normal1"/>
+        <w:numPr>
+          <w:ilvl w:val="1"/>
+          <w:numId w:val="1"/>
+        </w:numPr>
+        <w:ind w:hanging="360" w:left="1440"/>
+        <w:rPr/>
+      </w:pPr>
+      <w:r>
+        <w:rPr/>
+        <w:t>HTTP method: ‘GET’</w:t>
+      </w:r>
+    </w:p>
+    <w:p>
+      <w:pPr>
+        <w:pStyle w:val="normal1"/>
+        <w:numPr>
+          <w:ilvl w:val="1"/>
+          <w:numId w:val="1"/>
+        </w:numPr>
+        <w:ind w:hanging="360" w:left="1440"/>
+        <w:rPr/>
+      </w:pPr>
+      <w:r>
+        <w:rPr/>
+        <w:t>endpoint: {base_uri}/api/rooms/{id}/games-</w:t>
+      </w:r>
+      <w:r>
+        <w:rPr/>
+        <w:t>detailed</w:t>
+      </w:r>
+      <w:r>
+        <w:rPr/>
+        <w:t>?page={page_num}&amp;page_size={num_of_rows}</w:t>
+      </w:r>
+    </w:p>
+    <w:p>
+      <w:pPr>
+        <w:pStyle w:val="normal1"/>
+        <w:numPr>
+          <w:ilvl w:val="1"/>
+          <w:numId w:val="1"/>
+        </w:numPr>
+        <w:ind w:hanging="360" w:left="1440"/>
+        <w:rPr/>
+      </w:pPr>
+      <w:r>
+        <w:rPr/>
+        <w:t xml:space="preserve">description: </w:t>
+      </w:r>
+    </w:p>
+    <w:p>
+      <w:pPr>
+        <w:pStyle w:val="normal1"/>
+        <w:widowControl/>
+        <w:numPr>
+          <w:ilvl w:val="2"/>
+          <w:numId w:val="1"/>
+        </w:numPr>
+        <w:suppressAutoHyphens w:val="true"/>
+        <w:bidi w:val="0"/>
+        <w:spacing w:lineRule="auto" w:line="276" w:before="0" w:after="0"/>
+        <w:ind w:hanging="360" w:left="2160" w:right="0"/>
+        <w:jc w:val="left"/>
+        <w:rPr/>
+      </w:pPr>
+      <w:r>
+        <w:rPr/>
+        <w:t>Same as GET Games of Room with additional data of Teams and Quizzers participating in the Game</w:t>
+      </w:r>
+    </w:p>
+    <w:p>
+      <w:pPr>
+        <w:pStyle w:val="normal1"/>
+        <w:numPr>
+          <w:ilvl w:val="1"/>
+          <w:numId w:val="1"/>
+        </w:numPr>
+        <w:ind w:hanging="360" w:left="1440"/>
+        <w:rPr/>
+      </w:pPr>
+      <w:r>
+        <w:rPr/>
+        <w:t>parameters:</w:t>
+      </w:r>
+    </w:p>
+    <w:p>
+      <w:pPr>
+        <w:pStyle w:val="normal1"/>
+        <w:numPr>
+          <w:ilvl w:val="2"/>
+          <w:numId w:val="1"/>
+        </w:numPr>
+        <w:ind w:hanging="360" w:left="2160"/>
+        <w:rPr/>
+      </w:pPr>
+      <w:r>
+        <w:rPr/>
+        <w:t>id</w:t>
+      </w:r>
+    </w:p>
+    <w:p>
+      <w:pPr>
+        <w:pStyle w:val="normal1"/>
+        <w:numPr>
+          <w:ilvl w:val="3"/>
+          <w:numId w:val="1"/>
+        </w:numPr>
+        <w:ind w:hanging="360" w:left="2880"/>
+        <w:rPr>
+          <w:color w:val="FF0000"/>
+        </w:rPr>
+      </w:pPr>
+      <w:r>
+        <w:rPr>
+          <w:color w:val="FF0000"/>
+        </w:rPr>
+        <w:t>Required</w:t>
+      </w:r>
+    </w:p>
+    <w:p>
+      <w:pPr>
+        <w:pStyle w:val="normal1"/>
+        <w:numPr>
+          <w:ilvl w:val="3"/>
+          <w:numId w:val="1"/>
+        </w:numPr>
+        <w:ind w:hanging="360" w:left="2880"/>
+        <w:rPr/>
+      </w:pPr>
+      <w:r>
+        <w:rPr/>
+        <w:t>ID of the Room</w:t>
+      </w:r>
+    </w:p>
+    <w:p>
+      <w:pPr>
+        <w:pStyle w:val="normal1"/>
+        <w:numPr>
+          <w:ilvl w:val="2"/>
+          <w:numId w:val="1"/>
+        </w:numPr>
+        <w:ind w:hanging="360" w:left="2160"/>
+        <w:rPr/>
+      </w:pPr>
+      <w:r>
+        <w:rPr/>
+        <w:t>page={page_num}</w:t>
+      </w:r>
+    </w:p>
+    <w:p>
+      <w:pPr>
+        <w:pStyle w:val="normal1"/>
+        <w:numPr>
+          <w:ilvl w:val="3"/>
+          <w:numId w:val="1"/>
+        </w:numPr>
+        <w:ind w:hanging="360" w:left="2880"/>
+        <w:rPr>
+          <w:color w:val="FF0000"/>
+        </w:rPr>
+      </w:pPr>
+      <w:r>
+        <w:rPr>
+          <w:color w:val="FF0000"/>
+        </w:rPr>
+        <w:t>Required</w:t>
+      </w:r>
+    </w:p>
+    <w:p>
+      <w:pPr>
+        <w:pStyle w:val="normal1"/>
+        <w:numPr>
+          <w:ilvl w:val="3"/>
+          <w:numId w:val="1"/>
+        </w:numPr>
+        <w:ind w:hanging="360" w:left="2880"/>
+        <w:rPr/>
+      </w:pPr>
+      <w:r>
+        <w:rPr/>
+        <w:t>Defines which page to return</w:t>
+      </w:r>
+    </w:p>
+    <w:p>
+      <w:pPr>
+        <w:pStyle w:val="normal1"/>
+        <w:numPr>
+          <w:ilvl w:val="3"/>
+          <w:numId w:val="1"/>
+        </w:numPr>
+        <w:ind w:hanging="360" w:left="2880"/>
+        <w:rPr/>
+      </w:pPr>
+      <w:r>
+        <w:rPr/>
+        <w:t>First page = 0 (zero)</w:t>
+      </w:r>
+    </w:p>
+    <w:p>
+      <w:pPr>
+        <w:pStyle w:val="normal1"/>
+        <w:numPr>
+          <w:ilvl w:val="2"/>
+          <w:numId w:val="1"/>
+        </w:numPr>
+        <w:ind w:hanging="360" w:left="2160"/>
+        <w:rPr/>
+      </w:pPr>
+      <w:r>
+        <w:rPr/>
+        <w:t>page_size={num_of_rows}</w:t>
+      </w:r>
+    </w:p>
+    <w:p>
+      <w:pPr>
+        <w:pStyle w:val="normal1"/>
+        <w:numPr>
+          <w:ilvl w:val="3"/>
+          <w:numId w:val="1"/>
+        </w:numPr>
+        <w:ind w:hanging="360" w:left="2880"/>
+        <w:rPr>
+          <w:color w:val="FF0000"/>
+        </w:rPr>
+      </w:pPr>
+      <w:r>
+        <w:rPr>
+          <w:color w:val="FF0000"/>
+        </w:rPr>
+        <w:t>Required</w:t>
+      </w:r>
+    </w:p>
+    <w:p>
+      <w:pPr>
+        <w:pStyle w:val="normal1"/>
+        <w:numPr>
+          <w:ilvl w:val="3"/>
+          <w:numId w:val="1"/>
+        </w:numPr>
+        <w:ind w:hanging="360" w:left="2880"/>
+        <w:rPr/>
+      </w:pPr>
+      <w:r>
+        <w:rPr/>
+        <w:t>Defines how many rows to return for the selected page</w:t>
+      </w:r>
+    </w:p>
+    <w:p>
+      <w:pPr>
+        <w:pStyle w:val="normal1"/>
+        <w:numPr>
+          <w:ilvl w:val="1"/>
+          <w:numId w:val="1"/>
+        </w:numPr>
+        <w:ind w:hanging="360" w:left="1440"/>
+        <w:rPr/>
+      </w:pPr>
+      <w:r>
+        <w:rPr/>
+        <w:t xml:space="preserve">returns: </w:t>
+      </w:r>
+    </w:p>
+    <w:p>
+      <w:pPr>
+        <w:pStyle w:val="normal1"/>
+        <w:widowControl/>
+        <w:numPr>
+          <w:ilvl w:val="2"/>
+          <w:numId w:val="1"/>
+        </w:numPr>
+        <w:suppressAutoHyphens w:val="true"/>
+        <w:bidi w:val="0"/>
+        <w:spacing w:lineRule="auto" w:line="276" w:before="0" w:after="0"/>
+        <w:ind w:hanging="360" w:left="2160" w:right="0"/>
+        <w:jc w:val="left"/>
+        <w:rPr/>
+      </w:pPr>
+      <w:r>
+        <w:rPr/>
+        <w:t xml:space="preserve">an array of Games </w:t>
+      </w:r>
+      <w:r>
+        <w:rPr/>
+        <w:t>along with the Game’s respective Teams and Quizzers</w:t>
+      </w:r>
+    </w:p>
+    <w:p>
+      <w:pPr>
+        <w:pStyle w:val="normal1"/>
+        <w:numPr>
+          <w:ilvl w:val="0"/>
+          <w:numId w:val="1"/>
+        </w:numPr>
+        <w:ind w:hanging="360" w:left="720"/>
+        <w:rPr/>
+      </w:pPr>
+      <w:r>
+        <w:rPr/>
         <w:t>GET Games of Team</w:t>
       </w:r>
     </w:p>
@@ -43943,11 +44269,7 @@
       </w:pPr>
       <w:r>
         <w:rPr/>
-        <w:t xml:space="preserve">GET All Tournaments </w:t>
-      </w:r>
-      <w:r>
-        <w:rPr/>
-        <w:t>Around Today’s Date</w:t>
+        <w:t>GET All Tournaments Around Today’s Date</w:t>
       </w:r>
     </w:p>
     <w:p>
@@ -48934,8 +49256,8 @@
       <w:u w:val="single"/>
     </w:rPr>
   </w:style>
-  <w:style w:type="character" w:styleId="Bulletsuser">
-    <w:name w:val="Bullets (user)"/>
+  <w:style w:type="character" w:styleId="Bullets">
+    <w:name w:val="Bullets"/>
     <w:qFormat/>
     <w:rPr>
       <w:rFonts w:ascii="OpenSymbol" w:hAnsi="OpenSymbol" w:eastAsia="OpenSymbol" w:cs="OpenSymbol"/>

</xml_diff>

<commit_message>
Updated the APi docs to include the new pairing_code query parameter for the get detailed games by room endpoint
</commit_message>
<xml_diff>
--- a/docs/QView API Documentation.docx
+++ b/docs/QView API Documentation.docx
@@ -14,7 +14,7 @@
       </w:r>
       <w:r>
         <w:rPr/>
-        <w:t>7</w:t>
+        <w:t>8</w:t>
       </w:r>
       <w:r>
         <w:rPr/>
@@ -16387,15 +16387,7 @@
       </w:pPr>
       <w:r>
         <w:rPr/>
-        <w:t xml:space="preserve">GET </w:t>
-      </w:r>
-      <w:r>
-        <w:rPr/>
-        <w:t xml:space="preserve">Detailed </w:t>
-      </w:r>
-      <w:r>
-        <w:rPr/>
-        <w:t>Games of Room</w:t>
+        <w:t>GET Detailed Games of Room</w:t>
       </w:r>
     </w:p>
     <w:p>
@@ -16447,15 +16439,11 @@
       </w:pPr>
       <w:r>
         <w:rPr/>
-        <w:t>endpoint: {base_uri}/api/rooms/{id}/games-</w:t>
-      </w:r>
-      <w:r>
-        <w:rPr/>
-        <w:t>detailed</w:t>
-      </w:r>
-      <w:r>
-        <w:rPr/>
-        <w:t>?page={page_num}&amp;page_size={num_of_rows}</w:t>
+        <w:t>endpoint: {base_uri}/api/rooms/{id}/games-detailed?page={page_num}&amp;page_size={num_of_rows}</w:t>
+      </w:r>
+      <w:r>
+        <w:rPr/>
+        <w:t>&amp;pairing_code={pairing_code}</w:t>
       </w:r>
     </w:p>
     <w:p>
@@ -16674,6 +16662,71 @@
       <w:pPr>
         <w:pStyle w:val="normal1"/>
         <w:numPr>
+          <w:ilvl w:val="2"/>
+          <w:numId w:val="1"/>
+        </w:numPr>
+        <w:ind w:hanging="360" w:left="2160"/>
+        <w:rPr/>
+      </w:pPr>
+      <w:r>
+        <w:rPr/>
+        <w:t>pa</w:t>
+      </w:r>
+      <w:r>
+        <w:rPr/>
+        <w:t>iring_code</w:t>
+      </w:r>
+      <w:r>
+        <w:rPr/>
+        <w:t>={</w:t>
+      </w:r>
+      <w:r>
+        <w:rPr/>
+        <w:t>pairing_code</w:t>
+      </w:r>
+      <w:r>
+        <w:rPr/>
+        <w:t>}</w:t>
+      </w:r>
+    </w:p>
+    <w:p>
+      <w:pPr>
+        <w:pStyle w:val="normal1"/>
+        <w:numPr>
+          <w:ilvl w:val="3"/>
+          <w:numId w:val="1"/>
+        </w:numPr>
+        <w:ind w:hanging="360" w:left="2880"/>
+        <w:rPr>
+          <w:color w:val="FF0000"/>
+        </w:rPr>
+      </w:pPr>
+      <w:r>
+        <w:rPr>
+          <w:color w:val="FF0000"/>
+        </w:rPr>
+        <w:t>Required</w:t>
+      </w:r>
+    </w:p>
+    <w:p>
+      <w:pPr>
+        <w:pStyle w:val="normal1"/>
+        <w:numPr>
+          <w:ilvl w:val="3"/>
+          <w:numId w:val="1"/>
+        </w:numPr>
+        <w:ind w:hanging="360" w:left="2880"/>
+        <w:rPr/>
+      </w:pPr>
+      <w:r>
+        <w:rPr/>
+        <w:t>Pairing code is used to authenticate the source in a password/passcode manner. Incorrect or absent pairing_code will result in a 401 Unauthorized error.</w:t>
+      </w:r>
+    </w:p>
+    <w:p>
+      <w:pPr>
+        <w:pStyle w:val="normal1"/>
+        <w:numPr>
           <w:ilvl w:val="1"/>
           <w:numId w:val="1"/>
         </w:numPr>
@@ -16702,11 +16755,7 @@
       </w:pPr>
       <w:r>
         <w:rPr/>
-        <w:t xml:space="preserve">an array of Games </w:t>
-      </w:r>
-      <w:r>
-        <w:rPr/>
-        <w:t>along with the Game’s respective Teams and Quizzers</w:t>
+        <w:t>an array of Games along with the Game’s respective Teams and Quizzers</w:t>
       </w:r>
     </w:p>
     <w:p>
@@ -49256,8 +49305,8 @@
       <w:u w:val="single"/>
     </w:rPr>
   </w:style>
-  <w:style w:type="character" w:styleId="Bullets">
-    <w:name w:val="Bullets"/>
+  <w:style w:type="character" w:styleId="Bulletsuser">
+    <w:name w:val="Bullets (user)"/>
     <w:qFormat/>
     <w:rPr>
       <w:rFonts w:ascii="OpenSymbol" w:hAnsi="OpenSymbol" w:eastAsia="OpenSymbol" w:cs="OpenSymbol"/>

</xml_diff>